<commit_message>
Make Reports print a branded pack and fix naira amounts in the books PDF.
Co-authored-by: Cursor <cursoragent@cursor.com>
</commit_message>
<xml_diff>
--- a/docs/Abu-Twins-Shop-System-User-Guide.docx
+++ b/docs/Abu-Twins-Shop-System-User-Guide.docx
@@ -459,7 +459,7 @@
                 <w:sz w:val="20"/>
                 <w:szCs w:val="20"/>
               </w:rPr>
-              <w:t xml:space="preserve">1.2</w:t>
+              <w:t xml:space="preserve">1.3</w:t>
             </w:r>
           </w:p>
         </w:tc>
@@ -533,7 +533,7 @@
                 <w:sz w:val="20"/>
                 <w:szCs w:val="20"/>
               </w:rPr>
-              <w:t xml:space="preserve">Updated: bank books, branded PDF and CSV, day compare</w:t>
+              <w:t xml:space="preserve">Updated: branded reports print and PDF</w:t>
             </w:r>
           </w:p>
         </w:tc>
@@ -731,6 +731,25 @@
           <w:szCs w:val="22"/>
         </w:rPr>
         <w:t xml:space="preserve">Version 1.2 gives accounts a bank-style statement. Check the books opens any previous Lagos day, compares it with another day or week, and prints a branded PDF or CSV with the company mark. The pack does not change any invoice. It only adds the books again so a person can sign them.</w:t>
+      </w:r>
+    </w:p>
+    <w:p>
+      <w:pPr>
+        <w:spacing w:after="160" w:before="0" w:line="276"/>
+        <w:jc w:val="left"/>
+      </w:pPr>
+      <w:r>
+        <w:rPr>
+          <w:rFonts w:ascii="Calibri" w:cs="Calibri" w:eastAsia="Calibri" w:hAnsi="Calibri"/>
+          <w:b w:val="false"/>
+          <w:bCs w:val="false"/>
+          <w:i w:val="false"/>
+          <w:iCs w:val="false"/>
+          <w:color w:val="000000"/>
+          <w:sz w:val="22"/>
+          <w:szCs w:val="22"/>
+        </w:rPr>
+        <w:t xml:space="preserve">Version 1.3 makes Reports print like a management paper. The meeting pack has the ab mark, shop books, and NGN amounts. Buttons stay on the screen, not on the paper.</w:t>
       </w:r>
     </w:p>
     <w:p>
@@ -15372,7 +15391,7 @@
           <w:sz w:val="22"/>
           <w:szCs w:val="22"/>
         </w:rPr>
-        <w:t xml:space="preserve">Click Download branded PDF. Open the file and confirm the ab mark and statement number.</w:t>
+        <w:t xml:space="preserve">Click Download branded PDF. Open the file and confirm the ab mark, statement number, and NGN amounts (not a broken naira sign).</w:t>
       </w:r>
     </w:p>
     <w:p>
@@ -15568,7 +15587,7 @@
           <w:sz w:val="22"/>
           <w:szCs w:val="22"/>
         </w:rPr>
-        <w:t xml:space="preserve">Movement shows naira and percent for collected, posted, cash, transfer, POS, expenses, and sales count.</w:t>
+        <w:t xml:space="preserve">Movement shows NGN and percent for collected, posted, cash, transfer, POS, expenses, and sales count.</w:t>
       </w:r>
     </w:p>
     <w:p>
@@ -15614,7 +15633,7 @@
           <w:sz w:val="22"/>
           <w:szCs w:val="22"/>
         </w:rPr>
-        <w:t xml:space="preserve">The PDF and the print preview hide the left menu and the calculator.</w:t>
+        <w:t xml:space="preserve">The branded PDF writes money as NGN 0 or NGN 1,200. It must not show a colon in front of the number.</w:t>
       </w:r>
     </w:p>
     <w:p>
@@ -15637,7 +15656,7 @@
           <w:sz w:val="22"/>
           <w:szCs w:val="22"/>
         </w:rPr>
-        <w:t xml:space="preserve">The pack does not edit any invoice. Sales, returns, and closes stay as they were.</w:t>
+        <w:t xml:space="preserve">The PDF and the print preview hide the left menu and the calculator.</w:t>
       </w:r>
     </w:p>
     <w:p>
@@ -15660,271 +15679,7 @@
           <w:sz w:val="22"/>
           <w:szCs w:val="22"/>
         </w:rPr>
-        <w:t xml:space="preserve">A cashier who cannot see Check the books will not find the page. That is correct if Super Admin hid it.</w:t>
-      </w:r>
-    </w:p>
-    <w:p>
-      <w:pPr>
-        <w:pStyle w:val="Heading2"/>
-        <w:spacing w:after="120" w:before="280"/>
-      </w:pPr>
-      <w:r>
-        <w:rPr>
-          <w:rFonts w:ascii="Calibri" w:cs="Calibri" w:eastAsia="Calibri" w:hAnsi="Calibri"/>
-          <w:b/>
-          <w:bCs/>
-          <w:i w:val="false"/>
-          <w:iCs w:val="false"/>
-          <w:color w:val="000000"/>
-          <w:sz w:val="26"/>
-          <w:szCs w:val="26"/>
-        </w:rPr>
-        <w:t xml:space="preserve">10.19 Expenses</w:t>
-      </w:r>
-    </w:p>
-    <w:p>
-      <w:pPr>
-        <w:pStyle w:val="Heading3"/>
-        <w:spacing w:after="80" w:before="200"/>
-      </w:pPr>
-      <w:r>
-        <w:rPr>
-          <w:rFonts w:ascii="Calibri" w:cs="Calibri" w:eastAsia="Calibri" w:hAnsi="Calibri"/>
-          <w:b/>
-          <w:bCs/>
-          <w:i w:val="false"/>
-          <w:iCs w:val="false"/>
-          <w:color w:val="000000"/>
-          <w:sz w:val="24"/>
-          <w:szCs w:val="24"/>
-        </w:rPr>
-        <w:t xml:space="preserve">What this page is</w:t>
-      </w:r>
-    </w:p>
-    <w:p>
-      <w:pPr>
-        <w:spacing w:after="160" w:before="0" w:line="276"/>
-        <w:jc w:val="left"/>
-      </w:pPr>
-      <w:r>
-        <w:rPr>
-          <w:rFonts w:ascii="Calibri" w:cs="Calibri" w:eastAsia="Calibri" w:hAnsi="Calibri"/>
-          <w:b w:val="false"/>
-          <w:bCs w:val="false"/>
-          <w:i w:val="false"/>
-          <w:iCs w:val="false"/>
-          <w:color w:val="000000"/>
-          <w:sz w:val="22"/>
-          <w:szCs w:val="22"/>
-        </w:rPr>
-        <w:t xml:space="preserve">Expenses is for fuel, rent, salary, and light bill. Staff ask. A manager says yes. Then money can leave.</w:t>
-      </w:r>
-    </w:p>
-    <w:p>
-      <w:pPr>
-        <w:pStyle w:val="Heading3"/>
-        <w:spacing w:after="80" w:before="200"/>
-      </w:pPr>
-      <w:r>
-        <w:rPr>
-          <w:rFonts w:ascii="Calibri" w:cs="Calibri" w:eastAsia="Calibri" w:hAnsi="Calibri"/>
-          <w:b/>
-          <w:bCs/>
-          <w:i w:val="false"/>
-          <w:iCs w:val="false"/>
-          <w:color w:val="000000"/>
-          <w:sz w:val="24"/>
-          <w:szCs w:val="24"/>
-        </w:rPr>
-        <w:t xml:space="preserve">Why it is here</w:t>
-      </w:r>
-    </w:p>
-    <w:p>
-      <w:pPr>
-        <w:spacing w:after="160" w:before="0" w:line="276"/>
-        <w:jc w:val="left"/>
-      </w:pPr>
-      <w:r>
-        <w:rPr>
-          <w:rFonts w:ascii="Calibri" w:cs="Calibri" w:eastAsia="Calibri" w:hAnsi="Calibri"/>
-          <w:b w:val="false"/>
-          <w:bCs w:val="false"/>
-          <w:i w:val="false"/>
-          <w:iCs w:val="false"/>
-          <w:color w:val="000000"/>
-          <w:sz w:val="22"/>
-          <w:szCs w:val="22"/>
-        </w:rPr>
-        <w:t xml:space="preserve">If anyone can tap cash for ‘fuel’ with no yes, the till will never match.</w:t>
-      </w:r>
-    </w:p>
-    <w:p>
-      <w:pPr>
-        <w:pStyle w:val="Heading3"/>
-        <w:spacing w:after="80" w:before="200"/>
-      </w:pPr>
-      <w:r>
-        <w:rPr>
-          <w:rFonts w:ascii="Calibri" w:cs="Calibri" w:eastAsia="Calibri" w:hAnsi="Calibri"/>
-          <w:b/>
-          <w:bCs/>
-          <w:i w:val="false"/>
-          <w:iCs w:val="false"/>
-          <w:color w:val="000000"/>
-          <w:sz w:val="24"/>
-          <w:szCs w:val="24"/>
-        </w:rPr>
-        <w:t xml:space="preserve">A real shop story</w:t>
-      </w:r>
-    </w:p>
-    <w:p>
-      <w:pPr>
-        <w:spacing w:after="160" w:before="0" w:line="276"/>
-        <w:jc w:val="left"/>
-      </w:pPr>
-      <w:r>
-        <w:rPr>
-          <w:rFonts w:ascii="Calibri" w:cs="Calibri" w:eastAsia="Calibri" w:hAnsi="Calibri"/>
-          <w:b w:val="false"/>
-          <w:bCs w:val="false"/>
-          <w:i w:val="false"/>
-          <w:iCs w:val="false"/>
-          <w:color w:val="000000"/>
-          <w:sz w:val="22"/>
-          <w:szCs w:val="22"/>
-        </w:rPr>
-        <w:t xml:space="preserve">The Challenge manager asks for fuel money. The request waits on Needs approval. The CEO says yes. Then the pay-out is recorded.</w:t>
-      </w:r>
-    </w:p>
-    <w:p>
-      <w:pPr>
-        <w:pStyle w:val="Heading3"/>
-        <w:spacing w:after="80" w:before="200"/>
-      </w:pPr>
-      <w:r>
-        <w:rPr>
-          <w:rFonts w:ascii="Calibri" w:cs="Calibri" w:eastAsia="Calibri" w:hAnsi="Calibri"/>
-          <w:b/>
-          <w:bCs/>
-          <w:i w:val="false"/>
-          <w:iCs w:val="false"/>
-          <w:color w:val="000000"/>
-          <w:sz w:val="24"/>
-          <w:szCs w:val="24"/>
-        </w:rPr>
-        <w:t xml:space="preserve">How to try it</w:t>
-      </w:r>
-    </w:p>
-    <w:p>
-      <w:pPr>
-        <w:spacing w:after="80" w:line="276"/>
-      </w:pPr>
-      <w:r>
-        <w:rPr>
-          <w:rFonts w:ascii="Calibri" w:cs="Calibri" w:eastAsia="Calibri" w:hAnsi="Calibri"/>
-          <w:b/>
-          <w:bCs/>
-          <w:i w:val="false"/>
-          <w:iCs w:val="false"/>
-          <w:color w:val="000000"/>
-          <w:sz w:val="22"/>
-          <w:szCs w:val="22"/>
-        </w:rPr>
-        <w:t xml:space="preserve">1. </w:t>
-      </w:r>
-      <w:r>
-        <w:rPr>
-          <w:rFonts w:ascii="Calibri" w:cs="Calibri" w:eastAsia="Calibri" w:hAnsi="Calibri"/>
-          <w:b w:val="false"/>
-          <w:bCs w:val="false"/>
-          <w:i w:val="false"/>
-          <w:iCs w:val="false"/>
-          <w:color w:val="000000"/>
-          <w:sz w:val="22"/>
-          <w:szCs w:val="22"/>
-        </w:rPr>
-        <w:t xml:space="preserve">Click Expenses.</w:t>
-      </w:r>
-    </w:p>
-    <w:p>
-      <w:pPr>
-        <w:spacing w:after="80" w:line="276"/>
-      </w:pPr>
-      <w:r>
-        <w:rPr>
-          <w:rFonts w:ascii="Calibri" w:cs="Calibri" w:eastAsia="Calibri" w:hAnsi="Calibri"/>
-          <w:b/>
-          <w:bCs/>
-          <w:i w:val="false"/>
-          <w:iCs w:val="false"/>
-          <w:color w:val="000000"/>
-          <w:sz w:val="22"/>
-          <w:szCs w:val="22"/>
-        </w:rPr>
-        <w:t xml:space="preserve">2. </w:t>
-      </w:r>
-      <w:r>
-        <w:rPr>
-          <w:rFonts w:ascii="Calibri" w:cs="Calibri" w:eastAsia="Calibri" w:hAnsi="Calibri"/>
-          <w:b w:val="false"/>
-          <w:bCs w:val="false"/>
-          <w:i w:val="false"/>
-          <w:iCs w:val="false"/>
-          <w:color w:val="000000"/>
-          <w:sz w:val="22"/>
-          <w:szCs w:val="22"/>
-        </w:rPr>
-        <w:t xml:space="preserve">Create a small test expense only if leadership agrees, for example a ₦1 practice line marked TEST.</w:t>
-      </w:r>
-    </w:p>
-    <w:p>
-      <w:pPr>
-        <w:spacing w:after="80" w:line="276"/>
-      </w:pPr>
-      <w:r>
-        <w:rPr>
-          <w:rFonts w:ascii="Calibri" w:cs="Calibri" w:eastAsia="Calibri" w:hAnsi="Calibri"/>
-          <w:b/>
-          <w:bCs/>
-          <w:i w:val="false"/>
-          <w:iCs w:val="false"/>
-          <w:color w:val="000000"/>
-          <w:sz w:val="22"/>
-          <w:szCs w:val="22"/>
-        </w:rPr>
-        <w:t xml:space="preserve">3. </w:t>
-      </w:r>
-      <w:r>
-        <w:rPr>
-          <w:rFonts w:ascii="Calibri" w:cs="Calibri" w:eastAsia="Calibri" w:hAnsi="Calibri"/>
-          <w:b w:val="false"/>
-          <w:bCs w:val="false"/>
-          <w:i w:val="false"/>
-          <w:iCs w:val="false"/>
-          <w:color w:val="000000"/>
-          <w:sz w:val="22"/>
-          <w:szCs w:val="22"/>
-        </w:rPr>
-        <w:t xml:space="preserve">Open Needs approval as a manager and say yes or no.</w:t>
-      </w:r>
-    </w:p>
-    <w:p>
-      <w:pPr>
-        <w:pStyle w:val="Heading3"/>
-        <w:spacing w:after="80" w:before="200"/>
-      </w:pPr>
-      <w:r>
-        <w:rPr>
-          <w:rFonts w:ascii="Calibri" w:cs="Calibri" w:eastAsia="Calibri" w:hAnsi="Calibri"/>
-          <w:b/>
-          <w:bCs/>
-          <w:i w:val="false"/>
-          <w:iCs w:val="false"/>
-          <w:color w:val="000000"/>
-          <w:sz w:val="24"/>
-          <w:szCs w:val="24"/>
-        </w:rPr>
-        <w:t xml:space="preserve">What you should see</w:t>
+        <w:t xml:space="preserve">The pack does not edit any invoice. Sales, returns, and closes stay as they were.</w:t>
       </w:r>
     </w:p>
     <w:p>
@@ -15947,7 +15702,271 @@
           <w:sz w:val="22"/>
           <w:szCs w:val="22"/>
         </w:rPr>
-        <w:t xml:space="preserve">A new expense waits. Money does not leave until yes.</w:t>
+        <w:t xml:space="preserve">A cashier who cannot see Check the books will not find the page. That is correct if Super Admin hid it.</w:t>
+      </w:r>
+    </w:p>
+    <w:p>
+      <w:pPr>
+        <w:pStyle w:val="Heading2"/>
+        <w:spacing w:after="120" w:before="280"/>
+      </w:pPr>
+      <w:r>
+        <w:rPr>
+          <w:rFonts w:ascii="Calibri" w:cs="Calibri" w:eastAsia="Calibri" w:hAnsi="Calibri"/>
+          <w:b/>
+          <w:bCs/>
+          <w:i w:val="false"/>
+          <w:iCs w:val="false"/>
+          <w:color w:val="000000"/>
+          <w:sz w:val="26"/>
+          <w:szCs w:val="26"/>
+        </w:rPr>
+        <w:t xml:space="preserve">10.19 Expenses</w:t>
+      </w:r>
+    </w:p>
+    <w:p>
+      <w:pPr>
+        <w:pStyle w:val="Heading3"/>
+        <w:spacing w:after="80" w:before="200"/>
+      </w:pPr>
+      <w:r>
+        <w:rPr>
+          <w:rFonts w:ascii="Calibri" w:cs="Calibri" w:eastAsia="Calibri" w:hAnsi="Calibri"/>
+          <w:b/>
+          <w:bCs/>
+          <w:i w:val="false"/>
+          <w:iCs w:val="false"/>
+          <w:color w:val="000000"/>
+          <w:sz w:val="24"/>
+          <w:szCs w:val="24"/>
+        </w:rPr>
+        <w:t xml:space="preserve">What this page is</w:t>
+      </w:r>
+    </w:p>
+    <w:p>
+      <w:pPr>
+        <w:spacing w:after="160" w:before="0" w:line="276"/>
+        <w:jc w:val="left"/>
+      </w:pPr>
+      <w:r>
+        <w:rPr>
+          <w:rFonts w:ascii="Calibri" w:cs="Calibri" w:eastAsia="Calibri" w:hAnsi="Calibri"/>
+          <w:b w:val="false"/>
+          <w:bCs w:val="false"/>
+          <w:i w:val="false"/>
+          <w:iCs w:val="false"/>
+          <w:color w:val="000000"/>
+          <w:sz w:val="22"/>
+          <w:szCs w:val="22"/>
+        </w:rPr>
+        <w:t xml:space="preserve">Expenses is for fuel, rent, salary, and light bill. Staff ask. A manager says yes. Then money can leave.</w:t>
+      </w:r>
+    </w:p>
+    <w:p>
+      <w:pPr>
+        <w:pStyle w:val="Heading3"/>
+        <w:spacing w:after="80" w:before="200"/>
+      </w:pPr>
+      <w:r>
+        <w:rPr>
+          <w:rFonts w:ascii="Calibri" w:cs="Calibri" w:eastAsia="Calibri" w:hAnsi="Calibri"/>
+          <w:b/>
+          <w:bCs/>
+          <w:i w:val="false"/>
+          <w:iCs w:val="false"/>
+          <w:color w:val="000000"/>
+          <w:sz w:val="24"/>
+          <w:szCs w:val="24"/>
+        </w:rPr>
+        <w:t xml:space="preserve">Why it is here</w:t>
+      </w:r>
+    </w:p>
+    <w:p>
+      <w:pPr>
+        <w:spacing w:after="160" w:before="0" w:line="276"/>
+        <w:jc w:val="left"/>
+      </w:pPr>
+      <w:r>
+        <w:rPr>
+          <w:rFonts w:ascii="Calibri" w:cs="Calibri" w:eastAsia="Calibri" w:hAnsi="Calibri"/>
+          <w:b w:val="false"/>
+          <w:bCs w:val="false"/>
+          <w:i w:val="false"/>
+          <w:iCs w:val="false"/>
+          <w:color w:val="000000"/>
+          <w:sz w:val="22"/>
+          <w:szCs w:val="22"/>
+        </w:rPr>
+        <w:t xml:space="preserve">If anyone can tap cash for ‘fuel’ with no yes, the till will never match.</w:t>
+      </w:r>
+    </w:p>
+    <w:p>
+      <w:pPr>
+        <w:pStyle w:val="Heading3"/>
+        <w:spacing w:after="80" w:before="200"/>
+      </w:pPr>
+      <w:r>
+        <w:rPr>
+          <w:rFonts w:ascii="Calibri" w:cs="Calibri" w:eastAsia="Calibri" w:hAnsi="Calibri"/>
+          <w:b/>
+          <w:bCs/>
+          <w:i w:val="false"/>
+          <w:iCs w:val="false"/>
+          <w:color w:val="000000"/>
+          <w:sz w:val="24"/>
+          <w:szCs w:val="24"/>
+        </w:rPr>
+        <w:t xml:space="preserve">A real shop story</w:t>
+      </w:r>
+    </w:p>
+    <w:p>
+      <w:pPr>
+        <w:spacing w:after="160" w:before="0" w:line="276"/>
+        <w:jc w:val="left"/>
+      </w:pPr>
+      <w:r>
+        <w:rPr>
+          <w:rFonts w:ascii="Calibri" w:cs="Calibri" w:eastAsia="Calibri" w:hAnsi="Calibri"/>
+          <w:b w:val="false"/>
+          <w:bCs w:val="false"/>
+          <w:i w:val="false"/>
+          <w:iCs w:val="false"/>
+          <w:color w:val="000000"/>
+          <w:sz w:val="22"/>
+          <w:szCs w:val="22"/>
+        </w:rPr>
+        <w:t xml:space="preserve">The Challenge manager asks for fuel money. The request waits on Needs approval. The CEO says yes. Then the pay-out is recorded.</w:t>
+      </w:r>
+    </w:p>
+    <w:p>
+      <w:pPr>
+        <w:pStyle w:val="Heading3"/>
+        <w:spacing w:after="80" w:before="200"/>
+      </w:pPr>
+      <w:r>
+        <w:rPr>
+          <w:rFonts w:ascii="Calibri" w:cs="Calibri" w:eastAsia="Calibri" w:hAnsi="Calibri"/>
+          <w:b/>
+          <w:bCs/>
+          <w:i w:val="false"/>
+          <w:iCs w:val="false"/>
+          <w:color w:val="000000"/>
+          <w:sz w:val="24"/>
+          <w:szCs w:val="24"/>
+        </w:rPr>
+        <w:t xml:space="preserve">How to try it</w:t>
+      </w:r>
+    </w:p>
+    <w:p>
+      <w:pPr>
+        <w:spacing w:after="80" w:line="276"/>
+      </w:pPr>
+      <w:r>
+        <w:rPr>
+          <w:rFonts w:ascii="Calibri" w:cs="Calibri" w:eastAsia="Calibri" w:hAnsi="Calibri"/>
+          <w:b/>
+          <w:bCs/>
+          <w:i w:val="false"/>
+          <w:iCs w:val="false"/>
+          <w:color w:val="000000"/>
+          <w:sz w:val="22"/>
+          <w:szCs w:val="22"/>
+        </w:rPr>
+        <w:t xml:space="preserve">1. </w:t>
+      </w:r>
+      <w:r>
+        <w:rPr>
+          <w:rFonts w:ascii="Calibri" w:cs="Calibri" w:eastAsia="Calibri" w:hAnsi="Calibri"/>
+          <w:b w:val="false"/>
+          <w:bCs w:val="false"/>
+          <w:i w:val="false"/>
+          <w:iCs w:val="false"/>
+          <w:color w:val="000000"/>
+          <w:sz w:val="22"/>
+          <w:szCs w:val="22"/>
+        </w:rPr>
+        <w:t xml:space="preserve">Click Expenses.</w:t>
+      </w:r>
+    </w:p>
+    <w:p>
+      <w:pPr>
+        <w:spacing w:after="80" w:line="276"/>
+      </w:pPr>
+      <w:r>
+        <w:rPr>
+          <w:rFonts w:ascii="Calibri" w:cs="Calibri" w:eastAsia="Calibri" w:hAnsi="Calibri"/>
+          <w:b/>
+          <w:bCs/>
+          <w:i w:val="false"/>
+          <w:iCs w:val="false"/>
+          <w:color w:val="000000"/>
+          <w:sz w:val="22"/>
+          <w:szCs w:val="22"/>
+        </w:rPr>
+        <w:t xml:space="preserve">2. </w:t>
+      </w:r>
+      <w:r>
+        <w:rPr>
+          <w:rFonts w:ascii="Calibri" w:cs="Calibri" w:eastAsia="Calibri" w:hAnsi="Calibri"/>
+          <w:b w:val="false"/>
+          <w:bCs w:val="false"/>
+          <w:i w:val="false"/>
+          <w:iCs w:val="false"/>
+          <w:color w:val="000000"/>
+          <w:sz w:val="22"/>
+          <w:szCs w:val="22"/>
+        </w:rPr>
+        <w:t xml:space="preserve">Create a small test expense only if leadership agrees, for example a ₦1 practice line marked TEST.</w:t>
+      </w:r>
+    </w:p>
+    <w:p>
+      <w:pPr>
+        <w:spacing w:after="80" w:line="276"/>
+      </w:pPr>
+      <w:r>
+        <w:rPr>
+          <w:rFonts w:ascii="Calibri" w:cs="Calibri" w:eastAsia="Calibri" w:hAnsi="Calibri"/>
+          <w:b/>
+          <w:bCs/>
+          <w:i w:val="false"/>
+          <w:iCs w:val="false"/>
+          <w:color w:val="000000"/>
+          <w:sz w:val="22"/>
+          <w:szCs w:val="22"/>
+        </w:rPr>
+        <w:t xml:space="preserve">3. </w:t>
+      </w:r>
+      <w:r>
+        <w:rPr>
+          <w:rFonts w:ascii="Calibri" w:cs="Calibri" w:eastAsia="Calibri" w:hAnsi="Calibri"/>
+          <w:b w:val="false"/>
+          <w:bCs w:val="false"/>
+          <w:i w:val="false"/>
+          <w:iCs w:val="false"/>
+          <w:color w:val="000000"/>
+          <w:sz w:val="22"/>
+          <w:szCs w:val="22"/>
+        </w:rPr>
+        <w:t xml:space="preserve">Open Needs approval as a manager and say yes or no.</w:t>
+      </w:r>
+    </w:p>
+    <w:p>
+      <w:pPr>
+        <w:pStyle w:val="Heading3"/>
+        <w:spacing w:after="80" w:before="200"/>
+      </w:pPr>
+      <w:r>
+        <w:rPr>
+          <w:rFonts w:ascii="Calibri" w:cs="Calibri" w:eastAsia="Calibri" w:hAnsi="Calibri"/>
+          <w:b/>
+          <w:bCs/>
+          <w:i w:val="false"/>
+          <w:iCs w:val="false"/>
+          <w:color w:val="000000"/>
+          <w:sz w:val="24"/>
+          <w:szCs w:val="24"/>
+        </w:rPr>
+        <w:t xml:space="preserve">What you should see</w:t>
       </w:r>
     </w:p>
     <w:p>
@@ -15970,7 +15989,7 @@
           <w:sz w:val="22"/>
           <w:szCs w:val="22"/>
         </w:rPr>
-        <w:t xml:space="preserve">A no leaves the expense rejected.</w:t>
+        <w:t xml:space="preserve">A new expense waits. Money does not leave until yes.</w:t>
       </w:r>
     </w:p>
     <w:p>
@@ -15993,302 +16012,7 @@
           <w:sz w:val="22"/>
           <w:szCs w:val="22"/>
         </w:rPr>
-        <w:t xml:space="preserve">A yes then allows the pay-out to show in Money in &amp; out.</w:t>
-      </w:r>
-    </w:p>
-    <w:p>
-      <w:pPr>
-        <w:pStyle w:val="Heading2"/>
-        <w:spacing w:after="120" w:before="280"/>
-      </w:pPr>
-      <w:r>
-        <w:rPr>
-          <w:rFonts w:ascii="Calibri" w:cs="Calibri" w:eastAsia="Calibri" w:hAnsi="Calibri"/>
-          <w:b/>
-          <w:bCs/>
-          <w:i w:val="false"/>
-          <w:iCs w:val="false"/>
-          <w:color w:val="000000"/>
-          <w:sz w:val="26"/>
-          <w:szCs w:val="26"/>
-        </w:rPr>
-        <w:t xml:space="preserve">10.20 Needs approval</w:t>
-      </w:r>
-    </w:p>
-    <w:p>
-      <w:pPr>
-        <w:pStyle w:val="Heading3"/>
-        <w:spacing w:after="80" w:before="200"/>
-      </w:pPr>
-      <w:r>
-        <w:rPr>
-          <w:rFonts w:ascii="Calibri" w:cs="Calibri" w:eastAsia="Calibri" w:hAnsi="Calibri"/>
-          <w:b/>
-          <w:bCs/>
-          <w:i w:val="false"/>
-          <w:iCs w:val="false"/>
-          <w:color w:val="000000"/>
-          <w:sz w:val="24"/>
-          <w:szCs w:val="24"/>
-        </w:rPr>
-        <w:t xml:space="preserve">What this page is</w:t>
-      </w:r>
-    </w:p>
-    <w:p>
-      <w:pPr>
-        <w:spacing w:after="160" w:before="0" w:line="276"/>
-        <w:jc w:val="left"/>
-      </w:pPr>
-      <w:r>
-        <w:rPr>
-          <w:rFonts w:ascii="Calibri" w:cs="Calibri" w:eastAsia="Calibri" w:hAnsi="Calibri"/>
-          <w:b w:val="false"/>
-          <w:bCs w:val="false"/>
-          <w:i w:val="false"/>
-          <w:iCs w:val="false"/>
-          <w:color w:val="000000"/>
-          <w:sz w:val="22"/>
-          <w:szCs w:val="22"/>
-        </w:rPr>
-        <w:t xml:space="preserve">This is the yes-or-no desk. Swaps, refunds, expenses, and stock counts wait here.</w:t>
-      </w:r>
-    </w:p>
-    <w:p>
-      <w:pPr>
-        <w:pStyle w:val="Heading3"/>
-        <w:spacing w:after="80" w:before="200"/>
-      </w:pPr>
-      <w:r>
-        <w:rPr>
-          <w:rFonts w:ascii="Calibri" w:cs="Calibri" w:eastAsia="Calibri" w:hAnsi="Calibri"/>
-          <w:b/>
-          <w:bCs/>
-          <w:i w:val="false"/>
-          <w:iCs w:val="false"/>
-          <w:color w:val="000000"/>
-          <w:sz w:val="24"/>
-          <w:szCs w:val="24"/>
-        </w:rPr>
-        <w:t xml:space="preserve">Why it is here</w:t>
-      </w:r>
-    </w:p>
-    <w:p>
-      <w:pPr>
-        <w:spacing w:after="160" w:before="0" w:line="276"/>
-        <w:jc w:val="left"/>
-      </w:pPr>
-      <w:r>
-        <w:rPr>
-          <w:rFonts w:ascii="Calibri" w:cs="Calibri" w:eastAsia="Calibri" w:hAnsi="Calibri"/>
-          <w:b w:val="false"/>
-          <w:bCs w:val="false"/>
-          <w:i w:val="false"/>
-          <w:iCs w:val="false"/>
-          <w:color w:val="000000"/>
-          <w:sz w:val="22"/>
-          <w:szCs w:val="22"/>
-        </w:rPr>
-        <w:t xml:space="preserve">One place is better than ten WhatsApp chats.</w:t>
-      </w:r>
-    </w:p>
-    <w:p>
-      <w:pPr>
-        <w:pStyle w:val="Heading3"/>
-        <w:spacing w:after="80" w:before="200"/>
-      </w:pPr>
-      <w:r>
-        <w:rPr>
-          <w:rFonts w:ascii="Calibri" w:cs="Calibri" w:eastAsia="Calibri" w:hAnsi="Calibri"/>
-          <w:b/>
-          <w:bCs/>
-          <w:i w:val="false"/>
-          <w:iCs w:val="false"/>
-          <w:color w:val="000000"/>
-          <w:sz w:val="24"/>
-          <w:szCs w:val="24"/>
-        </w:rPr>
-        <w:t xml:space="preserve">A real shop story</w:t>
-      </w:r>
-    </w:p>
-    <w:p>
-      <w:pPr>
-        <w:spacing w:after="160" w:before="0" w:line="276"/>
-        <w:jc w:val="left"/>
-      </w:pPr>
-      <w:r>
-        <w:rPr>
-          <w:rFonts w:ascii="Calibri" w:cs="Calibri" w:eastAsia="Calibri" w:hAnsi="Calibri"/>
-          <w:b w:val="false"/>
-          <w:bCs w:val="false"/>
-          <w:i w:val="false"/>
-          <w:iCs w:val="false"/>
-          <w:color w:val="000000"/>
-          <w:sz w:val="22"/>
-          <w:szCs w:val="22"/>
-        </w:rPr>
-        <w:t xml:space="preserve">The CEO opens Needs approval each morning. Three items wait. Two expenses are yes. One odd stock count is no until the manager recounts.</w:t>
-      </w:r>
-    </w:p>
-    <w:p>
-      <w:pPr>
-        <w:pStyle w:val="Heading3"/>
-        <w:spacing w:after="80" w:before="200"/>
-      </w:pPr>
-      <w:r>
-        <w:rPr>
-          <w:rFonts w:ascii="Calibri" w:cs="Calibri" w:eastAsia="Calibri" w:hAnsi="Calibri"/>
-          <w:b/>
-          <w:bCs/>
-          <w:i w:val="false"/>
-          <w:iCs w:val="false"/>
-          <w:color w:val="000000"/>
-          <w:sz w:val="24"/>
-          <w:szCs w:val="24"/>
-        </w:rPr>
-        <w:t xml:space="preserve">How to try it</w:t>
-      </w:r>
-    </w:p>
-    <w:p>
-      <w:pPr>
-        <w:spacing w:after="80" w:line="276"/>
-      </w:pPr>
-      <w:r>
-        <w:rPr>
-          <w:rFonts w:ascii="Calibri" w:cs="Calibri" w:eastAsia="Calibri" w:hAnsi="Calibri"/>
-          <w:b/>
-          <w:bCs/>
-          <w:i w:val="false"/>
-          <w:iCs w:val="false"/>
-          <w:color w:val="000000"/>
-          <w:sz w:val="22"/>
-          <w:szCs w:val="22"/>
-        </w:rPr>
-        <w:t xml:space="preserve">1. </w:t>
-      </w:r>
-      <w:r>
-        <w:rPr>
-          <w:rFonts w:ascii="Calibri" w:cs="Calibri" w:eastAsia="Calibri" w:hAnsi="Calibri"/>
-          <w:b w:val="false"/>
-          <w:bCs w:val="false"/>
-          <w:i w:val="false"/>
-          <w:iCs w:val="false"/>
-          <w:color w:val="000000"/>
-          <w:sz w:val="22"/>
-          <w:szCs w:val="22"/>
-        </w:rPr>
-        <w:t xml:space="preserve">Sign in as CEO or shop manager.</w:t>
-      </w:r>
-    </w:p>
-    <w:p>
-      <w:pPr>
-        <w:spacing w:after="80" w:line="276"/>
-      </w:pPr>
-      <w:r>
-        <w:rPr>
-          <w:rFonts w:ascii="Calibri" w:cs="Calibri" w:eastAsia="Calibri" w:hAnsi="Calibri"/>
-          <w:b/>
-          <w:bCs/>
-          <w:i w:val="false"/>
-          <w:iCs w:val="false"/>
-          <w:color w:val="000000"/>
-          <w:sz w:val="22"/>
-          <w:szCs w:val="22"/>
-        </w:rPr>
-        <w:t xml:space="preserve">2. </w:t>
-      </w:r>
-      <w:r>
-        <w:rPr>
-          <w:rFonts w:ascii="Calibri" w:cs="Calibri" w:eastAsia="Calibri" w:hAnsi="Calibri"/>
-          <w:b w:val="false"/>
-          <w:bCs w:val="false"/>
-          <w:i w:val="false"/>
-          <w:iCs w:val="false"/>
-          <w:color w:val="000000"/>
-          <w:sz w:val="22"/>
-          <w:szCs w:val="22"/>
-        </w:rPr>
-        <w:t xml:space="preserve">Click Needs approval.</w:t>
-      </w:r>
-    </w:p>
-    <w:p>
-      <w:pPr>
-        <w:spacing w:after="80" w:line="276"/>
-      </w:pPr>
-      <w:r>
-        <w:rPr>
-          <w:rFonts w:ascii="Calibri" w:cs="Calibri" w:eastAsia="Calibri" w:hAnsi="Calibri"/>
-          <w:b/>
-          <w:bCs/>
-          <w:i w:val="false"/>
-          <w:iCs w:val="false"/>
-          <w:color w:val="000000"/>
-          <w:sz w:val="22"/>
-          <w:szCs w:val="22"/>
-        </w:rPr>
-        <w:t xml:space="preserve">3. </w:t>
-      </w:r>
-      <w:r>
-        <w:rPr>
-          <w:rFonts w:ascii="Calibri" w:cs="Calibri" w:eastAsia="Calibri" w:hAnsi="Calibri"/>
-          <w:b w:val="false"/>
-          <w:bCs w:val="false"/>
-          <w:i w:val="false"/>
-          <w:iCs w:val="false"/>
-          <w:color w:val="000000"/>
-          <w:sz w:val="22"/>
-          <w:szCs w:val="22"/>
-        </w:rPr>
-        <w:t xml:space="preserve">Open an item. Read who asked and why.</w:t>
-      </w:r>
-    </w:p>
-    <w:p>
-      <w:pPr>
-        <w:spacing w:after="80" w:line="276"/>
-      </w:pPr>
-      <w:r>
-        <w:rPr>
-          <w:rFonts w:ascii="Calibri" w:cs="Calibri" w:eastAsia="Calibri" w:hAnsi="Calibri"/>
-          <w:b/>
-          <w:bCs/>
-          <w:i w:val="false"/>
-          <w:iCs w:val="false"/>
-          <w:color w:val="000000"/>
-          <w:sz w:val="22"/>
-          <w:szCs w:val="22"/>
-        </w:rPr>
-        <w:t xml:space="preserve">4. </w:t>
-      </w:r>
-      <w:r>
-        <w:rPr>
-          <w:rFonts w:ascii="Calibri" w:cs="Calibri" w:eastAsia="Calibri" w:hAnsi="Calibri"/>
-          <w:b w:val="false"/>
-          <w:bCs w:val="false"/>
-          <w:i w:val="false"/>
-          <w:iCs w:val="false"/>
-          <w:color w:val="000000"/>
-          <w:sz w:val="22"/>
-          <w:szCs w:val="22"/>
-        </w:rPr>
-        <w:t xml:space="preserve">Say yes or no.</w:t>
-      </w:r>
-    </w:p>
-    <w:p>
-      <w:pPr>
-        <w:pStyle w:val="Heading3"/>
-        <w:spacing w:after="80" w:before="200"/>
-      </w:pPr>
-      <w:r>
-        <w:rPr>
-          <w:rFonts w:ascii="Calibri" w:cs="Calibri" w:eastAsia="Calibri" w:hAnsi="Calibri"/>
-          <w:b/>
-          <w:bCs/>
-          <w:i w:val="false"/>
-          <w:iCs w:val="false"/>
-          <w:color w:val="000000"/>
-          <w:sz w:val="24"/>
-          <w:szCs w:val="24"/>
-        </w:rPr>
-        <w:t xml:space="preserve">What you should see</w:t>
+        <w:t xml:space="preserve">A no leaves the expense rejected.</w:t>
       </w:r>
     </w:p>
     <w:p>
@@ -16311,7 +16035,302 @@
           <w:sz w:val="22"/>
           <w:szCs w:val="22"/>
         </w:rPr>
-        <w:t xml:space="preserve">The top of the page says how many are waiting.</w:t>
+        <w:t xml:space="preserve">A yes then allows the pay-out to show in Money in &amp; out.</w:t>
+      </w:r>
+    </w:p>
+    <w:p>
+      <w:pPr>
+        <w:pStyle w:val="Heading2"/>
+        <w:spacing w:after="120" w:before="280"/>
+      </w:pPr>
+      <w:r>
+        <w:rPr>
+          <w:rFonts w:ascii="Calibri" w:cs="Calibri" w:eastAsia="Calibri" w:hAnsi="Calibri"/>
+          <w:b/>
+          <w:bCs/>
+          <w:i w:val="false"/>
+          <w:iCs w:val="false"/>
+          <w:color w:val="000000"/>
+          <w:sz w:val="26"/>
+          <w:szCs w:val="26"/>
+        </w:rPr>
+        <w:t xml:space="preserve">10.20 Needs approval</w:t>
+      </w:r>
+    </w:p>
+    <w:p>
+      <w:pPr>
+        <w:pStyle w:val="Heading3"/>
+        <w:spacing w:after="80" w:before="200"/>
+      </w:pPr>
+      <w:r>
+        <w:rPr>
+          <w:rFonts w:ascii="Calibri" w:cs="Calibri" w:eastAsia="Calibri" w:hAnsi="Calibri"/>
+          <w:b/>
+          <w:bCs/>
+          <w:i w:val="false"/>
+          <w:iCs w:val="false"/>
+          <w:color w:val="000000"/>
+          <w:sz w:val="24"/>
+          <w:szCs w:val="24"/>
+        </w:rPr>
+        <w:t xml:space="preserve">What this page is</w:t>
+      </w:r>
+    </w:p>
+    <w:p>
+      <w:pPr>
+        <w:spacing w:after="160" w:before="0" w:line="276"/>
+        <w:jc w:val="left"/>
+      </w:pPr>
+      <w:r>
+        <w:rPr>
+          <w:rFonts w:ascii="Calibri" w:cs="Calibri" w:eastAsia="Calibri" w:hAnsi="Calibri"/>
+          <w:b w:val="false"/>
+          <w:bCs w:val="false"/>
+          <w:i w:val="false"/>
+          <w:iCs w:val="false"/>
+          <w:color w:val="000000"/>
+          <w:sz w:val="22"/>
+          <w:szCs w:val="22"/>
+        </w:rPr>
+        <w:t xml:space="preserve">This is the yes-or-no desk. Swaps, refunds, expenses, and stock counts wait here.</w:t>
+      </w:r>
+    </w:p>
+    <w:p>
+      <w:pPr>
+        <w:pStyle w:val="Heading3"/>
+        <w:spacing w:after="80" w:before="200"/>
+      </w:pPr>
+      <w:r>
+        <w:rPr>
+          <w:rFonts w:ascii="Calibri" w:cs="Calibri" w:eastAsia="Calibri" w:hAnsi="Calibri"/>
+          <w:b/>
+          <w:bCs/>
+          <w:i w:val="false"/>
+          <w:iCs w:val="false"/>
+          <w:color w:val="000000"/>
+          <w:sz w:val="24"/>
+          <w:szCs w:val="24"/>
+        </w:rPr>
+        <w:t xml:space="preserve">Why it is here</w:t>
+      </w:r>
+    </w:p>
+    <w:p>
+      <w:pPr>
+        <w:spacing w:after="160" w:before="0" w:line="276"/>
+        <w:jc w:val="left"/>
+      </w:pPr>
+      <w:r>
+        <w:rPr>
+          <w:rFonts w:ascii="Calibri" w:cs="Calibri" w:eastAsia="Calibri" w:hAnsi="Calibri"/>
+          <w:b w:val="false"/>
+          <w:bCs w:val="false"/>
+          <w:i w:val="false"/>
+          <w:iCs w:val="false"/>
+          <w:color w:val="000000"/>
+          <w:sz w:val="22"/>
+          <w:szCs w:val="22"/>
+        </w:rPr>
+        <w:t xml:space="preserve">One place is better than ten WhatsApp chats.</w:t>
+      </w:r>
+    </w:p>
+    <w:p>
+      <w:pPr>
+        <w:pStyle w:val="Heading3"/>
+        <w:spacing w:after="80" w:before="200"/>
+      </w:pPr>
+      <w:r>
+        <w:rPr>
+          <w:rFonts w:ascii="Calibri" w:cs="Calibri" w:eastAsia="Calibri" w:hAnsi="Calibri"/>
+          <w:b/>
+          <w:bCs/>
+          <w:i w:val="false"/>
+          <w:iCs w:val="false"/>
+          <w:color w:val="000000"/>
+          <w:sz w:val="24"/>
+          <w:szCs w:val="24"/>
+        </w:rPr>
+        <w:t xml:space="preserve">A real shop story</w:t>
+      </w:r>
+    </w:p>
+    <w:p>
+      <w:pPr>
+        <w:spacing w:after="160" w:before="0" w:line="276"/>
+        <w:jc w:val="left"/>
+      </w:pPr>
+      <w:r>
+        <w:rPr>
+          <w:rFonts w:ascii="Calibri" w:cs="Calibri" w:eastAsia="Calibri" w:hAnsi="Calibri"/>
+          <w:b w:val="false"/>
+          <w:bCs w:val="false"/>
+          <w:i w:val="false"/>
+          <w:iCs w:val="false"/>
+          <w:color w:val="000000"/>
+          <w:sz w:val="22"/>
+          <w:szCs w:val="22"/>
+        </w:rPr>
+        <w:t xml:space="preserve">The CEO opens Needs approval each morning. Three items wait. Two expenses are yes. One odd stock count is no until the manager recounts.</w:t>
+      </w:r>
+    </w:p>
+    <w:p>
+      <w:pPr>
+        <w:pStyle w:val="Heading3"/>
+        <w:spacing w:after="80" w:before="200"/>
+      </w:pPr>
+      <w:r>
+        <w:rPr>
+          <w:rFonts w:ascii="Calibri" w:cs="Calibri" w:eastAsia="Calibri" w:hAnsi="Calibri"/>
+          <w:b/>
+          <w:bCs/>
+          <w:i w:val="false"/>
+          <w:iCs w:val="false"/>
+          <w:color w:val="000000"/>
+          <w:sz w:val="24"/>
+          <w:szCs w:val="24"/>
+        </w:rPr>
+        <w:t xml:space="preserve">How to try it</w:t>
+      </w:r>
+    </w:p>
+    <w:p>
+      <w:pPr>
+        <w:spacing w:after="80" w:line="276"/>
+      </w:pPr>
+      <w:r>
+        <w:rPr>
+          <w:rFonts w:ascii="Calibri" w:cs="Calibri" w:eastAsia="Calibri" w:hAnsi="Calibri"/>
+          <w:b/>
+          <w:bCs/>
+          <w:i w:val="false"/>
+          <w:iCs w:val="false"/>
+          <w:color w:val="000000"/>
+          <w:sz w:val="22"/>
+          <w:szCs w:val="22"/>
+        </w:rPr>
+        <w:t xml:space="preserve">1. </w:t>
+      </w:r>
+      <w:r>
+        <w:rPr>
+          <w:rFonts w:ascii="Calibri" w:cs="Calibri" w:eastAsia="Calibri" w:hAnsi="Calibri"/>
+          <w:b w:val="false"/>
+          <w:bCs w:val="false"/>
+          <w:i w:val="false"/>
+          <w:iCs w:val="false"/>
+          <w:color w:val="000000"/>
+          <w:sz w:val="22"/>
+          <w:szCs w:val="22"/>
+        </w:rPr>
+        <w:t xml:space="preserve">Sign in as CEO or shop manager.</w:t>
+      </w:r>
+    </w:p>
+    <w:p>
+      <w:pPr>
+        <w:spacing w:after="80" w:line="276"/>
+      </w:pPr>
+      <w:r>
+        <w:rPr>
+          <w:rFonts w:ascii="Calibri" w:cs="Calibri" w:eastAsia="Calibri" w:hAnsi="Calibri"/>
+          <w:b/>
+          <w:bCs/>
+          <w:i w:val="false"/>
+          <w:iCs w:val="false"/>
+          <w:color w:val="000000"/>
+          <w:sz w:val="22"/>
+          <w:szCs w:val="22"/>
+        </w:rPr>
+        <w:t xml:space="preserve">2. </w:t>
+      </w:r>
+      <w:r>
+        <w:rPr>
+          <w:rFonts w:ascii="Calibri" w:cs="Calibri" w:eastAsia="Calibri" w:hAnsi="Calibri"/>
+          <w:b w:val="false"/>
+          <w:bCs w:val="false"/>
+          <w:i w:val="false"/>
+          <w:iCs w:val="false"/>
+          <w:color w:val="000000"/>
+          <w:sz w:val="22"/>
+          <w:szCs w:val="22"/>
+        </w:rPr>
+        <w:t xml:space="preserve">Click Needs approval.</w:t>
+      </w:r>
+    </w:p>
+    <w:p>
+      <w:pPr>
+        <w:spacing w:after="80" w:line="276"/>
+      </w:pPr>
+      <w:r>
+        <w:rPr>
+          <w:rFonts w:ascii="Calibri" w:cs="Calibri" w:eastAsia="Calibri" w:hAnsi="Calibri"/>
+          <w:b/>
+          <w:bCs/>
+          <w:i w:val="false"/>
+          <w:iCs w:val="false"/>
+          <w:color w:val="000000"/>
+          <w:sz w:val="22"/>
+          <w:szCs w:val="22"/>
+        </w:rPr>
+        <w:t xml:space="preserve">3. </w:t>
+      </w:r>
+      <w:r>
+        <w:rPr>
+          <w:rFonts w:ascii="Calibri" w:cs="Calibri" w:eastAsia="Calibri" w:hAnsi="Calibri"/>
+          <w:b w:val="false"/>
+          <w:bCs w:val="false"/>
+          <w:i w:val="false"/>
+          <w:iCs w:val="false"/>
+          <w:color w:val="000000"/>
+          <w:sz w:val="22"/>
+          <w:szCs w:val="22"/>
+        </w:rPr>
+        <w:t xml:space="preserve">Open an item. Read who asked and why.</w:t>
+      </w:r>
+    </w:p>
+    <w:p>
+      <w:pPr>
+        <w:spacing w:after="80" w:line="276"/>
+      </w:pPr>
+      <w:r>
+        <w:rPr>
+          <w:rFonts w:ascii="Calibri" w:cs="Calibri" w:eastAsia="Calibri" w:hAnsi="Calibri"/>
+          <w:b/>
+          <w:bCs/>
+          <w:i w:val="false"/>
+          <w:iCs w:val="false"/>
+          <w:color w:val="000000"/>
+          <w:sz w:val="22"/>
+          <w:szCs w:val="22"/>
+        </w:rPr>
+        <w:t xml:space="preserve">4. </w:t>
+      </w:r>
+      <w:r>
+        <w:rPr>
+          <w:rFonts w:ascii="Calibri" w:cs="Calibri" w:eastAsia="Calibri" w:hAnsi="Calibri"/>
+          <w:b w:val="false"/>
+          <w:bCs w:val="false"/>
+          <w:i w:val="false"/>
+          <w:iCs w:val="false"/>
+          <w:color w:val="000000"/>
+          <w:sz w:val="22"/>
+          <w:szCs w:val="22"/>
+        </w:rPr>
+        <w:t xml:space="preserve">Say yes or no.</w:t>
+      </w:r>
+    </w:p>
+    <w:p>
+      <w:pPr>
+        <w:pStyle w:val="Heading3"/>
+        <w:spacing w:after="80" w:before="200"/>
+      </w:pPr>
+      <w:r>
+        <w:rPr>
+          <w:rFonts w:ascii="Calibri" w:cs="Calibri" w:eastAsia="Calibri" w:hAnsi="Calibri"/>
+          <w:b/>
+          <w:bCs/>
+          <w:i w:val="false"/>
+          <w:iCs w:val="false"/>
+          <w:color w:val="000000"/>
+          <w:sz w:val="24"/>
+          <w:szCs w:val="24"/>
+        </w:rPr>
+        <w:t xml:space="preserve">What you should see</w:t>
       </w:r>
     </w:p>
     <w:p>
@@ -16334,7 +16353,7 @@
           <w:sz w:val="22"/>
           <w:szCs w:val="22"/>
         </w:rPr>
-        <w:t xml:space="preserve">After yes, the original work can continue.</w:t>
+        <w:t xml:space="preserve">The top of the page says how many are waiting.</w:t>
       </w:r>
     </w:p>
     <w:p>
@@ -16357,7 +16376,7 @@
           <w:sz w:val="22"/>
           <w:szCs w:val="22"/>
         </w:rPr>
-        <w:t xml:space="preserve">After no, the work stops.</w:t>
+        <w:t xml:space="preserve">After yes, the original work can continue.</w:t>
       </w:r>
     </w:p>
     <w:p>
@@ -16380,302 +16399,7 @@
           <w:sz w:val="22"/>
           <w:szCs w:val="22"/>
         </w:rPr>
-        <w:t xml:space="preserve">A cashier without approve rights cannot see the yes button.</w:t>
-      </w:r>
-    </w:p>
-    <w:p>
-      <w:pPr>
-        <w:pStyle w:val="Heading2"/>
-        <w:spacing w:after="120" w:before="280"/>
-      </w:pPr>
-      <w:r>
-        <w:rPr>
-          <w:rFonts w:ascii="Calibri" w:cs="Calibri" w:eastAsia="Calibri" w:hAnsi="Calibri"/>
-          <w:b/>
-          <w:bCs/>
-          <w:i w:val="false"/>
-          <w:iCs w:val="false"/>
-          <w:color w:val="000000"/>
-          <w:sz w:val="26"/>
-          <w:szCs w:val="26"/>
-        </w:rPr>
-        <w:t xml:space="preserve">10.21 Shops</w:t>
-      </w:r>
-    </w:p>
-    <w:p>
-      <w:pPr>
-        <w:pStyle w:val="Heading3"/>
-        <w:spacing w:after="80" w:before="200"/>
-      </w:pPr>
-      <w:r>
-        <w:rPr>
-          <w:rFonts w:ascii="Calibri" w:cs="Calibri" w:eastAsia="Calibri" w:hAnsi="Calibri"/>
-          <w:b/>
-          <w:bCs/>
-          <w:i w:val="false"/>
-          <w:iCs w:val="false"/>
-          <w:color w:val="000000"/>
-          <w:sz w:val="24"/>
-          <w:szCs w:val="24"/>
-        </w:rPr>
-        <w:t xml:space="preserve">What this page is</w:t>
-      </w:r>
-    </w:p>
-    <w:p>
-      <w:pPr>
-        <w:spacing w:after="160" w:before="0" w:line="276"/>
-        <w:jc w:val="left"/>
-      </w:pPr>
-      <w:r>
-        <w:rPr>
-          <w:rFonts w:ascii="Calibri" w:cs="Calibri" w:eastAsia="Calibri" w:hAnsi="Calibri"/>
-          <w:b w:val="false"/>
-          <w:bCs w:val="false"/>
-          <w:i w:val="false"/>
-          <w:iCs w:val="false"/>
-          <w:color w:val="000000"/>
-          <w:sz w:val="22"/>
-          <w:szCs w:val="22"/>
-        </w:rPr>
-        <w:t xml:space="preserve">Shops lists Iwo Road as HQ and Challenge as Open. Super Admin can open a new shop anywhere in Nigeria. Super Admin can close a shop. Closed shops stay in a Super Admin-only list so old sales are not lost.</w:t>
-      </w:r>
-    </w:p>
-    <w:p>
-      <w:pPr>
-        <w:pStyle w:val="Heading3"/>
-        <w:spacing w:after="80" w:before="200"/>
-      </w:pPr>
-      <w:r>
-        <w:rPr>
-          <w:rFonts w:ascii="Calibri" w:cs="Calibri" w:eastAsia="Calibri" w:hAnsi="Calibri"/>
-          <w:b/>
-          <w:bCs/>
-          <w:i w:val="false"/>
-          <w:iCs w:val="false"/>
-          <w:color w:val="000000"/>
-          <w:sz w:val="24"/>
-          <w:szCs w:val="24"/>
-        </w:rPr>
-        <w:t xml:space="preserve">Why it is here</w:t>
-      </w:r>
-    </w:p>
-    <w:p>
-      <w:pPr>
-        <w:spacing w:after="160" w:before="0" w:line="276"/>
-        <w:jc w:val="left"/>
-      </w:pPr>
-      <w:r>
-        <w:rPr>
-          <w:rFonts w:ascii="Calibri" w:cs="Calibri" w:eastAsia="Calibri" w:hAnsi="Calibri"/>
-          <w:b w:val="false"/>
-          <w:bCs w:val="false"/>
-          <w:i w:val="false"/>
-          <w:iCs w:val="false"/>
-          <w:color w:val="000000"/>
-          <w:sz w:val="22"/>
-          <w:szCs w:val="22"/>
-        </w:rPr>
-        <w:t xml:space="preserve">Abu Twins will grow. The software must not be rebuilt for each new city.</w:t>
-      </w:r>
-    </w:p>
-    <w:p>
-      <w:pPr>
-        <w:pStyle w:val="Heading3"/>
-        <w:spacing w:after="80" w:before="200"/>
-      </w:pPr>
-      <w:r>
-        <w:rPr>
-          <w:rFonts w:ascii="Calibri" w:cs="Calibri" w:eastAsia="Calibri" w:hAnsi="Calibri"/>
-          <w:b/>
-          <w:bCs/>
-          <w:i w:val="false"/>
-          <w:iCs w:val="false"/>
-          <w:color w:val="000000"/>
-          <w:sz w:val="24"/>
-          <w:szCs w:val="24"/>
-        </w:rPr>
-        <w:t xml:space="preserve">A real shop story</w:t>
-      </w:r>
-    </w:p>
-    <w:p>
-      <w:pPr>
-        <w:spacing w:after="160" w:before="0" w:line="276"/>
-        <w:jc w:val="left"/>
-      </w:pPr>
-      <w:r>
-        <w:rPr>
-          <w:rFonts w:ascii="Calibri" w:cs="Calibri" w:eastAsia="Calibri" w:hAnsi="Calibri"/>
-          <w:b w:val="false"/>
-          <w:bCs w:val="false"/>
-          <w:i w:val="false"/>
-          <w:iCs w:val="false"/>
-          <w:color w:val="000000"/>
-          <w:sz w:val="22"/>
-          <w:szCs w:val="22"/>
-        </w:rPr>
-        <w:t xml:space="preserve">Next year Abu Twins may open in Ilorin. Super Admin types the shop name, a short code, and the address. Staff in Ilorin then work in that shop only.</w:t>
-      </w:r>
-    </w:p>
-    <w:p>
-      <w:pPr>
-        <w:pStyle w:val="Heading3"/>
-        <w:spacing w:after="80" w:before="200"/>
-      </w:pPr>
-      <w:r>
-        <w:rPr>
-          <w:rFonts w:ascii="Calibri" w:cs="Calibri" w:eastAsia="Calibri" w:hAnsi="Calibri"/>
-          <w:b/>
-          <w:bCs/>
-          <w:i w:val="false"/>
-          <w:iCs w:val="false"/>
-          <w:color w:val="000000"/>
-          <w:sz w:val="24"/>
-          <w:szCs w:val="24"/>
-        </w:rPr>
-        <w:t xml:space="preserve">How to try it</w:t>
-      </w:r>
-    </w:p>
-    <w:p>
-      <w:pPr>
-        <w:spacing w:after="80" w:line="276"/>
-      </w:pPr>
-      <w:r>
-        <w:rPr>
-          <w:rFonts w:ascii="Calibri" w:cs="Calibri" w:eastAsia="Calibri" w:hAnsi="Calibri"/>
-          <w:b/>
-          <w:bCs/>
-          <w:i w:val="false"/>
-          <w:iCs w:val="false"/>
-          <w:color w:val="000000"/>
-          <w:sz w:val="22"/>
-          <w:szCs w:val="22"/>
-        </w:rPr>
-        <w:t xml:space="preserve">1. </w:t>
-      </w:r>
-      <w:r>
-        <w:rPr>
-          <w:rFonts w:ascii="Calibri" w:cs="Calibri" w:eastAsia="Calibri" w:hAnsi="Calibri"/>
-          <w:b w:val="false"/>
-          <w:bCs w:val="false"/>
-          <w:i w:val="false"/>
-          <w:iCs w:val="false"/>
-          <w:color w:val="000000"/>
-          <w:sz w:val="22"/>
-          <w:szCs w:val="22"/>
-        </w:rPr>
-        <w:t xml:space="preserve">Sign in as CEO. Click Shops.</w:t>
-      </w:r>
-    </w:p>
-    <w:p>
-      <w:pPr>
-        <w:spacing w:after="80" w:line="276"/>
-      </w:pPr>
-      <w:r>
-        <w:rPr>
-          <w:rFonts w:ascii="Calibri" w:cs="Calibri" w:eastAsia="Calibri" w:hAnsi="Calibri"/>
-          <w:b/>
-          <w:bCs/>
-          <w:i w:val="false"/>
-          <w:iCs w:val="false"/>
-          <w:color w:val="000000"/>
-          <w:sz w:val="22"/>
-          <w:szCs w:val="22"/>
-        </w:rPr>
-        <w:t xml:space="preserve">2. </w:t>
-      </w:r>
-      <w:r>
-        <w:rPr>
-          <w:rFonts w:ascii="Calibri" w:cs="Calibri" w:eastAsia="Calibri" w:hAnsi="Calibri"/>
-          <w:b w:val="false"/>
-          <w:bCs w:val="false"/>
-          <w:i w:val="false"/>
-          <w:iCs w:val="false"/>
-          <w:color w:val="000000"/>
-          <w:sz w:val="22"/>
-          <w:szCs w:val="22"/>
-        </w:rPr>
-        <w:t xml:space="preserve">Confirm you see Iwo Road, Ibadan · HQ and Challenge, Ibadan.</w:t>
-      </w:r>
-    </w:p>
-    <w:p>
-      <w:pPr>
-        <w:spacing w:after="80" w:line="276"/>
-      </w:pPr>
-      <w:r>
-        <w:rPr>
-          <w:rFonts w:ascii="Calibri" w:cs="Calibri" w:eastAsia="Calibri" w:hAnsi="Calibri"/>
-          <w:b/>
-          <w:bCs/>
-          <w:i w:val="false"/>
-          <w:iCs w:val="false"/>
-          <w:color w:val="000000"/>
-          <w:sz w:val="22"/>
-          <w:szCs w:val="22"/>
-        </w:rPr>
-        <w:t xml:space="preserve">3. </w:t>
-      </w:r>
-      <w:r>
-        <w:rPr>
-          <w:rFonts w:ascii="Calibri" w:cs="Calibri" w:eastAsia="Calibri" w:hAnsi="Calibri"/>
-          <w:b w:val="false"/>
-          <w:bCs w:val="false"/>
-          <w:i w:val="false"/>
-          <w:iCs w:val="false"/>
-          <w:color w:val="000000"/>
-          <w:sz w:val="22"/>
-          <w:szCs w:val="22"/>
-        </w:rPr>
-        <w:t xml:space="preserve">Confirm you do not see Lagos or Abuja as open shops.</w:t>
-      </w:r>
-    </w:p>
-    <w:p>
-      <w:pPr>
-        <w:spacing w:after="80" w:line="276"/>
-      </w:pPr>
-      <w:r>
-        <w:rPr>
-          <w:rFonts w:ascii="Calibri" w:cs="Calibri" w:eastAsia="Calibri" w:hAnsi="Calibri"/>
-          <w:b/>
-          <w:bCs/>
-          <w:i w:val="false"/>
-          <w:iCs w:val="false"/>
-          <w:color w:val="000000"/>
-          <w:sz w:val="22"/>
-          <w:szCs w:val="22"/>
-        </w:rPr>
-        <w:t xml:space="preserve">4. </w:t>
-      </w:r>
-      <w:r>
-        <w:rPr>
-          <w:rFonts w:ascii="Calibri" w:cs="Calibri" w:eastAsia="Calibri" w:hAnsi="Calibri"/>
-          <w:b w:val="false"/>
-          <w:bCs w:val="false"/>
-          <w:i w:val="false"/>
-          <w:iCs w:val="false"/>
-          <w:color w:val="000000"/>
-          <w:sz w:val="22"/>
-          <w:szCs w:val="22"/>
-        </w:rPr>
-        <w:t xml:space="preserve">Sign in as Super Admin. Confirm a Closed list exists for old shops, and an Open a new shop form is there.</w:t>
-      </w:r>
-    </w:p>
-    <w:p>
-      <w:pPr>
-        <w:pStyle w:val="Heading3"/>
-        <w:spacing w:after="80" w:before="200"/>
-      </w:pPr>
-      <w:r>
-        <w:rPr>
-          <w:rFonts w:ascii="Calibri" w:cs="Calibri" w:eastAsia="Calibri" w:hAnsi="Calibri"/>
-          <w:b/>
-          <w:bCs/>
-          <w:i w:val="false"/>
-          <w:iCs w:val="false"/>
-          <w:color w:val="000000"/>
-          <w:sz w:val="24"/>
-          <w:szCs w:val="24"/>
-        </w:rPr>
-        <w:t xml:space="preserve">What you should see</w:t>
+        <w:t xml:space="preserve">After no, the work stops.</w:t>
       </w:r>
     </w:p>
     <w:p>
@@ -16698,7 +16422,302 @@
           <w:sz w:val="22"/>
           <w:szCs w:val="22"/>
         </w:rPr>
-        <w:t xml:space="preserve">CEO sees only the two Ibadan shops.</w:t>
+        <w:t xml:space="preserve">A cashier without approve rights cannot see the yes button.</w:t>
+      </w:r>
+    </w:p>
+    <w:p>
+      <w:pPr>
+        <w:pStyle w:val="Heading2"/>
+        <w:spacing w:after="120" w:before="280"/>
+      </w:pPr>
+      <w:r>
+        <w:rPr>
+          <w:rFonts w:ascii="Calibri" w:cs="Calibri" w:eastAsia="Calibri" w:hAnsi="Calibri"/>
+          <w:b/>
+          <w:bCs/>
+          <w:i w:val="false"/>
+          <w:iCs w:val="false"/>
+          <w:color w:val="000000"/>
+          <w:sz w:val="26"/>
+          <w:szCs w:val="26"/>
+        </w:rPr>
+        <w:t xml:space="preserve">10.21 Shops</w:t>
+      </w:r>
+    </w:p>
+    <w:p>
+      <w:pPr>
+        <w:pStyle w:val="Heading3"/>
+        <w:spacing w:after="80" w:before="200"/>
+      </w:pPr>
+      <w:r>
+        <w:rPr>
+          <w:rFonts w:ascii="Calibri" w:cs="Calibri" w:eastAsia="Calibri" w:hAnsi="Calibri"/>
+          <w:b/>
+          <w:bCs/>
+          <w:i w:val="false"/>
+          <w:iCs w:val="false"/>
+          <w:color w:val="000000"/>
+          <w:sz w:val="24"/>
+          <w:szCs w:val="24"/>
+        </w:rPr>
+        <w:t xml:space="preserve">What this page is</w:t>
+      </w:r>
+    </w:p>
+    <w:p>
+      <w:pPr>
+        <w:spacing w:after="160" w:before="0" w:line="276"/>
+        <w:jc w:val="left"/>
+      </w:pPr>
+      <w:r>
+        <w:rPr>
+          <w:rFonts w:ascii="Calibri" w:cs="Calibri" w:eastAsia="Calibri" w:hAnsi="Calibri"/>
+          <w:b w:val="false"/>
+          <w:bCs w:val="false"/>
+          <w:i w:val="false"/>
+          <w:iCs w:val="false"/>
+          <w:color w:val="000000"/>
+          <w:sz w:val="22"/>
+          <w:szCs w:val="22"/>
+        </w:rPr>
+        <w:t xml:space="preserve">Shops lists Iwo Road as HQ and Challenge as Open. Super Admin can open a new shop anywhere in Nigeria. Super Admin can close a shop. Closed shops stay in a Super Admin-only list so old sales are not lost.</w:t>
+      </w:r>
+    </w:p>
+    <w:p>
+      <w:pPr>
+        <w:pStyle w:val="Heading3"/>
+        <w:spacing w:after="80" w:before="200"/>
+      </w:pPr>
+      <w:r>
+        <w:rPr>
+          <w:rFonts w:ascii="Calibri" w:cs="Calibri" w:eastAsia="Calibri" w:hAnsi="Calibri"/>
+          <w:b/>
+          <w:bCs/>
+          <w:i w:val="false"/>
+          <w:iCs w:val="false"/>
+          <w:color w:val="000000"/>
+          <w:sz w:val="24"/>
+          <w:szCs w:val="24"/>
+        </w:rPr>
+        <w:t xml:space="preserve">Why it is here</w:t>
+      </w:r>
+    </w:p>
+    <w:p>
+      <w:pPr>
+        <w:spacing w:after="160" w:before="0" w:line="276"/>
+        <w:jc w:val="left"/>
+      </w:pPr>
+      <w:r>
+        <w:rPr>
+          <w:rFonts w:ascii="Calibri" w:cs="Calibri" w:eastAsia="Calibri" w:hAnsi="Calibri"/>
+          <w:b w:val="false"/>
+          <w:bCs w:val="false"/>
+          <w:i w:val="false"/>
+          <w:iCs w:val="false"/>
+          <w:color w:val="000000"/>
+          <w:sz w:val="22"/>
+          <w:szCs w:val="22"/>
+        </w:rPr>
+        <w:t xml:space="preserve">Abu Twins will grow. The software must not be rebuilt for each new city.</w:t>
+      </w:r>
+    </w:p>
+    <w:p>
+      <w:pPr>
+        <w:pStyle w:val="Heading3"/>
+        <w:spacing w:after="80" w:before="200"/>
+      </w:pPr>
+      <w:r>
+        <w:rPr>
+          <w:rFonts w:ascii="Calibri" w:cs="Calibri" w:eastAsia="Calibri" w:hAnsi="Calibri"/>
+          <w:b/>
+          <w:bCs/>
+          <w:i w:val="false"/>
+          <w:iCs w:val="false"/>
+          <w:color w:val="000000"/>
+          <w:sz w:val="24"/>
+          <w:szCs w:val="24"/>
+        </w:rPr>
+        <w:t xml:space="preserve">A real shop story</w:t>
+      </w:r>
+    </w:p>
+    <w:p>
+      <w:pPr>
+        <w:spacing w:after="160" w:before="0" w:line="276"/>
+        <w:jc w:val="left"/>
+      </w:pPr>
+      <w:r>
+        <w:rPr>
+          <w:rFonts w:ascii="Calibri" w:cs="Calibri" w:eastAsia="Calibri" w:hAnsi="Calibri"/>
+          <w:b w:val="false"/>
+          <w:bCs w:val="false"/>
+          <w:i w:val="false"/>
+          <w:iCs w:val="false"/>
+          <w:color w:val="000000"/>
+          <w:sz w:val="22"/>
+          <w:szCs w:val="22"/>
+        </w:rPr>
+        <w:t xml:space="preserve">Next year Abu Twins may open in Ilorin. Super Admin types the shop name, a short code, and the address. Staff in Ilorin then work in that shop only.</w:t>
+      </w:r>
+    </w:p>
+    <w:p>
+      <w:pPr>
+        <w:pStyle w:val="Heading3"/>
+        <w:spacing w:after="80" w:before="200"/>
+      </w:pPr>
+      <w:r>
+        <w:rPr>
+          <w:rFonts w:ascii="Calibri" w:cs="Calibri" w:eastAsia="Calibri" w:hAnsi="Calibri"/>
+          <w:b/>
+          <w:bCs/>
+          <w:i w:val="false"/>
+          <w:iCs w:val="false"/>
+          <w:color w:val="000000"/>
+          <w:sz w:val="24"/>
+          <w:szCs w:val="24"/>
+        </w:rPr>
+        <w:t xml:space="preserve">How to try it</w:t>
+      </w:r>
+    </w:p>
+    <w:p>
+      <w:pPr>
+        <w:spacing w:after="80" w:line="276"/>
+      </w:pPr>
+      <w:r>
+        <w:rPr>
+          <w:rFonts w:ascii="Calibri" w:cs="Calibri" w:eastAsia="Calibri" w:hAnsi="Calibri"/>
+          <w:b/>
+          <w:bCs/>
+          <w:i w:val="false"/>
+          <w:iCs w:val="false"/>
+          <w:color w:val="000000"/>
+          <w:sz w:val="22"/>
+          <w:szCs w:val="22"/>
+        </w:rPr>
+        <w:t xml:space="preserve">1. </w:t>
+      </w:r>
+      <w:r>
+        <w:rPr>
+          <w:rFonts w:ascii="Calibri" w:cs="Calibri" w:eastAsia="Calibri" w:hAnsi="Calibri"/>
+          <w:b w:val="false"/>
+          <w:bCs w:val="false"/>
+          <w:i w:val="false"/>
+          <w:iCs w:val="false"/>
+          <w:color w:val="000000"/>
+          <w:sz w:val="22"/>
+          <w:szCs w:val="22"/>
+        </w:rPr>
+        <w:t xml:space="preserve">Sign in as CEO. Click Shops.</w:t>
+      </w:r>
+    </w:p>
+    <w:p>
+      <w:pPr>
+        <w:spacing w:after="80" w:line="276"/>
+      </w:pPr>
+      <w:r>
+        <w:rPr>
+          <w:rFonts w:ascii="Calibri" w:cs="Calibri" w:eastAsia="Calibri" w:hAnsi="Calibri"/>
+          <w:b/>
+          <w:bCs/>
+          <w:i w:val="false"/>
+          <w:iCs w:val="false"/>
+          <w:color w:val="000000"/>
+          <w:sz w:val="22"/>
+          <w:szCs w:val="22"/>
+        </w:rPr>
+        <w:t xml:space="preserve">2. </w:t>
+      </w:r>
+      <w:r>
+        <w:rPr>
+          <w:rFonts w:ascii="Calibri" w:cs="Calibri" w:eastAsia="Calibri" w:hAnsi="Calibri"/>
+          <w:b w:val="false"/>
+          <w:bCs w:val="false"/>
+          <w:i w:val="false"/>
+          <w:iCs w:val="false"/>
+          <w:color w:val="000000"/>
+          <w:sz w:val="22"/>
+          <w:szCs w:val="22"/>
+        </w:rPr>
+        <w:t xml:space="preserve">Confirm you see Iwo Road, Ibadan · HQ and Challenge, Ibadan.</w:t>
+      </w:r>
+    </w:p>
+    <w:p>
+      <w:pPr>
+        <w:spacing w:after="80" w:line="276"/>
+      </w:pPr>
+      <w:r>
+        <w:rPr>
+          <w:rFonts w:ascii="Calibri" w:cs="Calibri" w:eastAsia="Calibri" w:hAnsi="Calibri"/>
+          <w:b/>
+          <w:bCs/>
+          <w:i w:val="false"/>
+          <w:iCs w:val="false"/>
+          <w:color w:val="000000"/>
+          <w:sz w:val="22"/>
+          <w:szCs w:val="22"/>
+        </w:rPr>
+        <w:t xml:space="preserve">3. </w:t>
+      </w:r>
+      <w:r>
+        <w:rPr>
+          <w:rFonts w:ascii="Calibri" w:cs="Calibri" w:eastAsia="Calibri" w:hAnsi="Calibri"/>
+          <w:b w:val="false"/>
+          <w:bCs w:val="false"/>
+          <w:i w:val="false"/>
+          <w:iCs w:val="false"/>
+          <w:color w:val="000000"/>
+          <w:sz w:val="22"/>
+          <w:szCs w:val="22"/>
+        </w:rPr>
+        <w:t xml:space="preserve">Confirm you do not see Lagos or Abuja as open shops.</w:t>
+      </w:r>
+    </w:p>
+    <w:p>
+      <w:pPr>
+        <w:spacing w:after="80" w:line="276"/>
+      </w:pPr>
+      <w:r>
+        <w:rPr>
+          <w:rFonts w:ascii="Calibri" w:cs="Calibri" w:eastAsia="Calibri" w:hAnsi="Calibri"/>
+          <w:b/>
+          <w:bCs/>
+          <w:i w:val="false"/>
+          <w:iCs w:val="false"/>
+          <w:color w:val="000000"/>
+          <w:sz w:val="22"/>
+          <w:szCs w:val="22"/>
+        </w:rPr>
+        <w:t xml:space="preserve">4. </w:t>
+      </w:r>
+      <w:r>
+        <w:rPr>
+          <w:rFonts w:ascii="Calibri" w:cs="Calibri" w:eastAsia="Calibri" w:hAnsi="Calibri"/>
+          <w:b w:val="false"/>
+          <w:bCs w:val="false"/>
+          <w:i w:val="false"/>
+          <w:iCs w:val="false"/>
+          <w:color w:val="000000"/>
+          <w:sz w:val="22"/>
+          <w:szCs w:val="22"/>
+        </w:rPr>
+        <w:t xml:space="preserve">Sign in as Super Admin. Confirm a Closed list exists for old shops, and an Open a new shop form is there.</w:t>
+      </w:r>
+    </w:p>
+    <w:p>
+      <w:pPr>
+        <w:pStyle w:val="Heading3"/>
+        <w:spacing w:after="80" w:before="200"/>
+      </w:pPr>
+      <w:r>
+        <w:rPr>
+          <w:rFonts w:ascii="Calibri" w:cs="Calibri" w:eastAsia="Calibri" w:hAnsi="Calibri"/>
+          <w:b/>
+          <w:bCs/>
+          <w:i w:val="false"/>
+          <w:iCs w:val="false"/>
+          <w:color w:val="000000"/>
+          <w:sz w:val="24"/>
+          <w:szCs w:val="24"/>
+        </w:rPr>
+        <w:t xml:space="preserve">What you should see</w:t>
       </w:r>
     </w:p>
     <w:p>
@@ -16721,7 +16740,7 @@
           <w:sz w:val="22"/>
           <w:szCs w:val="22"/>
         </w:rPr>
-        <w:t xml:space="preserve">Iwo Road has the HQ badge.</w:t>
+        <w:t xml:space="preserve">CEO sees only the two Ibadan shops.</w:t>
       </w:r>
     </w:p>
     <w:p>
@@ -16744,7 +16763,7 @@
           <w:sz w:val="22"/>
           <w:szCs w:val="22"/>
         </w:rPr>
-        <w:t xml:space="preserve">Challenge has the Open badge.</w:t>
+        <w:t xml:space="preserve">Iwo Road has the HQ badge.</w:t>
       </w:r>
     </w:p>
     <w:p>
@@ -16767,302 +16786,7 @@
           <w:sz w:val="22"/>
           <w:szCs w:val="22"/>
         </w:rPr>
-        <w:t xml:space="preserve">Only Super Admin can open or close a shop.</w:t>
-      </w:r>
-    </w:p>
-    <w:p>
-      <w:pPr>
-        <w:pStyle w:val="Heading2"/>
-        <w:spacing w:after="120" w:before="280"/>
-      </w:pPr>
-      <w:r>
-        <w:rPr>
-          <w:rFonts w:ascii="Calibri" w:cs="Calibri" w:eastAsia="Calibri" w:hAnsi="Calibri"/>
-          <w:b/>
-          <w:bCs/>
-          <w:i w:val="false"/>
-          <w:iCs w:val="false"/>
-          <w:color w:val="000000"/>
-          <w:sz w:val="26"/>
-          <w:szCs w:val="26"/>
-        </w:rPr>
-        <w:t xml:space="preserve">10.22 Staff</w:t>
-      </w:r>
-    </w:p>
-    <w:p>
-      <w:pPr>
-        <w:pStyle w:val="Heading3"/>
-        <w:spacing w:after="80" w:before="200"/>
-      </w:pPr>
-      <w:r>
-        <w:rPr>
-          <w:rFonts w:ascii="Calibri" w:cs="Calibri" w:eastAsia="Calibri" w:hAnsi="Calibri"/>
-          <w:b/>
-          <w:bCs/>
-          <w:i w:val="false"/>
-          <w:iCs w:val="false"/>
-          <w:color w:val="000000"/>
-          <w:sz w:val="24"/>
-          <w:szCs w:val="24"/>
-        </w:rPr>
-        <w:t xml:space="preserve">What this page is</w:t>
-      </w:r>
-    </w:p>
-    <w:p>
-      <w:pPr>
-        <w:spacing w:after="160" w:before="0" w:line="276"/>
-        <w:jc w:val="left"/>
-      </w:pPr>
-      <w:r>
-        <w:rPr>
-          <w:rFonts w:ascii="Calibri" w:cs="Calibri" w:eastAsia="Calibri" w:hAnsi="Calibri"/>
-          <w:b w:val="false"/>
-          <w:bCs w:val="false"/>
-          <w:i w:val="false"/>
-          <w:iCs w:val="false"/>
-          <w:color w:val="000000"/>
-          <w:sz w:val="22"/>
-          <w:szCs w:val="22"/>
-        </w:rPr>
-        <w:t xml:space="preserve">Staff is the people list. Super Admin or a shop manager (if allowed) can add a person, pick their job, and pick their shop. Super Admin can lock a login.</w:t>
-      </w:r>
-    </w:p>
-    <w:p>
-      <w:pPr>
-        <w:pStyle w:val="Heading3"/>
-        <w:spacing w:after="80" w:before="200"/>
-      </w:pPr>
-      <w:r>
-        <w:rPr>
-          <w:rFonts w:ascii="Calibri" w:cs="Calibri" w:eastAsia="Calibri" w:hAnsi="Calibri"/>
-          <w:b/>
-          <w:bCs/>
-          <w:i w:val="false"/>
-          <w:iCs w:val="false"/>
-          <w:color w:val="000000"/>
-          <w:sz w:val="24"/>
-          <w:szCs w:val="24"/>
-        </w:rPr>
-        <w:t xml:space="preserve">Why it is here</w:t>
-      </w:r>
-    </w:p>
-    <w:p>
-      <w:pPr>
-        <w:spacing w:after="160" w:before="0" w:line="276"/>
-        <w:jc w:val="left"/>
-      </w:pPr>
-      <w:r>
-        <w:rPr>
-          <w:rFonts w:ascii="Calibri" w:cs="Calibri" w:eastAsia="Calibri" w:hAnsi="Calibri"/>
-          <w:b w:val="false"/>
-          <w:bCs w:val="false"/>
-          <w:i w:val="false"/>
-          <w:iCs w:val="false"/>
-          <w:color w:val="000000"/>
-          <w:sz w:val="22"/>
-          <w:szCs w:val="22"/>
-        </w:rPr>
-        <w:t xml:space="preserve">A person who leaves the company must not keep a key to the till.</w:t>
-      </w:r>
-    </w:p>
-    <w:p>
-      <w:pPr>
-        <w:pStyle w:val="Heading3"/>
-        <w:spacing w:after="80" w:before="200"/>
-      </w:pPr>
-      <w:r>
-        <w:rPr>
-          <w:rFonts w:ascii="Calibri" w:cs="Calibri" w:eastAsia="Calibri" w:hAnsi="Calibri"/>
-          <w:b/>
-          <w:bCs/>
-          <w:i w:val="false"/>
-          <w:iCs w:val="false"/>
-          <w:color w:val="000000"/>
-          <w:sz w:val="24"/>
-          <w:szCs w:val="24"/>
-        </w:rPr>
-        <w:t xml:space="preserve">A real shop story</w:t>
-      </w:r>
-    </w:p>
-    <w:p>
-      <w:pPr>
-        <w:spacing w:after="160" w:before="0" w:line="276"/>
-        <w:jc w:val="left"/>
-      </w:pPr>
-      <w:r>
-        <w:rPr>
-          <w:rFonts w:ascii="Calibri" w:cs="Calibri" w:eastAsia="Calibri" w:hAnsi="Calibri"/>
-          <w:b w:val="false"/>
-          <w:bCs w:val="false"/>
-          <w:i w:val="false"/>
-          <w:iCs w:val="false"/>
-          <w:color w:val="000000"/>
-          <w:sz w:val="22"/>
-          <w:szCs w:val="22"/>
-        </w:rPr>
-        <w:t xml:space="preserve">A new cashier starts at Challenge. Super Admin adds their work email, sets job to Cashier, sets shop to Challenge, and gives them a first password. After they sign in, Super Admin asks them to change it.</w:t>
-      </w:r>
-    </w:p>
-    <w:p>
-      <w:pPr>
-        <w:pStyle w:val="Heading3"/>
-        <w:spacing w:after="80" w:before="200"/>
-      </w:pPr>
-      <w:r>
-        <w:rPr>
-          <w:rFonts w:ascii="Calibri" w:cs="Calibri" w:eastAsia="Calibri" w:hAnsi="Calibri"/>
-          <w:b/>
-          <w:bCs/>
-          <w:i w:val="false"/>
-          <w:iCs w:val="false"/>
-          <w:color w:val="000000"/>
-          <w:sz w:val="24"/>
-          <w:szCs w:val="24"/>
-        </w:rPr>
-        <w:t xml:space="preserve">How to try it</w:t>
-      </w:r>
-    </w:p>
-    <w:p>
-      <w:pPr>
-        <w:spacing w:after="80" w:line="276"/>
-      </w:pPr>
-      <w:r>
-        <w:rPr>
-          <w:rFonts w:ascii="Calibri" w:cs="Calibri" w:eastAsia="Calibri" w:hAnsi="Calibri"/>
-          <w:b/>
-          <w:bCs/>
-          <w:i w:val="false"/>
-          <w:iCs w:val="false"/>
-          <w:color w:val="000000"/>
-          <w:sz w:val="22"/>
-          <w:szCs w:val="22"/>
-        </w:rPr>
-        <w:t xml:space="preserve">1. </w:t>
-      </w:r>
-      <w:r>
-        <w:rPr>
-          <w:rFonts w:ascii="Calibri" w:cs="Calibri" w:eastAsia="Calibri" w:hAnsi="Calibri"/>
-          <w:b w:val="false"/>
-          <w:bCs w:val="false"/>
-          <w:i w:val="false"/>
-          <w:iCs w:val="false"/>
-          <w:color w:val="000000"/>
-          <w:sz w:val="22"/>
-          <w:szCs w:val="22"/>
-        </w:rPr>
-        <w:t xml:space="preserve">Sign in as Super Admin.</w:t>
-      </w:r>
-    </w:p>
-    <w:p>
-      <w:pPr>
-        <w:spacing w:after="80" w:line="276"/>
-      </w:pPr>
-      <w:r>
-        <w:rPr>
-          <w:rFonts w:ascii="Calibri" w:cs="Calibri" w:eastAsia="Calibri" w:hAnsi="Calibri"/>
-          <w:b/>
-          <w:bCs/>
-          <w:i w:val="false"/>
-          <w:iCs w:val="false"/>
-          <w:color w:val="000000"/>
-          <w:sz w:val="22"/>
-          <w:szCs w:val="22"/>
-        </w:rPr>
-        <w:t xml:space="preserve">2. </w:t>
-      </w:r>
-      <w:r>
-        <w:rPr>
-          <w:rFonts w:ascii="Calibri" w:cs="Calibri" w:eastAsia="Calibri" w:hAnsi="Calibri"/>
-          <w:b w:val="false"/>
-          <w:bCs w:val="false"/>
-          <w:i w:val="false"/>
-          <w:iCs w:val="false"/>
-          <w:color w:val="000000"/>
-          <w:sz w:val="22"/>
-          <w:szCs w:val="22"/>
-        </w:rPr>
-        <w:t xml:space="preserve">Click Staff.</w:t>
-      </w:r>
-    </w:p>
-    <w:p>
-      <w:pPr>
-        <w:spacing w:after="80" w:line="276"/>
-      </w:pPr>
-      <w:r>
-        <w:rPr>
-          <w:rFonts w:ascii="Calibri" w:cs="Calibri" w:eastAsia="Calibri" w:hAnsi="Calibri"/>
-          <w:b/>
-          <w:bCs/>
-          <w:i w:val="false"/>
-          <w:iCs w:val="false"/>
-          <w:color w:val="000000"/>
-          <w:sz w:val="22"/>
-          <w:szCs w:val="22"/>
-        </w:rPr>
-        <w:t xml:space="preserve">3. </w:t>
-      </w:r>
-      <w:r>
-        <w:rPr>
-          <w:rFonts w:ascii="Calibri" w:cs="Calibri" w:eastAsia="Calibri" w:hAnsi="Calibri"/>
-          <w:b w:val="false"/>
-          <w:bCs w:val="false"/>
-          <w:i w:val="false"/>
-          <w:iCs w:val="false"/>
-          <w:color w:val="000000"/>
-          <w:sz w:val="22"/>
-          <w:szCs w:val="22"/>
-        </w:rPr>
-        <w:t xml:space="preserve">Read names, jobs, shops, and Active or Disabled.</w:t>
-      </w:r>
-    </w:p>
-    <w:p>
-      <w:pPr>
-        <w:spacing w:after="80" w:line="276"/>
-      </w:pPr>
-      <w:r>
-        <w:rPr>
-          <w:rFonts w:ascii="Calibri" w:cs="Calibri" w:eastAsia="Calibri" w:hAnsi="Calibri"/>
-          <w:b/>
-          <w:bCs/>
-          <w:i w:val="false"/>
-          <w:iCs w:val="false"/>
-          <w:color w:val="000000"/>
-          <w:sz w:val="22"/>
-          <w:szCs w:val="22"/>
-        </w:rPr>
-        <w:t xml:space="preserve">4. </w:t>
-      </w:r>
-      <w:r>
-        <w:rPr>
-          <w:rFonts w:ascii="Calibri" w:cs="Calibri" w:eastAsia="Calibri" w:hAnsi="Calibri"/>
-          <w:b w:val="false"/>
-          <w:bCs w:val="false"/>
-          <w:i w:val="false"/>
-          <w:iCs w:val="false"/>
-          <w:color w:val="000000"/>
-          <w:sz w:val="22"/>
-          <w:szCs w:val="22"/>
-        </w:rPr>
-        <w:t xml:space="preserve">Do not disable the only Super Admin during a test.</w:t>
-      </w:r>
-    </w:p>
-    <w:p>
-      <w:pPr>
-        <w:pStyle w:val="Heading3"/>
-        <w:spacing w:after="80" w:before="200"/>
-      </w:pPr>
-      <w:r>
-        <w:rPr>
-          <w:rFonts w:ascii="Calibri" w:cs="Calibri" w:eastAsia="Calibri" w:hAnsi="Calibri"/>
-          <w:b/>
-          <w:bCs/>
-          <w:i w:val="false"/>
-          <w:iCs w:val="false"/>
-          <w:color w:val="000000"/>
-          <w:sz w:val="24"/>
-          <w:szCs w:val="24"/>
-        </w:rPr>
-        <w:t xml:space="preserve">What you should see</w:t>
+        <w:t xml:space="preserve">Challenge has the Open badge.</w:t>
       </w:r>
     </w:p>
     <w:p>
@@ -17085,7 +16809,302 @@
           <w:sz w:val="22"/>
           <w:szCs w:val="22"/>
         </w:rPr>
-        <w:t xml:space="preserve">Each test person in section 12 appears.</w:t>
+        <w:t xml:space="preserve">Only Super Admin can open or close a shop.</w:t>
+      </w:r>
+    </w:p>
+    <w:p>
+      <w:pPr>
+        <w:pStyle w:val="Heading2"/>
+        <w:spacing w:after="120" w:before="280"/>
+      </w:pPr>
+      <w:r>
+        <w:rPr>
+          <w:rFonts w:ascii="Calibri" w:cs="Calibri" w:eastAsia="Calibri" w:hAnsi="Calibri"/>
+          <w:b/>
+          <w:bCs/>
+          <w:i w:val="false"/>
+          <w:iCs w:val="false"/>
+          <w:color w:val="000000"/>
+          <w:sz w:val="26"/>
+          <w:szCs w:val="26"/>
+        </w:rPr>
+        <w:t xml:space="preserve">10.22 Staff</w:t>
+      </w:r>
+    </w:p>
+    <w:p>
+      <w:pPr>
+        <w:pStyle w:val="Heading3"/>
+        <w:spacing w:after="80" w:before="200"/>
+      </w:pPr>
+      <w:r>
+        <w:rPr>
+          <w:rFonts w:ascii="Calibri" w:cs="Calibri" w:eastAsia="Calibri" w:hAnsi="Calibri"/>
+          <w:b/>
+          <w:bCs/>
+          <w:i w:val="false"/>
+          <w:iCs w:val="false"/>
+          <w:color w:val="000000"/>
+          <w:sz w:val="24"/>
+          <w:szCs w:val="24"/>
+        </w:rPr>
+        <w:t xml:space="preserve">What this page is</w:t>
+      </w:r>
+    </w:p>
+    <w:p>
+      <w:pPr>
+        <w:spacing w:after="160" w:before="0" w:line="276"/>
+        <w:jc w:val="left"/>
+      </w:pPr>
+      <w:r>
+        <w:rPr>
+          <w:rFonts w:ascii="Calibri" w:cs="Calibri" w:eastAsia="Calibri" w:hAnsi="Calibri"/>
+          <w:b w:val="false"/>
+          <w:bCs w:val="false"/>
+          <w:i w:val="false"/>
+          <w:iCs w:val="false"/>
+          <w:color w:val="000000"/>
+          <w:sz w:val="22"/>
+          <w:szCs w:val="22"/>
+        </w:rPr>
+        <w:t xml:space="preserve">Staff is the people list. Super Admin or a shop manager (if allowed) can add a person, pick their job, and pick their shop. Super Admin can lock a login.</w:t>
+      </w:r>
+    </w:p>
+    <w:p>
+      <w:pPr>
+        <w:pStyle w:val="Heading3"/>
+        <w:spacing w:after="80" w:before="200"/>
+      </w:pPr>
+      <w:r>
+        <w:rPr>
+          <w:rFonts w:ascii="Calibri" w:cs="Calibri" w:eastAsia="Calibri" w:hAnsi="Calibri"/>
+          <w:b/>
+          <w:bCs/>
+          <w:i w:val="false"/>
+          <w:iCs w:val="false"/>
+          <w:color w:val="000000"/>
+          <w:sz w:val="24"/>
+          <w:szCs w:val="24"/>
+        </w:rPr>
+        <w:t xml:space="preserve">Why it is here</w:t>
+      </w:r>
+    </w:p>
+    <w:p>
+      <w:pPr>
+        <w:spacing w:after="160" w:before="0" w:line="276"/>
+        <w:jc w:val="left"/>
+      </w:pPr>
+      <w:r>
+        <w:rPr>
+          <w:rFonts w:ascii="Calibri" w:cs="Calibri" w:eastAsia="Calibri" w:hAnsi="Calibri"/>
+          <w:b w:val="false"/>
+          <w:bCs w:val="false"/>
+          <w:i w:val="false"/>
+          <w:iCs w:val="false"/>
+          <w:color w:val="000000"/>
+          <w:sz w:val="22"/>
+          <w:szCs w:val="22"/>
+        </w:rPr>
+        <w:t xml:space="preserve">A person who leaves the company must not keep a key to the till.</w:t>
+      </w:r>
+    </w:p>
+    <w:p>
+      <w:pPr>
+        <w:pStyle w:val="Heading3"/>
+        <w:spacing w:after="80" w:before="200"/>
+      </w:pPr>
+      <w:r>
+        <w:rPr>
+          <w:rFonts w:ascii="Calibri" w:cs="Calibri" w:eastAsia="Calibri" w:hAnsi="Calibri"/>
+          <w:b/>
+          <w:bCs/>
+          <w:i w:val="false"/>
+          <w:iCs w:val="false"/>
+          <w:color w:val="000000"/>
+          <w:sz w:val="24"/>
+          <w:szCs w:val="24"/>
+        </w:rPr>
+        <w:t xml:space="preserve">A real shop story</w:t>
+      </w:r>
+    </w:p>
+    <w:p>
+      <w:pPr>
+        <w:spacing w:after="160" w:before="0" w:line="276"/>
+        <w:jc w:val="left"/>
+      </w:pPr>
+      <w:r>
+        <w:rPr>
+          <w:rFonts w:ascii="Calibri" w:cs="Calibri" w:eastAsia="Calibri" w:hAnsi="Calibri"/>
+          <w:b w:val="false"/>
+          <w:bCs w:val="false"/>
+          <w:i w:val="false"/>
+          <w:iCs w:val="false"/>
+          <w:color w:val="000000"/>
+          <w:sz w:val="22"/>
+          <w:szCs w:val="22"/>
+        </w:rPr>
+        <w:t xml:space="preserve">A new cashier starts at Challenge. Super Admin adds their work email, sets job to Cashier, sets shop to Challenge, and gives them a first password. After they sign in, Super Admin asks them to change it.</w:t>
+      </w:r>
+    </w:p>
+    <w:p>
+      <w:pPr>
+        <w:pStyle w:val="Heading3"/>
+        <w:spacing w:after="80" w:before="200"/>
+      </w:pPr>
+      <w:r>
+        <w:rPr>
+          <w:rFonts w:ascii="Calibri" w:cs="Calibri" w:eastAsia="Calibri" w:hAnsi="Calibri"/>
+          <w:b/>
+          <w:bCs/>
+          <w:i w:val="false"/>
+          <w:iCs w:val="false"/>
+          <w:color w:val="000000"/>
+          <w:sz w:val="24"/>
+          <w:szCs w:val="24"/>
+        </w:rPr>
+        <w:t xml:space="preserve">How to try it</w:t>
+      </w:r>
+    </w:p>
+    <w:p>
+      <w:pPr>
+        <w:spacing w:after="80" w:line="276"/>
+      </w:pPr>
+      <w:r>
+        <w:rPr>
+          <w:rFonts w:ascii="Calibri" w:cs="Calibri" w:eastAsia="Calibri" w:hAnsi="Calibri"/>
+          <w:b/>
+          <w:bCs/>
+          <w:i w:val="false"/>
+          <w:iCs w:val="false"/>
+          <w:color w:val="000000"/>
+          <w:sz w:val="22"/>
+          <w:szCs w:val="22"/>
+        </w:rPr>
+        <w:t xml:space="preserve">1. </w:t>
+      </w:r>
+      <w:r>
+        <w:rPr>
+          <w:rFonts w:ascii="Calibri" w:cs="Calibri" w:eastAsia="Calibri" w:hAnsi="Calibri"/>
+          <w:b w:val="false"/>
+          <w:bCs w:val="false"/>
+          <w:i w:val="false"/>
+          <w:iCs w:val="false"/>
+          <w:color w:val="000000"/>
+          <w:sz w:val="22"/>
+          <w:szCs w:val="22"/>
+        </w:rPr>
+        <w:t xml:space="preserve">Sign in as Super Admin.</w:t>
+      </w:r>
+    </w:p>
+    <w:p>
+      <w:pPr>
+        <w:spacing w:after="80" w:line="276"/>
+      </w:pPr>
+      <w:r>
+        <w:rPr>
+          <w:rFonts w:ascii="Calibri" w:cs="Calibri" w:eastAsia="Calibri" w:hAnsi="Calibri"/>
+          <w:b/>
+          <w:bCs/>
+          <w:i w:val="false"/>
+          <w:iCs w:val="false"/>
+          <w:color w:val="000000"/>
+          <w:sz w:val="22"/>
+          <w:szCs w:val="22"/>
+        </w:rPr>
+        <w:t xml:space="preserve">2. </w:t>
+      </w:r>
+      <w:r>
+        <w:rPr>
+          <w:rFonts w:ascii="Calibri" w:cs="Calibri" w:eastAsia="Calibri" w:hAnsi="Calibri"/>
+          <w:b w:val="false"/>
+          <w:bCs w:val="false"/>
+          <w:i w:val="false"/>
+          <w:iCs w:val="false"/>
+          <w:color w:val="000000"/>
+          <w:sz w:val="22"/>
+          <w:szCs w:val="22"/>
+        </w:rPr>
+        <w:t xml:space="preserve">Click Staff.</w:t>
+      </w:r>
+    </w:p>
+    <w:p>
+      <w:pPr>
+        <w:spacing w:after="80" w:line="276"/>
+      </w:pPr>
+      <w:r>
+        <w:rPr>
+          <w:rFonts w:ascii="Calibri" w:cs="Calibri" w:eastAsia="Calibri" w:hAnsi="Calibri"/>
+          <w:b/>
+          <w:bCs/>
+          <w:i w:val="false"/>
+          <w:iCs w:val="false"/>
+          <w:color w:val="000000"/>
+          <w:sz w:val="22"/>
+          <w:szCs w:val="22"/>
+        </w:rPr>
+        <w:t xml:space="preserve">3. </w:t>
+      </w:r>
+      <w:r>
+        <w:rPr>
+          <w:rFonts w:ascii="Calibri" w:cs="Calibri" w:eastAsia="Calibri" w:hAnsi="Calibri"/>
+          <w:b w:val="false"/>
+          <w:bCs w:val="false"/>
+          <w:i w:val="false"/>
+          <w:iCs w:val="false"/>
+          <w:color w:val="000000"/>
+          <w:sz w:val="22"/>
+          <w:szCs w:val="22"/>
+        </w:rPr>
+        <w:t xml:space="preserve">Read names, jobs, shops, and Active or Disabled.</w:t>
+      </w:r>
+    </w:p>
+    <w:p>
+      <w:pPr>
+        <w:spacing w:after="80" w:line="276"/>
+      </w:pPr>
+      <w:r>
+        <w:rPr>
+          <w:rFonts w:ascii="Calibri" w:cs="Calibri" w:eastAsia="Calibri" w:hAnsi="Calibri"/>
+          <w:b/>
+          <w:bCs/>
+          <w:i w:val="false"/>
+          <w:iCs w:val="false"/>
+          <w:color w:val="000000"/>
+          <w:sz w:val="22"/>
+          <w:szCs w:val="22"/>
+        </w:rPr>
+        <w:t xml:space="preserve">4. </w:t>
+      </w:r>
+      <w:r>
+        <w:rPr>
+          <w:rFonts w:ascii="Calibri" w:cs="Calibri" w:eastAsia="Calibri" w:hAnsi="Calibri"/>
+          <w:b w:val="false"/>
+          <w:bCs w:val="false"/>
+          <w:i w:val="false"/>
+          <w:iCs w:val="false"/>
+          <w:color w:val="000000"/>
+          <w:sz w:val="22"/>
+          <w:szCs w:val="22"/>
+        </w:rPr>
+        <w:t xml:space="preserve">Do not disable the only Super Admin during a test.</w:t>
+      </w:r>
+    </w:p>
+    <w:p>
+      <w:pPr>
+        <w:pStyle w:val="Heading3"/>
+        <w:spacing w:after="80" w:before="200"/>
+      </w:pPr>
+      <w:r>
+        <w:rPr>
+          <w:rFonts w:ascii="Calibri" w:cs="Calibri" w:eastAsia="Calibri" w:hAnsi="Calibri"/>
+          <w:b/>
+          <w:bCs/>
+          <w:i w:val="false"/>
+          <w:iCs w:val="false"/>
+          <w:color w:val="000000"/>
+          <w:sz w:val="24"/>
+          <w:szCs w:val="24"/>
+        </w:rPr>
+        <w:t xml:space="preserve">What you should see</w:t>
       </w:r>
     </w:p>
     <w:p>
@@ -17108,7 +17127,7 @@
           <w:sz w:val="22"/>
           <w:szCs w:val="22"/>
         </w:rPr>
-        <w:t xml:space="preserve">Challenge manager shows Challenge, Ibadan.</w:t>
+        <w:t xml:space="preserve">Each test person in section 12 appears.</w:t>
       </w:r>
     </w:p>
     <w:p>
@@ -17131,7 +17150,7 @@
           <w:sz w:val="22"/>
           <w:szCs w:val="22"/>
         </w:rPr>
-        <w:t xml:space="preserve">Disable stops that person from signing in.</w:t>
+        <w:t xml:space="preserve">Challenge manager shows Challenge, Ibadan.</w:t>
       </w:r>
     </w:p>
     <w:p>
@@ -17154,302 +17173,7 @@
           <w:sz w:val="22"/>
           <w:szCs w:val="22"/>
         </w:rPr>
-        <w:t xml:space="preserve">Restore lets them sign in again.</w:t>
-      </w:r>
-    </w:p>
-    <w:p>
-      <w:pPr>
-        <w:pStyle w:val="Heading2"/>
-        <w:spacing w:after="120" w:before="280"/>
-      </w:pPr>
-      <w:r>
-        <w:rPr>
-          <w:rFonts w:ascii="Calibri" w:cs="Calibri" w:eastAsia="Calibri" w:hAnsi="Calibri"/>
-          <w:b/>
-          <w:bCs/>
-          <w:i w:val="false"/>
-          <w:iCs w:val="false"/>
-          <w:color w:val="000000"/>
-          <w:sz w:val="26"/>
-          <w:szCs w:val="26"/>
-        </w:rPr>
-        <w:t xml:space="preserve">10.23 Who can see what</w:t>
-      </w:r>
-    </w:p>
-    <w:p>
-      <w:pPr>
-        <w:pStyle w:val="Heading3"/>
-        <w:spacing w:after="80" w:before="200"/>
-      </w:pPr>
-      <w:r>
-        <w:rPr>
-          <w:rFonts w:ascii="Calibri" w:cs="Calibri" w:eastAsia="Calibri" w:hAnsi="Calibri"/>
-          <w:b/>
-          <w:bCs/>
-          <w:i w:val="false"/>
-          <w:iCs w:val="false"/>
-          <w:color w:val="000000"/>
-          <w:sz w:val="24"/>
-          <w:szCs w:val="24"/>
-        </w:rPr>
-        <w:t xml:space="preserve">What this page is</w:t>
-      </w:r>
-    </w:p>
-    <w:p>
-      <w:pPr>
-        <w:spacing w:after="160" w:before="0" w:line="276"/>
-        <w:jc w:val="left"/>
-      </w:pPr>
-      <w:r>
-        <w:rPr>
-          <w:rFonts w:ascii="Calibri" w:cs="Calibri" w:eastAsia="Calibri" w:hAnsi="Calibri"/>
-          <w:b w:val="false"/>
-          <w:bCs w:val="false"/>
-          <w:i w:val="false"/>
-          <w:iCs w:val="false"/>
-          <w:color w:val="000000"/>
-          <w:sz w:val="22"/>
-          <w:szCs w:val="22"/>
-        </w:rPr>
-        <w:t xml:space="preserve">This page is Super Admin only. You tick the pages and the work for each job. Super Admin is not ticked here because Super Admin always has all rights.</w:t>
-      </w:r>
-    </w:p>
-    <w:p>
-      <w:pPr>
-        <w:pStyle w:val="Heading3"/>
-        <w:spacing w:after="80" w:before="200"/>
-      </w:pPr>
-      <w:r>
-        <w:rPr>
-          <w:rFonts w:ascii="Calibri" w:cs="Calibri" w:eastAsia="Calibri" w:hAnsi="Calibri"/>
-          <w:b/>
-          <w:bCs/>
-          <w:i w:val="false"/>
-          <w:iCs w:val="false"/>
-          <w:color w:val="000000"/>
-          <w:sz w:val="24"/>
-          <w:szCs w:val="24"/>
-        </w:rPr>
-        <w:t xml:space="preserve">Why it is here</w:t>
-      </w:r>
-    </w:p>
-    <w:p>
-      <w:pPr>
-        <w:spacing w:after="160" w:before="0" w:line="276"/>
-        <w:jc w:val="left"/>
-      </w:pPr>
-      <w:r>
-        <w:rPr>
-          <w:rFonts w:ascii="Calibri" w:cs="Calibri" w:eastAsia="Calibri" w:hAnsi="Calibri"/>
-          <w:b w:val="false"/>
-          <w:bCs w:val="false"/>
-          <w:i w:val="false"/>
-          <w:iCs w:val="false"/>
-          <w:color w:val="000000"/>
-          <w:sz w:val="22"/>
-          <w:szCs w:val="22"/>
-        </w:rPr>
-        <w:t xml:space="preserve">The CEO may want the accountant to see money but not Sell now. That should be a tick, not a phone call to Techvaults.</w:t>
-      </w:r>
-    </w:p>
-    <w:p>
-      <w:pPr>
-        <w:pStyle w:val="Heading3"/>
-        <w:spacing w:after="80" w:before="200"/>
-      </w:pPr>
-      <w:r>
-        <w:rPr>
-          <w:rFonts w:ascii="Calibri" w:cs="Calibri" w:eastAsia="Calibri" w:hAnsi="Calibri"/>
-          <w:b/>
-          <w:bCs/>
-          <w:i w:val="false"/>
-          <w:iCs w:val="false"/>
-          <w:color w:val="000000"/>
-          <w:sz w:val="24"/>
-          <w:szCs w:val="24"/>
-        </w:rPr>
-        <w:t xml:space="preserve">A real shop story</w:t>
-      </w:r>
-    </w:p>
-    <w:p>
-      <w:pPr>
-        <w:spacing w:after="160" w:before="0" w:line="276"/>
-        <w:jc w:val="left"/>
-      </w:pPr>
-      <w:r>
-        <w:rPr>
-          <w:rFonts w:ascii="Calibri" w:cs="Calibri" w:eastAsia="Calibri" w:hAnsi="Calibri"/>
-          <w:b w:val="false"/>
-          <w:bCs w:val="false"/>
-          <w:i w:val="false"/>
-          <w:iCs w:val="false"/>
-          <w:color w:val="000000"/>
-          <w:sz w:val="22"/>
-          <w:szCs w:val="22"/>
-        </w:rPr>
-        <w:t xml:space="preserve">The CEO asks that cashiers must not see Reports. Super Admin opens Who can see what, finds Cashier, unticks Reports, and saves. The cashier signs out and in. Reports is gone.</w:t>
-      </w:r>
-    </w:p>
-    <w:p>
-      <w:pPr>
-        <w:pStyle w:val="Heading3"/>
-        <w:spacing w:after="80" w:before="200"/>
-      </w:pPr>
-      <w:r>
-        <w:rPr>
-          <w:rFonts w:ascii="Calibri" w:cs="Calibri" w:eastAsia="Calibri" w:hAnsi="Calibri"/>
-          <w:b/>
-          <w:bCs/>
-          <w:i w:val="false"/>
-          <w:iCs w:val="false"/>
-          <w:color w:val="000000"/>
-          <w:sz w:val="24"/>
-          <w:szCs w:val="24"/>
-        </w:rPr>
-        <w:t xml:space="preserve">How to try it</w:t>
-      </w:r>
-    </w:p>
-    <w:p>
-      <w:pPr>
-        <w:spacing w:after="80" w:line="276"/>
-      </w:pPr>
-      <w:r>
-        <w:rPr>
-          <w:rFonts w:ascii="Calibri" w:cs="Calibri" w:eastAsia="Calibri" w:hAnsi="Calibri"/>
-          <w:b/>
-          <w:bCs/>
-          <w:i w:val="false"/>
-          <w:iCs w:val="false"/>
-          <w:color w:val="000000"/>
-          <w:sz w:val="22"/>
-          <w:szCs w:val="22"/>
-        </w:rPr>
-        <w:t xml:space="preserve">1. </w:t>
-      </w:r>
-      <w:r>
-        <w:rPr>
-          <w:rFonts w:ascii="Calibri" w:cs="Calibri" w:eastAsia="Calibri" w:hAnsi="Calibri"/>
-          <w:b w:val="false"/>
-          <w:bCs w:val="false"/>
-          <w:i w:val="false"/>
-          <w:iCs w:val="false"/>
-          <w:color w:val="000000"/>
-          <w:sz w:val="22"/>
-          <w:szCs w:val="22"/>
-        </w:rPr>
-        <w:t xml:space="preserve">Sign in as Super Admin.</w:t>
-      </w:r>
-    </w:p>
-    <w:p>
-      <w:pPr>
-        <w:spacing w:after="80" w:line="276"/>
-      </w:pPr>
-      <w:r>
-        <w:rPr>
-          <w:rFonts w:ascii="Calibri" w:cs="Calibri" w:eastAsia="Calibri" w:hAnsi="Calibri"/>
-          <w:b/>
-          <w:bCs/>
-          <w:i w:val="false"/>
-          <w:iCs w:val="false"/>
-          <w:color w:val="000000"/>
-          <w:sz w:val="22"/>
-          <w:szCs w:val="22"/>
-        </w:rPr>
-        <w:t xml:space="preserve">2. </w:t>
-      </w:r>
-      <w:r>
-        <w:rPr>
-          <w:rFonts w:ascii="Calibri" w:cs="Calibri" w:eastAsia="Calibri" w:hAnsi="Calibri"/>
-          <w:b w:val="false"/>
-          <w:bCs w:val="false"/>
-          <w:i w:val="false"/>
-          <w:iCs w:val="false"/>
-          <w:color w:val="000000"/>
-          <w:sz w:val="22"/>
-          <w:szCs w:val="22"/>
-        </w:rPr>
-        <w:t xml:space="preserve">Click Who can see what.</w:t>
-      </w:r>
-    </w:p>
-    <w:p>
-      <w:pPr>
-        <w:spacing w:after="80" w:line="276"/>
-      </w:pPr>
-      <w:r>
-        <w:rPr>
-          <w:rFonts w:ascii="Calibri" w:cs="Calibri" w:eastAsia="Calibri" w:hAnsi="Calibri"/>
-          <w:b/>
-          <w:bCs/>
-          <w:i w:val="false"/>
-          <w:iCs w:val="false"/>
-          <w:color w:val="000000"/>
-          <w:sz w:val="22"/>
-          <w:szCs w:val="22"/>
-        </w:rPr>
-        <w:t xml:space="preserve">3. </w:t>
-      </w:r>
-      <w:r>
-        <w:rPr>
-          <w:rFonts w:ascii="Calibri" w:cs="Calibri" w:eastAsia="Calibri" w:hAnsi="Calibri"/>
-          <w:b w:val="false"/>
-          <w:bCs w:val="false"/>
-          <w:i w:val="false"/>
-          <w:iCs w:val="false"/>
-          <w:color w:val="000000"/>
-          <w:sz w:val="22"/>
-          <w:szCs w:val="22"/>
-        </w:rPr>
-        <w:t xml:space="preserve">Open Cashier. Confirm Sell now is ticked and Goods on the way is not ticked unless you want it.</w:t>
-      </w:r>
-    </w:p>
-    <w:p>
-      <w:pPr>
-        <w:spacing w:after="80" w:line="276"/>
-      </w:pPr>
-      <w:r>
-        <w:rPr>
-          <w:rFonts w:ascii="Calibri" w:cs="Calibri" w:eastAsia="Calibri" w:hAnsi="Calibri"/>
-          <w:b/>
-          <w:bCs/>
-          <w:i w:val="false"/>
-          <w:iCs w:val="false"/>
-          <w:color w:val="000000"/>
-          <w:sz w:val="22"/>
-          <w:szCs w:val="22"/>
-        </w:rPr>
-        <w:t xml:space="preserve">4. </w:t>
-      </w:r>
-      <w:r>
-        <w:rPr>
-          <w:rFonts w:ascii="Calibri" w:cs="Calibri" w:eastAsia="Calibri" w:hAnsi="Calibri"/>
-          <w:b w:val="false"/>
-          <w:bCs w:val="false"/>
-          <w:i w:val="false"/>
-          <w:iCs w:val="false"/>
-          <w:color w:val="000000"/>
-          <w:sz w:val="22"/>
-          <w:szCs w:val="22"/>
-        </w:rPr>
-        <w:t xml:space="preserve">Save only if you mean to change a live rule. For a first read, do not untick things at random.</w:t>
-      </w:r>
-    </w:p>
-    <w:p>
-      <w:pPr>
-        <w:pStyle w:val="Heading3"/>
-        <w:spacing w:after="80" w:before="200"/>
-      </w:pPr>
-      <w:r>
-        <w:rPr>
-          <w:rFonts w:ascii="Calibri" w:cs="Calibri" w:eastAsia="Calibri" w:hAnsi="Calibri"/>
-          <w:b/>
-          <w:bCs/>
-          <w:i w:val="false"/>
-          <w:iCs w:val="false"/>
-          <w:color w:val="000000"/>
-          <w:sz w:val="24"/>
-          <w:szCs w:val="24"/>
-        </w:rPr>
-        <w:t xml:space="preserve">What you should see</w:t>
+        <w:t xml:space="preserve">Disable stops that person from signing in.</w:t>
       </w:r>
     </w:p>
     <w:p>
@@ -17472,7 +17196,302 @@
           <w:sz w:val="22"/>
           <w:szCs w:val="22"/>
         </w:rPr>
-        <w:t xml:space="preserve">CEO who opens this address is sent away. Only Super Admin may use it.</w:t>
+        <w:t xml:space="preserve">Restore lets them sign in again.</w:t>
+      </w:r>
+    </w:p>
+    <w:p>
+      <w:pPr>
+        <w:pStyle w:val="Heading2"/>
+        <w:spacing w:after="120" w:before="280"/>
+      </w:pPr>
+      <w:r>
+        <w:rPr>
+          <w:rFonts w:ascii="Calibri" w:cs="Calibri" w:eastAsia="Calibri" w:hAnsi="Calibri"/>
+          <w:b/>
+          <w:bCs/>
+          <w:i w:val="false"/>
+          <w:iCs w:val="false"/>
+          <w:color w:val="000000"/>
+          <w:sz w:val="26"/>
+          <w:szCs w:val="26"/>
+        </w:rPr>
+        <w:t xml:space="preserve">10.23 Who can see what</w:t>
+      </w:r>
+    </w:p>
+    <w:p>
+      <w:pPr>
+        <w:pStyle w:val="Heading3"/>
+        <w:spacing w:after="80" w:before="200"/>
+      </w:pPr>
+      <w:r>
+        <w:rPr>
+          <w:rFonts w:ascii="Calibri" w:cs="Calibri" w:eastAsia="Calibri" w:hAnsi="Calibri"/>
+          <w:b/>
+          <w:bCs/>
+          <w:i w:val="false"/>
+          <w:iCs w:val="false"/>
+          <w:color w:val="000000"/>
+          <w:sz w:val="24"/>
+          <w:szCs w:val="24"/>
+        </w:rPr>
+        <w:t xml:space="preserve">What this page is</w:t>
+      </w:r>
+    </w:p>
+    <w:p>
+      <w:pPr>
+        <w:spacing w:after="160" w:before="0" w:line="276"/>
+        <w:jc w:val="left"/>
+      </w:pPr>
+      <w:r>
+        <w:rPr>
+          <w:rFonts w:ascii="Calibri" w:cs="Calibri" w:eastAsia="Calibri" w:hAnsi="Calibri"/>
+          <w:b w:val="false"/>
+          <w:bCs w:val="false"/>
+          <w:i w:val="false"/>
+          <w:iCs w:val="false"/>
+          <w:color w:val="000000"/>
+          <w:sz w:val="22"/>
+          <w:szCs w:val="22"/>
+        </w:rPr>
+        <w:t xml:space="preserve">This page is Super Admin only. You tick the pages and the work for each job. Super Admin is not ticked here because Super Admin always has all rights.</w:t>
+      </w:r>
+    </w:p>
+    <w:p>
+      <w:pPr>
+        <w:pStyle w:val="Heading3"/>
+        <w:spacing w:after="80" w:before="200"/>
+      </w:pPr>
+      <w:r>
+        <w:rPr>
+          <w:rFonts w:ascii="Calibri" w:cs="Calibri" w:eastAsia="Calibri" w:hAnsi="Calibri"/>
+          <w:b/>
+          <w:bCs/>
+          <w:i w:val="false"/>
+          <w:iCs w:val="false"/>
+          <w:color w:val="000000"/>
+          <w:sz w:val="24"/>
+          <w:szCs w:val="24"/>
+        </w:rPr>
+        <w:t xml:space="preserve">Why it is here</w:t>
+      </w:r>
+    </w:p>
+    <w:p>
+      <w:pPr>
+        <w:spacing w:after="160" w:before="0" w:line="276"/>
+        <w:jc w:val="left"/>
+      </w:pPr>
+      <w:r>
+        <w:rPr>
+          <w:rFonts w:ascii="Calibri" w:cs="Calibri" w:eastAsia="Calibri" w:hAnsi="Calibri"/>
+          <w:b w:val="false"/>
+          <w:bCs w:val="false"/>
+          <w:i w:val="false"/>
+          <w:iCs w:val="false"/>
+          <w:color w:val="000000"/>
+          <w:sz w:val="22"/>
+          <w:szCs w:val="22"/>
+        </w:rPr>
+        <w:t xml:space="preserve">The CEO may want the accountant to see money but not Sell now. That should be a tick, not a phone call to Techvaults.</w:t>
+      </w:r>
+    </w:p>
+    <w:p>
+      <w:pPr>
+        <w:pStyle w:val="Heading3"/>
+        <w:spacing w:after="80" w:before="200"/>
+      </w:pPr>
+      <w:r>
+        <w:rPr>
+          <w:rFonts w:ascii="Calibri" w:cs="Calibri" w:eastAsia="Calibri" w:hAnsi="Calibri"/>
+          <w:b/>
+          <w:bCs/>
+          <w:i w:val="false"/>
+          <w:iCs w:val="false"/>
+          <w:color w:val="000000"/>
+          <w:sz w:val="24"/>
+          <w:szCs w:val="24"/>
+        </w:rPr>
+        <w:t xml:space="preserve">A real shop story</w:t>
+      </w:r>
+    </w:p>
+    <w:p>
+      <w:pPr>
+        <w:spacing w:after="160" w:before="0" w:line="276"/>
+        <w:jc w:val="left"/>
+      </w:pPr>
+      <w:r>
+        <w:rPr>
+          <w:rFonts w:ascii="Calibri" w:cs="Calibri" w:eastAsia="Calibri" w:hAnsi="Calibri"/>
+          <w:b w:val="false"/>
+          <w:bCs w:val="false"/>
+          <w:i w:val="false"/>
+          <w:iCs w:val="false"/>
+          <w:color w:val="000000"/>
+          <w:sz w:val="22"/>
+          <w:szCs w:val="22"/>
+        </w:rPr>
+        <w:t xml:space="preserve">The CEO asks that cashiers must not see Reports. Super Admin opens Who can see what, finds Cashier, unticks Reports, and saves. The cashier signs out and in. Reports is gone.</w:t>
+      </w:r>
+    </w:p>
+    <w:p>
+      <w:pPr>
+        <w:pStyle w:val="Heading3"/>
+        <w:spacing w:after="80" w:before="200"/>
+      </w:pPr>
+      <w:r>
+        <w:rPr>
+          <w:rFonts w:ascii="Calibri" w:cs="Calibri" w:eastAsia="Calibri" w:hAnsi="Calibri"/>
+          <w:b/>
+          <w:bCs/>
+          <w:i w:val="false"/>
+          <w:iCs w:val="false"/>
+          <w:color w:val="000000"/>
+          <w:sz w:val="24"/>
+          <w:szCs w:val="24"/>
+        </w:rPr>
+        <w:t xml:space="preserve">How to try it</w:t>
+      </w:r>
+    </w:p>
+    <w:p>
+      <w:pPr>
+        <w:spacing w:after="80" w:line="276"/>
+      </w:pPr>
+      <w:r>
+        <w:rPr>
+          <w:rFonts w:ascii="Calibri" w:cs="Calibri" w:eastAsia="Calibri" w:hAnsi="Calibri"/>
+          <w:b/>
+          <w:bCs/>
+          <w:i w:val="false"/>
+          <w:iCs w:val="false"/>
+          <w:color w:val="000000"/>
+          <w:sz w:val="22"/>
+          <w:szCs w:val="22"/>
+        </w:rPr>
+        <w:t xml:space="preserve">1. </w:t>
+      </w:r>
+      <w:r>
+        <w:rPr>
+          <w:rFonts w:ascii="Calibri" w:cs="Calibri" w:eastAsia="Calibri" w:hAnsi="Calibri"/>
+          <w:b w:val="false"/>
+          <w:bCs w:val="false"/>
+          <w:i w:val="false"/>
+          <w:iCs w:val="false"/>
+          <w:color w:val="000000"/>
+          <w:sz w:val="22"/>
+          <w:szCs w:val="22"/>
+        </w:rPr>
+        <w:t xml:space="preserve">Sign in as Super Admin.</w:t>
+      </w:r>
+    </w:p>
+    <w:p>
+      <w:pPr>
+        <w:spacing w:after="80" w:line="276"/>
+      </w:pPr>
+      <w:r>
+        <w:rPr>
+          <w:rFonts w:ascii="Calibri" w:cs="Calibri" w:eastAsia="Calibri" w:hAnsi="Calibri"/>
+          <w:b/>
+          <w:bCs/>
+          <w:i w:val="false"/>
+          <w:iCs w:val="false"/>
+          <w:color w:val="000000"/>
+          <w:sz w:val="22"/>
+          <w:szCs w:val="22"/>
+        </w:rPr>
+        <w:t xml:space="preserve">2. </w:t>
+      </w:r>
+      <w:r>
+        <w:rPr>
+          <w:rFonts w:ascii="Calibri" w:cs="Calibri" w:eastAsia="Calibri" w:hAnsi="Calibri"/>
+          <w:b w:val="false"/>
+          <w:bCs w:val="false"/>
+          <w:i w:val="false"/>
+          <w:iCs w:val="false"/>
+          <w:color w:val="000000"/>
+          <w:sz w:val="22"/>
+          <w:szCs w:val="22"/>
+        </w:rPr>
+        <w:t xml:space="preserve">Click Who can see what.</w:t>
+      </w:r>
+    </w:p>
+    <w:p>
+      <w:pPr>
+        <w:spacing w:after="80" w:line="276"/>
+      </w:pPr>
+      <w:r>
+        <w:rPr>
+          <w:rFonts w:ascii="Calibri" w:cs="Calibri" w:eastAsia="Calibri" w:hAnsi="Calibri"/>
+          <w:b/>
+          <w:bCs/>
+          <w:i w:val="false"/>
+          <w:iCs w:val="false"/>
+          <w:color w:val="000000"/>
+          <w:sz w:val="22"/>
+          <w:szCs w:val="22"/>
+        </w:rPr>
+        <w:t xml:space="preserve">3. </w:t>
+      </w:r>
+      <w:r>
+        <w:rPr>
+          <w:rFonts w:ascii="Calibri" w:cs="Calibri" w:eastAsia="Calibri" w:hAnsi="Calibri"/>
+          <w:b w:val="false"/>
+          <w:bCs w:val="false"/>
+          <w:i w:val="false"/>
+          <w:iCs w:val="false"/>
+          <w:color w:val="000000"/>
+          <w:sz w:val="22"/>
+          <w:szCs w:val="22"/>
+        </w:rPr>
+        <w:t xml:space="preserve">Open Cashier. Confirm Sell now is ticked and Goods on the way is not ticked unless you want it.</w:t>
+      </w:r>
+    </w:p>
+    <w:p>
+      <w:pPr>
+        <w:spacing w:after="80" w:line="276"/>
+      </w:pPr>
+      <w:r>
+        <w:rPr>
+          <w:rFonts w:ascii="Calibri" w:cs="Calibri" w:eastAsia="Calibri" w:hAnsi="Calibri"/>
+          <w:b/>
+          <w:bCs/>
+          <w:i w:val="false"/>
+          <w:iCs w:val="false"/>
+          <w:color w:val="000000"/>
+          <w:sz w:val="22"/>
+          <w:szCs w:val="22"/>
+        </w:rPr>
+        <w:t xml:space="preserve">4. </w:t>
+      </w:r>
+      <w:r>
+        <w:rPr>
+          <w:rFonts w:ascii="Calibri" w:cs="Calibri" w:eastAsia="Calibri" w:hAnsi="Calibri"/>
+          <w:b w:val="false"/>
+          <w:bCs w:val="false"/>
+          <w:i w:val="false"/>
+          <w:iCs w:val="false"/>
+          <w:color w:val="000000"/>
+          <w:sz w:val="22"/>
+          <w:szCs w:val="22"/>
+        </w:rPr>
+        <w:t xml:space="preserve">Save only if you mean to change a live rule. For a first read, do not untick things at random.</w:t>
+      </w:r>
+    </w:p>
+    <w:p>
+      <w:pPr>
+        <w:pStyle w:val="Heading3"/>
+        <w:spacing w:after="80" w:before="200"/>
+      </w:pPr>
+      <w:r>
+        <w:rPr>
+          <w:rFonts w:ascii="Calibri" w:cs="Calibri" w:eastAsia="Calibri" w:hAnsi="Calibri"/>
+          <w:b/>
+          <w:bCs/>
+          <w:i w:val="false"/>
+          <w:iCs w:val="false"/>
+          <w:color w:val="000000"/>
+          <w:sz w:val="24"/>
+          <w:szCs w:val="24"/>
+        </w:rPr>
+        <w:t xml:space="preserve">What you should see</w:t>
       </w:r>
     </w:p>
     <w:p>
@@ -17495,7 +17514,7 @@
           <w:sz w:val="22"/>
           <w:szCs w:val="22"/>
         </w:rPr>
-        <w:t xml:space="preserve">Ticks you save change that job on the next visit.</w:t>
+        <w:t xml:space="preserve">CEO who opens this address is sent away. Only Super Admin may use it.</w:t>
       </w:r>
     </w:p>
     <w:p>
@@ -17518,302 +17537,7 @@
           <w:sz w:val="22"/>
           <w:szCs w:val="22"/>
         </w:rPr>
-        <w:t xml:space="preserve">Super Admin cannot remove Super Admin rights here. That is by design.</w:t>
-      </w:r>
-    </w:p>
-    <w:p>
-      <w:pPr>
-        <w:pStyle w:val="Heading2"/>
-        <w:spacing w:after="120" w:before="280"/>
-      </w:pPr>
-      <w:r>
-        <w:rPr>
-          <w:rFonts w:ascii="Calibri" w:cs="Calibri" w:eastAsia="Calibri" w:hAnsi="Calibri"/>
-          <w:b/>
-          <w:bCs/>
-          <w:i w:val="false"/>
-          <w:iCs w:val="false"/>
-          <w:color w:val="000000"/>
-          <w:sz w:val="26"/>
-          <w:szCs w:val="26"/>
-        </w:rPr>
-        <w:t xml:space="preserve">10.24 Reports</w:t>
-      </w:r>
-    </w:p>
-    <w:p>
-      <w:pPr>
-        <w:pStyle w:val="Heading3"/>
-        <w:spacing w:after="80" w:before="200"/>
-      </w:pPr>
-      <w:r>
-        <w:rPr>
-          <w:rFonts w:ascii="Calibri" w:cs="Calibri" w:eastAsia="Calibri" w:hAnsi="Calibri"/>
-          <w:b/>
-          <w:bCs/>
-          <w:i w:val="false"/>
-          <w:iCs w:val="false"/>
-          <w:color w:val="000000"/>
-          <w:sz w:val="24"/>
-          <w:szCs w:val="24"/>
-        </w:rPr>
-        <w:t xml:space="preserve">What this page is</w:t>
-      </w:r>
-    </w:p>
-    <w:p>
-      <w:pPr>
-        <w:spacing w:after="160" w:before="0" w:line="276"/>
-        <w:jc w:val="left"/>
-      </w:pPr>
-      <w:r>
-        <w:rPr>
-          <w:rFonts w:ascii="Calibri" w:cs="Calibri" w:eastAsia="Calibri" w:hAnsi="Calibri"/>
-          <w:b w:val="false"/>
-          <w:bCs w:val="false"/>
-          <w:i w:val="false"/>
-          <w:iCs w:val="false"/>
-          <w:color w:val="000000"/>
-          <w:sz w:val="22"/>
-          <w:szCs w:val="22"/>
-        </w:rPr>
-        <w:t xml:space="preserve">Reports shows today’s real numbers: sales, money collected, stock value, swaps, returns, and who still owes. You can print the report or export sales as a file.</w:t>
-      </w:r>
-    </w:p>
-    <w:p>
-      <w:pPr>
-        <w:pStyle w:val="Heading3"/>
-        <w:spacing w:after="80" w:before="200"/>
-      </w:pPr>
-      <w:r>
-        <w:rPr>
-          <w:rFonts w:ascii="Calibri" w:cs="Calibri" w:eastAsia="Calibri" w:hAnsi="Calibri"/>
-          <w:b/>
-          <w:bCs/>
-          <w:i w:val="false"/>
-          <w:iCs w:val="false"/>
-          <w:color w:val="000000"/>
-          <w:sz w:val="24"/>
-          <w:szCs w:val="24"/>
-        </w:rPr>
-        <w:t xml:space="preserve">Why it is here</w:t>
-      </w:r>
-    </w:p>
-    <w:p>
-      <w:pPr>
-        <w:spacing w:after="160" w:before="0" w:line="276"/>
-        <w:jc w:val="left"/>
-      </w:pPr>
-      <w:r>
-        <w:rPr>
-          <w:rFonts w:ascii="Calibri" w:cs="Calibri" w:eastAsia="Calibri" w:hAnsi="Calibri"/>
-          <w:b w:val="false"/>
-          <w:bCs w:val="false"/>
-          <w:i w:val="false"/>
-          <w:iCs w:val="false"/>
-          <w:color w:val="000000"/>
-          <w:sz w:val="22"/>
-          <w:szCs w:val="22"/>
-        </w:rPr>
-        <w:t xml:space="preserve">Home is a snapshot. Reports is the pack you take to a meeting.</w:t>
-      </w:r>
-    </w:p>
-    <w:p>
-      <w:pPr>
-        <w:pStyle w:val="Heading3"/>
-        <w:spacing w:after="80" w:before="200"/>
-      </w:pPr>
-      <w:r>
-        <w:rPr>
-          <w:rFonts w:ascii="Calibri" w:cs="Calibri" w:eastAsia="Calibri" w:hAnsi="Calibri"/>
-          <w:b/>
-          <w:bCs/>
-          <w:i w:val="false"/>
-          <w:iCs w:val="false"/>
-          <w:color w:val="000000"/>
-          <w:sz w:val="24"/>
-          <w:szCs w:val="24"/>
-        </w:rPr>
-        <w:t xml:space="preserve">A real shop story</w:t>
-      </w:r>
-    </w:p>
-    <w:p>
-      <w:pPr>
-        <w:spacing w:after="160" w:before="0" w:line="276"/>
-        <w:jc w:val="left"/>
-      </w:pPr>
-      <w:r>
-        <w:rPr>
-          <w:rFonts w:ascii="Calibri" w:cs="Calibri" w:eastAsia="Calibri" w:hAnsi="Calibri"/>
-          <w:b w:val="false"/>
-          <w:bCs w:val="false"/>
-          <w:i w:val="false"/>
-          <w:iCs w:val="false"/>
-          <w:color w:val="000000"/>
-          <w:sz w:val="22"/>
-          <w:szCs w:val="22"/>
-        </w:rPr>
-        <w:t xml:space="preserve">Friday review. The CEO prints Reports. Iwo Road and Challenge are compared. Low stock items are listed. Nobody copies numbers from a notebook.</w:t>
-      </w:r>
-    </w:p>
-    <w:p>
-      <w:pPr>
-        <w:pStyle w:val="Heading3"/>
-        <w:spacing w:after="80" w:before="200"/>
-      </w:pPr>
-      <w:r>
-        <w:rPr>
-          <w:rFonts w:ascii="Calibri" w:cs="Calibri" w:eastAsia="Calibri" w:hAnsi="Calibri"/>
-          <w:b/>
-          <w:bCs/>
-          <w:i w:val="false"/>
-          <w:iCs w:val="false"/>
-          <w:color w:val="000000"/>
-          <w:sz w:val="24"/>
-          <w:szCs w:val="24"/>
-        </w:rPr>
-        <w:t xml:space="preserve">How to try it</w:t>
-      </w:r>
-    </w:p>
-    <w:p>
-      <w:pPr>
-        <w:spacing w:after="80" w:line="276"/>
-      </w:pPr>
-      <w:r>
-        <w:rPr>
-          <w:rFonts w:ascii="Calibri" w:cs="Calibri" w:eastAsia="Calibri" w:hAnsi="Calibri"/>
-          <w:b/>
-          <w:bCs/>
-          <w:i w:val="false"/>
-          <w:iCs w:val="false"/>
-          <w:color w:val="000000"/>
-          <w:sz w:val="22"/>
-          <w:szCs w:val="22"/>
-        </w:rPr>
-        <w:t xml:space="preserve">1. </w:t>
-      </w:r>
-      <w:r>
-        <w:rPr>
-          <w:rFonts w:ascii="Calibri" w:cs="Calibri" w:eastAsia="Calibri" w:hAnsi="Calibri"/>
-          <w:b w:val="false"/>
-          <w:bCs w:val="false"/>
-          <w:i w:val="false"/>
-          <w:iCs w:val="false"/>
-          <w:color w:val="000000"/>
-          <w:sz w:val="22"/>
-          <w:szCs w:val="22"/>
-        </w:rPr>
-        <w:t xml:space="preserve">Sign in as CEO.</w:t>
-      </w:r>
-    </w:p>
-    <w:p>
-      <w:pPr>
-        <w:spacing w:after="80" w:line="276"/>
-      </w:pPr>
-      <w:r>
-        <w:rPr>
-          <w:rFonts w:ascii="Calibri" w:cs="Calibri" w:eastAsia="Calibri" w:hAnsi="Calibri"/>
-          <w:b/>
-          <w:bCs/>
-          <w:i w:val="false"/>
-          <w:iCs w:val="false"/>
-          <w:color w:val="000000"/>
-          <w:sz w:val="22"/>
-          <w:szCs w:val="22"/>
-        </w:rPr>
-        <w:t xml:space="preserve">2. </w:t>
-      </w:r>
-      <w:r>
-        <w:rPr>
-          <w:rFonts w:ascii="Calibri" w:cs="Calibri" w:eastAsia="Calibri" w:hAnsi="Calibri"/>
-          <w:b w:val="false"/>
-          <w:bCs w:val="false"/>
-          <w:i w:val="false"/>
-          <w:iCs w:val="false"/>
-          <w:color w:val="000000"/>
-          <w:sz w:val="22"/>
-          <w:szCs w:val="22"/>
-        </w:rPr>
-        <w:t xml:space="preserve">Click Reports.</w:t>
-      </w:r>
-    </w:p>
-    <w:p>
-      <w:pPr>
-        <w:spacing w:after="80" w:line="276"/>
-      </w:pPr>
-      <w:r>
-        <w:rPr>
-          <w:rFonts w:ascii="Calibri" w:cs="Calibri" w:eastAsia="Calibri" w:hAnsi="Calibri"/>
-          <w:b/>
-          <w:bCs/>
-          <w:i w:val="false"/>
-          <w:iCs w:val="false"/>
-          <w:color w:val="000000"/>
-          <w:sz w:val="22"/>
-          <w:szCs w:val="22"/>
-        </w:rPr>
-        <w:t xml:space="preserve">3. </w:t>
-      </w:r>
-      <w:r>
-        <w:rPr>
-          <w:rFonts w:ascii="Calibri" w:cs="Calibri" w:eastAsia="Calibri" w:hAnsi="Calibri"/>
-          <w:b w:val="false"/>
-          <w:bCs w:val="false"/>
-          <w:i w:val="false"/>
-          <w:iCs w:val="false"/>
-          <w:color w:val="000000"/>
-          <w:sz w:val="22"/>
-          <w:szCs w:val="22"/>
-        </w:rPr>
-        <w:t xml:space="preserve">Read sales, collected money, and stock.</w:t>
-      </w:r>
-    </w:p>
-    <w:p>
-      <w:pPr>
-        <w:spacing w:after="80" w:line="276"/>
-      </w:pPr>
-      <w:r>
-        <w:rPr>
-          <w:rFonts w:ascii="Calibri" w:cs="Calibri" w:eastAsia="Calibri" w:hAnsi="Calibri"/>
-          <w:b/>
-          <w:bCs/>
-          <w:i w:val="false"/>
-          <w:iCs w:val="false"/>
-          <w:color w:val="000000"/>
-          <w:sz w:val="22"/>
-          <w:szCs w:val="22"/>
-        </w:rPr>
-        <w:t xml:space="preserve">4. </w:t>
-      </w:r>
-      <w:r>
-        <w:rPr>
-          <w:rFonts w:ascii="Calibri" w:cs="Calibri" w:eastAsia="Calibri" w:hAnsi="Calibri"/>
-          <w:b w:val="false"/>
-          <w:bCs w:val="false"/>
-          <w:i w:val="false"/>
-          <w:iCs w:val="false"/>
-          <w:color w:val="000000"/>
-          <w:sz w:val="22"/>
-          <w:szCs w:val="22"/>
-        </w:rPr>
-        <w:t xml:space="preserve">Click Print report. Cancel if you do not need paper.</w:t>
-      </w:r>
-    </w:p>
-    <w:p>
-      <w:pPr>
-        <w:pStyle w:val="Heading3"/>
-        <w:spacing w:after="80" w:before="200"/>
-      </w:pPr>
-      <w:r>
-        <w:rPr>
-          <w:rFonts w:ascii="Calibri" w:cs="Calibri" w:eastAsia="Calibri" w:hAnsi="Calibri"/>
-          <w:b/>
-          <w:bCs/>
-          <w:i w:val="false"/>
-          <w:iCs w:val="false"/>
-          <w:color w:val="000000"/>
-          <w:sz w:val="24"/>
-          <w:szCs w:val="24"/>
-        </w:rPr>
-        <w:t xml:space="preserve">What you should see</w:t>
+        <w:t xml:space="preserve">Ticks you save change that job on the next visit.</w:t>
       </w:r>
     </w:p>
     <w:p>
@@ -17836,7 +17560,402 @@
           <w:sz w:val="22"/>
           <w:szCs w:val="22"/>
         </w:rPr>
+        <w:t xml:space="preserve">Super Admin cannot remove Super Admin rights here. That is by design.</w:t>
+      </w:r>
+    </w:p>
+    <w:p>
+      <w:pPr>
+        <w:pStyle w:val="Heading2"/>
+        <w:spacing w:after="120" w:before="280"/>
+      </w:pPr>
+      <w:r>
+        <w:rPr>
+          <w:rFonts w:ascii="Calibri" w:cs="Calibri" w:eastAsia="Calibri" w:hAnsi="Calibri"/>
+          <w:b/>
+          <w:bCs/>
+          <w:i w:val="false"/>
+          <w:iCs w:val="false"/>
+          <w:color w:val="000000"/>
+          <w:sz w:val="26"/>
+          <w:szCs w:val="26"/>
+        </w:rPr>
+        <w:t xml:space="preserve">10.24 Reports</w:t>
+      </w:r>
+    </w:p>
+    <w:p>
+      <w:pPr>
+        <w:pStyle w:val="Heading3"/>
+        <w:spacing w:after="80" w:before="200"/>
+      </w:pPr>
+      <w:r>
+        <w:rPr>
+          <w:rFonts w:ascii="Calibri" w:cs="Calibri" w:eastAsia="Calibri" w:hAnsi="Calibri"/>
+          <w:b/>
+          <w:bCs/>
+          <w:i w:val="false"/>
+          <w:iCs w:val="false"/>
+          <w:color w:val="000000"/>
+          <w:sz w:val="24"/>
+          <w:szCs w:val="24"/>
+        </w:rPr>
+        <w:t xml:space="preserve">What this page is</w:t>
+      </w:r>
+    </w:p>
+    <w:p>
+      <w:pPr>
+        <w:spacing w:after="160" w:before="0" w:line="276"/>
+        <w:jc w:val="left"/>
+      </w:pPr>
+      <w:r>
+        <w:rPr>
+          <w:rFonts w:ascii="Calibri" w:cs="Calibri" w:eastAsia="Calibri" w:hAnsi="Calibri"/>
+          <w:b w:val="false"/>
+          <w:bCs w:val="false"/>
+          <w:i w:val="false"/>
+          <w:iCs w:val="false"/>
+          <w:color w:val="000000"/>
+          <w:sz w:val="22"/>
+          <w:szCs w:val="22"/>
+        </w:rPr>
+        <w:t xml:space="preserve">Reports shows sales, money collected, stock value, swaps, returns, and who still owes, for every completed record you can see. On screen it is a dashboard. Print or download gives a branded management report with the ab mark, shop books, people who still owe, unpaid supplier invoices, and low stock. The pack does not change any invoice.</w:t>
+      </w:r>
+    </w:p>
+    <w:p>
+      <w:pPr>
+        <w:pStyle w:val="Heading3"/>
+        <w:spacing w:after="80" w:before="200"/>
+      </w:pPr>
+      <w:r>
+        <w:rPr>
+          <w:rFonts w:ascii="Calibri" w:cs="Calibri" w:eastAsia="Calibri" w:hAnsi="Calibri"/>
+          <w:b/>
+          <w:bCs/>
+          <w:i w:val="false"/>
+          <w:iCs w:val="false"/>
+          <w:color w:val="000000"/>
+          <w:sz w:val="24"/>
+          <w:szCs w:val="24"/>
+        </w:rPr>
+        <w:t xml:space="preserve">Why it is here</w:t>
+      </w:r>
+    </w:p>
+    <w:p>
+      <w:pPr>
+        <w:spacing w:after="160" w:before="0" w:line="276"/>
+        <w:jc w:val="left"/>
+      </w:pPr>
+      <w:r>
+        <w:rPr>
+          <w:rFonts w:ascii="Calibri" w:cs="Calibri" w:eastAsia="Calibri" w:hAnsi="Calibri"/>
+          <w:b w:val="false"/>
+          <w:bCs w:val="false"/>
+          <w:i w:val="false"/>
+          <w:iCs w:val="false"/>
+          <w:color w:val="000000"/>
+          <w:sz w:val="22"/>
+          <w:szCs w:val="22"/>
+        </w:rPr>
+        <w:t xml:space="preserve">Home is a snapshot. Reports is the pack you take to a meeting. It must look like a company paper, not a screen dump with buttons.</w:t>
+      </w:r>
+    </w:p>
+    <w:p>
+      <w:pPr>
+        <w:pStyle w:val="Heading3"/>
+        <w:spacing w:after="80" w:before="200"/>
+      </w:pPr>
+      <w:r>
+        <w:rPr>
+          <w:rFonts w:ascii="Calibri" w:cs="Calibri" w:eastAsia="Calibri" w:hAnsi="Calibri"/>
+          <w:b/>
+          <w:bCs/>
+          <w:i w:val="false"/>
+          <w:iCs w:val="false"/>
+          <w:color w:val="000000"/>
+          <w:sz w:val="24"/>
+          <w:szCs w:val="24"/>
+        </w:rPr>
+        <w:t xml:space="preserve">A real shop story</w:t>
+      </w:r>
+    </w:p>
+    <w:p>
+      <w:pPr>
+        <w:spacing w:after="160" w:before="0" w:line="276"/>
+        <w:jc w:val="left"/>
+      </w:pPr>
+      <w:r>
+        <w:rPr>
+          <w:rFonts w:ascii="Calibri" w:cs="Calibri" w:eastAsia="Calibri" w:hAnsi="Calibri"/>
+          <w:b w:val="false"/>
+          <w:bCs w:val="false"/>
+          <w:i w:val="false"/>
+          <w:iCs w:val="false"/>
+          <w:color w:val="000000"/>
+          <w:sz w:val="22"/>
+          <w:szCs w:val="22"/>
+        </w:rPr>
+        <w:t xml:space="preserve">Friday review. The CEO opens Reports, then downloads the branded PDF. Iwo Road and Challenge sit on one page. Low stock is listed. The Check the books button is not on the paper. Nobody copies numbers from a notebook.</w:t>
+      </w:r>
+    </w:p>
+    <w:p>
+      <w:pPr>
+        <w:pStyle w:val="Heading3"/>
+        <w:spacing w:after="80" w:before="200"/>
+      </w:pPr>
+      <w:r>
+        <w:rPr>
+          <w:rFonts w:ascii="Calibri" w:cs="Calibri" w:eastAsia="Calibri" w:hAnsi="Calibri"/>
+          <w:b/>
+          <w:bCs/>
+          <w:i w:val="false"/>
+          <w:iCs w:val="false"/>
+          <w:color w:val="000000"/>
+          <w:sz w:val="24"/>
+          <w:szCs w:val="24"/>
+        </w:rPr>
+        <w:t xml:space="preserve">How to try it</w:t>
+      </w:r>
+    </w:p>
+    <w:p>
+      <w:pPr>
+        <w:spacing w:after="80" w:line="276"/>
+      </w:pPr>
+      <w:r>
+        <w:rPr>
+          <w:rFonts w:ascii="Calibri" w:cs="Calibri" w:eastAsia="Calibri" w:hAnsi="Calibri"/>
+          <w:b/>
+          <w:bCs/>
+          <w:i w:val="false"/>
+          <w:iCs w:val="false"/>
+          <w:color w:val="000000"/>
+          <w:sz w:val="22"/>
+          <w:szCs w:val="22"/>
+        </w:rPr>
+        <w:t xml:space="preserve">1. </w:t>
+      </w:r>
+      <w:r>
+        <w:rPr>
+          <w:rFonts w:ascii="Calibri" w:cs="Calibri" w:eastAsia="Calibri" w:hAnsi="Calibri"/>
+          <w:b w:val="false"/>
+          <w:bCs w:val="false"/>
+          <w:i w:val="false"/>
+          <w:iCs w:val="false"/>
+          <w:color w:val="000000"/>
+          <w:sz w:val="22"/>
+          <w:szCs w:val="22"/>
+        </w:rPr>
+        <w:t xml:space="preserve">Sign in as CEO.</w:t>
+      </w:r>
+    </w:p>
+    <w:p>
+      <w:pPr>
+        <w:spacing w:after="80" w:line="276"/>
+      </w:pPr>
+      <w:r>
+        <w:rPr>
+          <w:rFonts w:ascii="Calibri" w:cs="Calibri" w:eastAsia="Calibri" w:hAnsi="Calibri"/>
+          <w:b/>
+          <w:bCs/>
+          <w:i w:val="false"/>
+          <w:iCs w:val="false"/>
+          <w:color w:val="000000"/>
+          <w:sz w:val="22"/>
+          <w:szCs w:val="22"/>
+        </w:rPr>
+        <w:t xml:space="preserve">2. </w:t>
+      </w:r>
+      <w:r>
+        <w:rPr>
+          <w:rFonts w:ascii="Calibri" w:cs="Calibri" w:eastAsia="Calibri" w:hAnsi="Calibri"/>
+          <w:b w:val="false"/>
+          <w:bCs w:val="false"/>
+          <w:i w:val="false"/>
+          <w:iCs w:val="false"/>
+          <w:color w:val="000000"/>
+          <w:sz w:val="22"/>
+          <w:szCs w:val="22"/>
+        </w:rPr>
+        <w:t xml:space="preserve">Click Reports.</w:t>
+      </w:r>
+    </w:p>
+    <w:p>
+      <w:pPr>
+        <w:spacing w:after="80" w:line="276"/>
+      </w:pPr>
+      <w:r>
+        <w:rPr>
+          <w:rFonts w:ascii="Calibri" w:cs="Calibri" w:eastAsia="Calibri" w:hAnsi="Calibri"/>
+          <w:b/>
+          <w:bCs/>
+          <w:i w:val="false"/>
+          <w:iCs w:val="false"/>
+          <w:color w:val="000000"/>
+          <w:sz w:val="22"/>
+          <w:szCs w:val="22"/>
+        </w:rPr>
+        <w:t xml:space="preserve">3. </w:t>
+      </w:r>
+      <w:r>
+        <w:rPr>
+          <w:rFonts w:ascii="Calibri" w:cs="Calibri" w:eastAsia="Calibri" w:hAnsi="Calibri"/>
+          <w:b w:val="false"/>
+          <w:bCs w:val="false"/>
+          <w:i w:val="false"/>
+          <w:iCs w:val="false"/>
+          <w:color w:val="000000"/>
+          <w:sz w:val="22"/>
+          <w:szCs w:val="22"/>
+        </w:rPr>
+        <w:t xml:space="preserve">Read sales, collected money, and stock on the screen.</w:t>
+      </w:r>
+    </w:p>
+    <w:p>
+      <w:pPr>
+        <w:spacing w:after="80" w:line="276"/>
+      </w:pPr>
+      <w:r>
+        <w:rPr>
+          <w:rFonts w:ascii="Calibri" w:cs="Calibri" w:eastAsia="Calibri" w:hAnsi="Calibri"/>
+          <w:b/>
+          <w:bCs/>
+          <w:i w:val="false"/>
+          <w:iCs w:val="false"/>
+          <w:color w:val="000000"/>
+          <w:sz w:val="22"/>
+          <w:szCs w:val="22"/>
+        </w:rPr>
+        <w:t xml:space="preserve">4. </w:t>
+      </w:r>
+      <w:r>
+        <w:rPr>
+          <w:rFonts w:ascii="Calibri" w:cs="Calibri" w:eastAsia="Calibri" w:hAnsi="Calibri"/>
+          <w:b w:val="false"/>
+          <w:bCs w:val="false"/>
+          <w:i w:val="false"/>
+          <w:iCs w:val="false"/>
+          <w:color w:val="000000"/>
+          <w:sz w:val="22"/>
+          <w:szCs w:val="22"/>
+        </w:rPr>
+        <w:t xml:space="preserve">Click Download branded PDF. Open the file and confirm the ab mark and NGN amounts.</w:t>
+      </w:r>
+    </w:p>
+    <w:p>
+      <w:pPr>
+        <w:spacing w:after="80" w:line="276"/>
+      </w:pPr>
+      <w:r>
+        <w:rPr>
+          <w:rFonts w:ascii="Calibri" w:cs="Calibri" w:eastAsia="Calibri" w:hAnsi="Calibri"/>
+          <w:b/>
+          <w:bCs/>
+          <w:i w:val="false"/>
+          <w:iCs w:val="false"/>
+          <w:color w:val="000000"/>
+          <w:sz w:val="22"/>
+          <w:szCs w:val="22"/>
+        </w:rPr>
+        <w:t xml:space="preserve">5. </w:t>
+      </w:r>
+      <w:r>
+        <w:rPr>
+          <w:rFonts w:ascii="Calibri" w:cs="Calibri" w:eastAsia="Calibri" w:hAnsi="Calibri"/>
+          <w:b w:val="false"/>
+          <w:bCs w:val="false"/>
+          <w:i w:val="false"/>
+          <w:iCs w:val="false"/>
+          <w:color w:val="000000"/>
+          <w:sz w:val="22"/>
+          <w:szCs w:val="22"/>
+        </w:rPr>
+        <w:t xml:space="preserve">Click Print / Save PDF. Confirm the paper has the blue header and no buttons. You may cancel after the preview.</w:t>
+      </w:r>
+    </w:p>
+    <w:p>
+      <w:pPr>
+        <w:pStyle w:val="Heading3"/>
+        <w:spacing w:after="80" w:before="200"/>
+      </w:pPr>
+      <w:r>
+        <w:rPr>
+          <w:rFonts w:ascii="Calibri" w:cs="Calibri" w:eastAsia="Calibri" w:hAnsi="Calibri"/>
+          <w:b/>
+          <w:bCs/>
+          <w:i w:val="false"/>
+          <w:iCs w:val="false"/>
+          <w:color w:val="000000"/>
+          <w:sz w:val="24"/>
+          <w:szCs w:val="24"/>
+        </w:rPr>
+        <w:t xml:space="preserve">What you should see</w:t>
+      </w:r>
+    </w:p>
+    <w:p>
+      <w:pPr>
+        <w:pStyle w:val="ListParagraph"/>
+        <w:numPr>
+          <w:ilvl w:val="0"/>
+          <w:numId w:val="2"/>
+        </w:numPr>
+        <w:spacing w:after="80" w:line="276"/>
+      </w:pPr>
+      <w:r>
+        <w:rPr>
+          <w:rFonts w:ascii="Calibri" w:cs="Calibri" w:eastAsia="Calibri" w:hAnsi="Calibri"/>
+          <w:b w:val="false"/>
+          <w:bCs w:val="false"/>
+          <w:i w:val="false"/>
+          <w:iCs w:val="false"/>
+          <w:color w:val="000000"/>
+          <w:sz w:val="22"/>
+          <w:szCs w:val="22"/>
+        </w:rPr>
         <w:t xml:space="preserve">Numbers match the shops you are allowed to see.</w:t>
+      </w:r>
+    </w:p>
+    <w:p>
+      <w:pPr>
+        <w:pStyle w:val="ListParagraph"/>
+        <w:numPr>
+          <w:ilvl w:val="0"/>
+          <w:numId w:val="2"/>
+        </w:numPr>
+        <w:spacing w:after="80" w:line="276"/>
+      </w:pPr>
+      <w:r>
+        <w:rPr>
+          <w:rFonts w:ascii="Calibri" w:cs="Calibri" w:eastAsia="Calibri" w:hAnsi="Calibri"/>
+          <w:b w:val="false"/>
+          <w:bCs w:val="false"/>
+          <w:i w:val="false"/>
+          <w:iCs w:val="false"/>
+          <w:color w:val="000000"/>
+          <w:sz w:val="22"/>
+          <w:szCs w:val="22"/>
+        </w:rPr>
+        <w:t xml:space="preserve">The printed pack has the ab mark, a report number starting with RP-, shop books, and sign-off footer.</w:t>
+      </w:r>
+    </w:p>
+    <w:p>
+      <w:pPr>
+        <w:pStyle w:val="ListParagraph"/>
+        <w:numPr>
+          <w:ilvl w:val="0"/>
+          <w:numId w:val="2"/>
+        </w:numPr>
+        <w:spacing w:after="80" w:line="276"/>
+      </w:pPr>
+      <w:r>
+        <w:rPr>
+          <w:rFonts w:ascii="Calibri" w:cs="Calibri" w:eastAsia="Calibri" w:hAnsi="Calibri"/>
+          <w:b w:val="false"/>
+          <w:bCs w:val="false"/>
+          <w:i w:val="false"/>
+          <w:iCs w:val="false"/>
+          <w:color w:val="000000"/>
+          <w:sz w:val="22"/>
+          <w:szCs w:val="22"/>
+        </w:rPr>
+        <w:t xml:space="preserve">Check the books, Print, and CSV buttons do not appear on the printed paper.</w:t>
       </w:r>
     </w:p>
     <w:p>
@@ -26356,7 +26475,7 @@
                 <w:sz w:val="20"/>
                 <w:szCs w:val="20"/>
               </w:rPr>
-              <w:t xml:space="preserve">PDF has the ab mark and sign-off lines. CSV opens in Excel with the same sections.</w:t>
+              <w:t xml:space="preserve">PDF has the ab mark, NGN amounts, and sign-off lines. CSV opens in Excel with the same sections.</w:t>
             </w:r>
           </w:p>
         </w:tc>
@@ -26510,6 +26629,159 @@
                 <w:szCs w:val="20"/>
               </w:rPr>
               <w:t xml:space="preserve">You can add numbers. No invoice or close is created.</w:t>
+            </w:r>
+          </w:p>
+        </w:tc>
+      </w:tr>
+      <w:tr>
+        <w:trPr>
+          <w:trHeight w:val="320" w:hRule="atLeast"/>
+        </w:trPr>
+        <w:tc>
+          <w:tcPr>
+            <w:tcW w:type="dxa" w:w="600"/>
+            <w:tcBorders>
+              <w:top w:val="single" w:color="000000" w:sz="8"/>
+              <w:left w:val="single" w:color="000000" w:sz="8"/>
+              <w:bottom w:val="single" w:color="000000" w:sz="8"/>
+              <w:right w:val="single" w:color="000000" w:sz="8"/>
+            </w:tcBorders>
+            <w:shd w:fill="F7F7F7" w:color="F7F7F7" w:val="clear"/>
+            <w:tcMar>
+              <w:top w:type="dxa" w:w="60"/>
+              <w:left w:type="dxa" w:w="80"/>
+              <w:bottom w:type="dxa" w:w="60"/>
+              <w:right w:type="dxa" w:w="80"/>
+            </w:tcMar>
+            <w:vAlign w:val="center"/>
+          </w:tcPr>
+          <w:p>
+            <w:pPr>
+              <w:jc w:val="left"/>
+            </w:pPr>
+            <w:r>
+              <w:rPr>
+                <w:rFonts w:ascii="Calibri" w:cs="Calibri" w:eastAsia="Calibri" w:hAnsi="Calibri"/>
+                <w:b w:val="false"/>
+                <w:bCs w:val="false"/>
+                <w:i w:val="false"/>
+                <w:iCs w:val="false"/>
+                <w:color w:val="000000"/>
+                <w:sz w:val="20"/>
+                <w:szCs w:val="20"/>
+              </w:rPr>
+              <w:t xml:space="preserve">26</w:t>
+            </w:r>
+          </w:p>
+        </w:tc>
+        <w:tc>
+          <w:tcPr>
+            <w:tcW w:type="dxa" w:w="2800"/>
+            <w:tcBorders>
+              <w:top w:val="single" w:color="000000" w:sz="8"/>
+              <w:left w:val="single" w:color="000000" w:sz="8"/>
+              <w:bottom w:val="single" w:color="000000" w:sz="8"/>
+              <w:right w:val="single" w:color="000000" w:sz="8"/>
+            </w:tcBorders>
+            <w:shd w:fill="F7F7F7" w:color="F7F7F7" w:val="clear"/>
+            <w:tcMar>
+              <w:top w:type="dxa" w:w="60"/>
+              <w:left w:type="dxa" w:w="80"/>
+              <w:bottom w:type="dxa" w:w="60"/>
+              <w:right w:type="dxa" w:w="80"/>
+            </w:tcMar>
+            <w:vAlign w:val="center"/>
+          </w:tcPr>
+          <w:p>
+            <w:pPr>
+              <w:jc w:val="left"/>
+            </w:pPr>
+            <w:r>
+              <w:rPr>
+                <w:rFonts w:ascii="Calibri" w:cs="Calibri" w:eastAsia="Calibri" w:hAnsi="Calibri"/>
+                <w:b w:val="false"/>
+                <w:bCs w:val="false"/>
+                <w:i w:val="false"/>
+                <w:iCs w:val="false"/>
+                <w:color w:val="000000"/>
+                <w:sz w:val="20"/>
+                <w:szCs w:val="20"/>
+              </w:rPr>
+              <w:t xml:space="preserve">Reports print looks like a company paper</w:t>
+            </w:r>
+          </w:p>
+        </w:tc>
+        <w:tc>
+          <w:tcPr>
+            <w:tcW w:type="dxa" w:w="2600"/>
+            <w:tcBorders>
+              <w:top w:val="single" w:color="000000" w:sz="8"/>
+              <w:left w:val="single" w:color="000000" w:sz="8"/>
+              <w:bottom w:val="single" w:color="000000" w:sz="8"/>
+              <w:right w:val="single" w:color="000000" w:sz="8"/>
+            </w:tcBorders>
+            <w:shd w:fill="F7F7F7" w:color="F7F7F7" w:val="clear"/>
+            <w:tcMar>
+              <w:top w:type="dxa" w:w="60"/>
+              <w:left w:type="dxa" w:w="80"/>
+              <w:bottom w:type="dxa" w:w="60"/>
+              <w:right w:type="dxa" w:w="80"/>
+            </w:tcMar>
+            <w:vAlign w:val="center"/>
+          </w:tcPr>
+          <w:p>
+            <w:pPr>
+              <w:jc w:val="left"/>
+            </w:pPr>
+            <w:r>
+              <w:rPr>
+                <w:rFonts w:ascii="Calibri" w:cs="Calibri" w:eastAsia="Calibri" w:hAnsi="Calibri"/>
+                <w:b w:val="false"/>
+                <w:bCs w:val="false"/>
+                <w:i w:val="false"/>
+                <w:iCs w:val="false"/>
+                <w:color w:val="000000"/>
+                <w:sz w:val="20"/>
+                <w:szCs w:val="20"/>
+              </w:rPr>
+              <w:t xml:space="preserve">ceo@abutwins.com</w:t>
+            </w:r>
+          </w:p>
+        </w:tc>
+        <w:tc>
+          <w:tcPr>
+            <w:tcW w:type="dxa" w:w="3360"/>
+            <w:tcBorders>
+              <w:top w:val="single" w:color="000000" w:sz="8"/>
+              <w:left w:val="single" w:color="000000" w:sz="8"/>
+              <w:bottom w:val="single" w:color="000000" w:sz="8"/>
+              <w:right w:val="single" w:color="000000" w:sz="8"/>
+            </w:tcBorders>
+            <w:shd w:fill="F7F7F7" w:color="F7F7F7" w:val="clear"/>
+            <w:tcMar>
+              <w:top w:type="dxa" w:w="60"/>
+              <w:left w:type="dxa" w:w="80"/>
+              <w:bottom w:type="dxa" w:w="60"/>
+              <w:right w:type="dxa" w:w="80"/>
+            </w:tcMar>
+            <w:vAlign w:val="center"/>
+          </w:tcPr>
+          <w:p>
+            <w:pPr>
+              <w:jc w:val="left"/>
+            </w:pPr>
+            <w:r>
+              <w:rPr>
+                <w:rFonts w:ascii="Calibri" w:cs="Calibri" w:eastAsia="Calibri" w:hAnsi="Calibri"/>
+                <w:b w:val="false"/>
+                <w:bCs w:val="false"/>
+                <w:i w:val="false"/>
+                <w:iCs w:val="false"/>
+                <w:color w:val="000000"/>
+                <w:sz w:val="20"/>
+                <w:szCs w:val="20"/>
+              </w:rPr>
+              <w:t xml:space="preserve">PDF has the ab mark, RP- number, shop books, and no buttons.</w:t>
             </w:r>
           </w:p>
         </w:tc>

</xml_diff>

<commit_message>
Show full shop words instead of cutting them short with three dots.
Co-authored-by: Cursor <cursoragent@cursor.com>
</commit_message>
<xml_diff>
--- a/docs/Abu-Twins-Shop-System-User-Guide.docx
+++ b/docs/Abu-Twins-Shop-System-User-Guide.docx
@@ -459,7 +459,7 @@
                 <w:sz w:val="20"/>
                 <w:szCs w:val="20"/>
               </w:rPr>
-              <w:t xml:space="preserve">1.3</w:t>
+              <w:t xml:space="preserve">1.4</w:t>
             </w:r>
           </w:p>
         </w:tc>
@@ -533,7 +533,7 @@
                 <w:sz w:val="20"/>
                 <w:szCs w:val="20"/>
               </w:rPr>
-              <w:t xml:space="preserve">Updated: branded reports print and PDF</w:t>
+              <w:t xml:space="preserve">Updated: full words on buttons, no three-dot cut-offs</w:t>
             </w:r>
           </w:p>
         </w:tc>
@@ -750,6 +750,25 @@
           <w:szCs w:val="22"/>
         </w:rPr>
         <w:t xml:space="preserve">Version 1.3 makes Reports print like a management paper. The meeting pack has the ab mark, shop books, and NGN amounts. Buttons stay on the screen, not on the paper.</w:t>
+      </w:r>
+    </w:p>
+    <w:p>
+      <w:pPr>
+        <w:spacing w:after="160" w:before="0" w:line="276"/>
+        <w:jc w:val="left"/>
+      </w:pPr>
+      <w:r>
+        <w:rPr>
+          <w:rFonts w:ascii="Calibri" w:cs="Calibri" w:eastAsia="Calibri" w:hAnsi="Calibri"/>
+          <w:b w:val="false"/>
+          <w:bCs w:val="false"/>
+          <w:i w:val="false"/>
+          <w:iCs w:val="false"/>
+          <w:color w:val="000000"/>
+          <w:sz w:val="22"/>
+          <w:szCs w:val="22"/>
+        </w:rPr>
+        <w:t xml:space="preserve">Version 1.4 stops cut-off words. A button that is working says the full action, such as Preparing the PDF, not three dots after a half word.</w:t>
       </w:r>
     </w:p>
     <w:p>
@@ -6759,6 +6778,29 @@
           <w:szCs w:val="22"/>
         </w:rPr>
         <w:t xml:space="preserve">After a correct login you land on Home, or the first page your job is allowed to see.</w:t>
+      </w:r>
+    </w:p>
+    <w:p>
+      <w:pPr>
+        <w:pStyle w:val="ListParagraph"/>
+        <w:numPr>
+          <w:ilvl w:val="0"/>
+          <w:numId w:val="2"/>
+        </w:numPr>
+        <w:spacing w:after="80" w:line="276"/>
+      </w:pPr>
+      <w:r>
+        <w:rPr>
+          <w:rFonts w:ascii="Calibri" w:cs="Calibri" w:eastAsia="Calibri" w:hAnsi="Calibri"/>
+          <w:b w:val="false"/>
+          <w:bCs w:val="false"/>
+          <w:i w:val="false"/>
+          <w:iCs w:val="false"/>
+          <w:color w:val="000000"/>
+          <w:sz w:val="22"/>
+          <w:szCs w:val="22"/>
+        </w:rPr>
+        <w:t xml:space="preserve">While it checks, the button says Checking your sign-in, not three dots.</w:t>
       </w:r>
     </w:p>
     <w:p>
@@ -27130,6 +27172,29 @@
           <w:szCs w:val="22"/>
         </w:rPr>
         <w:t xml:space="preserve">Practice logins must be changed or removed before real daily use.</w:t>
+      </w:r>
+    </w:p>
+    <w:p>
+      <w:pPr>
+        <w:pStyle w:val="ListParagraph"/>
+        <w:numPr>
+          <w:ilvl w:val="0"/>
+          <w:numId w:val="2"/>
+        </w:numPr>
+        <w:spacing w:after="80" w:line="276"/>
+      </w:pPr>
+      <w:r>
+        <w:rPr>
+          <w:rFonts w:ascii="Calibri" w:cs="Calibri" w:eastAsia="Calibri" w:hAnsi="Calibri"/>
+          <w:b w:val="false"/>
+          <w:bCs w:val="false"/>
+          <w:i w:val="false"/>
+          <w:iCs w:val="false"/>
+          <w:color w:val="000000"/>
+          <w:sz w:val="22"/>
+          <w:szCs w:val="22"/>
+        </w:rPr>
+        <w:t xml:space="preserve">Every button and label uses the full word. Do not cut a term short with three dots.</w:t>
       </w:r>
     </w:p>
     <w:p>

</xml_diff>

<commit_message>
Show shop words on diaries and alerts instead of computer notes.
Who did what, Alerts, Needs approval, and the phone diary now say what changed in everyday language. Staff lists no longer carry password marks, and a parked sale can only be marked sent by a signed-in person.

Co-authored-by: Cursor <cursoragent@cursor.com>
</commit_message>
<xml_diff>
--- a/docs/Abu-Twins-Shop-System-User-Guide.docx
+++ b/docs/Abu-Twins-Shop-System-User-Guide.docx
@@ -459,7 +459,7 @@
                 <w:sz w:val="20"/>
                 <w:szCs w:val="20"/>
               </w:rPr>
-              <w:t xml:space="preserve">1.12</w:t>
+              <w:t xml:space="preserve">1.13</w:t>
             </w:r>
           </w:p>
         </w:tc>
@@ -533,7 +533,7 @@
                 <w:sz w:val="20"/>
                 <w:szCs w:val="20"/>
               </w:rPr>
-              <w:t xml:space="preserve">Updated: Stock count is the honest next step when a supplier bill shows missing products</w:t>
+              <w:t xml:space="preserve">Updated: Shop screens speak shop words, not computer notes</w:t>
             </w:r>
           </w:p>
         </w:tc>
@@ -921,6 +921,25 @@
           <w:szCs w:val="22"/>
         </w:rPr>
         <w:t xml:space="preserve">Version 1.12 writes that next step into Stock count. If a supplier bill says Still in shop but the shelf is short, you count with your hands. A manager must approve before numbers change. Do not type a new shop number because it looks low.</w:t>
+      </w:r>
+    </w:p>
+    <w:p>
+      <w:pPr>
+        <w:spacing w:after="160" w:before="0" w:line="276"/>
+        <w:jc w:val="left"/>
+      </w:pPr>
+      <w:r>
+        <w:rPr>
+          <w:rFonts w:ascii="Calibri" w:cs="Calibri" w:eastAsia="Calibri" w:hAnsi="Calibri"/>
+          <w:b w:val="false"/>
+          <w:bCs w:val="false"/>
+          <w:i w:val="false"/>
+          <w:iCs w:val="false"/>
+          <w:color w:val="000000"/>
+          <w:sz w:val="22"/>
+          <w:szCs w:val="22"/>
+        </w:rPr>
+        <w:t xml:space="preserve">Version 1.13 keeps computer notes off the shop screens. Who did what, Alerts, Needs approval, and the phone diary speak shop words. A tap shows what changed in plain language, not a computer file. Sign in still works the same way.</w:t>
       </w:r>
     </w:p>
     <w:p>
@@ -20566,7 +20585,7 @@
           <w:sz w:val="22"/>
           <w:szCs w:val="22"/>
         </w:rPr>
-        <w:t xml:space="preserve">This is the diary of the system. It shows who did an important action, when, in which shop, and what changed. Nothing here is deleted. It also keeps line-down time, parked sales that posted, parked sales that sat too long, and parked sales that vanished from a device. Those last two are marked high risk. At the top it may show the books verdict. Click that banner to open Check the books.</w:t>
+        <w:t xml:space="preserve">This is the diary of the system. It shows who did an important action, when, and what changed, in shop words. Nothing here is deleted. It also keeps line-down time, parked sales that posted, parked sales that sat too long, and parked sales that vanished from a device. Those last two are marked high risk. At the top it may show the books verdict. Click that banner to open Check the books.</w:t>
       </w:r>
     </w:p>
     <w:p>
@@ -20642,7 +20661,7 @@
           <w:sz w:val="22"/>
           <w:szCs w:val="22"/>
         </w:rPr>
-        <w:t xml:space="preserve">A phone is missing. The records checker opens Who did what, finds the last transfer, and sees who confirmed it at Challenge. The same morning an alert says a parked sale vanished. They filter high risk, open the parked sale line, and see who was signed in on that device when the queue disappeared.</w:t>
+        <w:t xml:space="preserve">A phone is missing. The records checker opens Who did what, finds the last shop-to-shop send, and sees who confirmed it at Challenge. The same morning an alert says a parked sale vanished. They filter high risk, open the parked sale line, and see who was signed in on that device when the queue disappeared.</w:t>
       </w:r>
     </w:p>
     <w:p>
@@ -20858,7 +20877,7 @@
           <w:sz w:val="22"/>
           <w:szCs w:val="22"/>
         </w:rPr>
-        <w:t xml:space="preserve">You see time, person, action, and what changed.</w:t>
+        <w:t xml:space="preserve">You see time, person, action, and what changed in everyday words.</w:t>
       </w:r>
     </w:p>
     <w:p>
@@ -20927,7 +20946,7 @@
           <w:sz w:val="22"/>
           <w:szCs w:val="22"/>
         </w:rPr>
-        <w:t xml:space="preserve">A vanished parked sale shows as a delete of ParkedSale with high risk.</w:t>
+        <w:t xml:space="preserve">A vanished parked sale shows as a high-risk parked sale that left this device.</w:t>
       </w:r>
     </w:p>
     <w:p>
@@ -31591,6 +31610,159 @@
                 <w:szCs w:val="20"/>
               </w:rPr>
               <w:t xml:space="preserve">Shelf count is entered. Difference waits for approval. Shop stock does not change until yes. Who did what keeps the names.</w:t>
+            </w:r>
+          </w:p>
+        </w:tc>
+      </w:tr>
+      <w:tr>
+        <w:trPr>
+          <w:trHeight w:val="320" w:hRule="atLeast"/>
+        </w:trPr>
+        <w:tc>
+          <w:tcPr>
+            <w:tcW w:type="dxa" w:w="600"/>
+            <w:tcBorders>
+              <w:top w:val="single" w:color="000000" w:sz="8"/>
+              <w:left w:val="single" w:color="000000" w:sz="8"/>
+              <w:bottom w:val="single" w:color="000000" w:sz="8"/>
+              <w:right w:val="single" w:color="000000" w:sz="8"/>
+            </w:tcBorders>
+            <w:shd w:fill="FFFFFF" w:color="FFFFFF" w:val="clear"/>
+            <w:tcMar>
+              <w:top w:type="dxa" w:w="60"/>
+              <w:left w:type="dxa" w:w="80"/>
+              <w:bottom w:type="dxa" w:w="60"/>
+              <w:right w:type="dxa" w:w="80"/>
+            </w:tcMar>
+            <w:vAlign w:val="center"/>
+          </w:tcPr>
+          <w:p>
+            <w:pPr>
+              <w:jc w:val="left"/>
+            </w:pPr>
+            <w:r>
+              <w:rPr>
+                <w:rFonts w:ascii="Calibri" w:cs="Calibri" w:eastAsia="Calibri" w:hAnsi="Calibri"/>
+                <w:b w:val="false"/>
+                <w:bCs w:val="false"/>
+                <w:i w:val="false"/>
+                <w:iCs w:val="false"/>
+                <w:color w:val="000000"/>
+                <w:sz w:val="20"/>
+                <w:szCs w:val="20"/>
+              </w:rPr>
+              <w:t xml:space="preserve">35</w:t>
+            </w:r>
+          </w:p>
+        </w:tc>
+        <w:tc>
+          <w:tcPr>
+            <w:tcW w:type="dxa" w:w="2800"/>
+            <w:tcBorders>
+              <w:top w:val="single" w:color="000000" w:sz="8"/>
+              <w:left w:val="single" w:color="000000" w:sz="8"/>
+              <w:bottom w:val="single" w:color="000000" w:sz="8"/>
+              <w:right w:val="single" w:color="000000" w:sz="8"/>
+            </w:tcBorders>
+            <w:shd w:fill="FFFFFF" w:color="FFFFFF" w:val="clear"/>
+            <w:tcMar>
+              <w:top w:type="dxa" w:w="60"/>
+              <w:left w:type="dxa" w:w="80"/>
+              <w:bottom w:type="dxa" w:w="60"/>
+              <w:right w:type="dxa" w:w="80"/>
+            </w:tcMar>
+            <w:vAlign w:val="center"/>
+          </w:tcPr>
+          <w:p>
+            <w:pPr>
+              <w:jc w:val="left"/>
+            </w:pPr>
+            <w:r>
+              <w:rPr>
+                <w:rFonts w:ascii="Calibri" w:cs="Calibri" w:eastAsia="Calibri" w:hAnsi="Calibri"/>
+                <w:b w:val="false"/>
+                <w:bCs w:val="false"/>
+                <w:i w:val="false"/>
+                <w:iCs w:val="false"/>
+                <w:color w:val="000000"/>
+                <w:sz w:val="20"/>
+                <w:szCs w:val="20"/>
+              </w:rPr>
+              <w:t xml:space="preserve">Who did what speaks shop words</w:t>
+            </w:r>
+          </w:p>
+        </w:tc>
+        <w:tc>
+          <w:tcPr>
+            <w:tcW w:type="dxa" w:w="2600"/>
+            <w:tcBorders>
+              <w:top w:val="single" w:color="000000" w:sz="8"/>
+              <w:left w:val="single" w:color="000000" w:sz="8"/>
+              <w:bottom w:val="single" w:color="000000" w:sz="8"/>
+              <w:right w:val="single" w:color="000000" w:sz="8"/>
+            </w:tcBorders>
+            <w:shd w:fill="FFFFFF" w:color="FFFFFF" w:val="clear"/>
+            <w:tcMar>
+              <w:top w:type="dxa" w:w="60"/>
+              <w:left w:type="dxa" w:w="80"/>
+              <w:bottom w:type="dxa" w:w="60"/>
+              <w:right w:type="dxa" w:w="80"/>
+            </w:tcMar>
+            <w:vAlign w:val="center"/>
+          </w:tcPr>
+          <w:p>
+            <w:pPr>
+              <w:jc w:val="left"/>
+            </w:pPr>
+            <w:r>
+              <w:rPr>
+                <w:rFonts w:ascii="Calibri" w:cs="Calibri" w:eastAsia="Calibri" w:hAnsi="Calibri"/>
+                <w:b w:val="false"/>
+                <w:bCs w:val="false"/>
+                <w:i w:val="false"/>
+                <w:iCs w:val="false"/>
+                <w:color w:val="000000"/>
+                <w:sz w:val="20"/>
+                <w:szCs w:val="20"/>
+              </w:rPr>
+              <w:t xml:space="preserve">auditor@abutwins.com</w:t>
+            </w:r>
+          </w:p>
+        </w:tc>
+        <w:tc>
+          <w:tcPr>
+            <w:tcW w:type="dxa" w:w="3360"/>
+            <w:tcBorders>
+              <w:top w:val="single" w:color="000000" w:sz="8"/>
+              <w:left w:val="single" w:color="000000" w:sz="8"/>
+              <w:bottom w:val="single" w:color="000000" w:sz="8"/>
+              <w:right w:val="single" w:color="000000" w:sz="8"/>
+            </w:tcBorders>
+            <w:shd w:fill="FFFFFF" w:color="FFFFFF" w:val="clear"/>
+            <w:tcMar>
+              <w:top w:type="dxa" w:w="60"/>
+              <w:left w:type="dxa" w:w="80"/>
+              <w:bottom w:type="dxa" w:w="60"/>
+              <w:right w:type="dxa" w:w="80"/>
+            </w:tcMar>
+            <w:vAlign w:val="center"/>
+          </w:tcPr>
+          <w:p>
+            <w:pPr>
+              <w:jc w:val="left"/>
+            </w:pPr>
+            <w:r>
+              <w:rPr>
+                <w:rFonts w:ascii="Calibri" w:cs="Calibri" w:eastAsia="Calibri" w:hAnsi="Calibri"/>
+                <w:b w:val="false"/>
+                <w:bCs w:val="false"/>
+                <w:i w:val="false"/>
+                <w:iCs w:val="false"/>
+                <w:color w:val="000000"/>
+                <w:sz w:val="20"/>
+                <w:szCs w:val="20"/>
+              </w:rPr>
+              <w:t xml:space="preserve">A row shows supplier bill or parked sale, not a computer file. Tap shows what changed in everyday words.</w:t>
             </w:r>
           </w:p>
         </w:tc>

</xml_diff>

<commit_message>
Put the sheet upload, the uploader job, and receipts into the handbook.
Three new chapters, each with a shop story and a test anyone can run: Upload
stock and the four steps in order, the Stock uploader job and what it
deliberately cannot do, and the three ways a customer gets a receipt.

The letter to the CEO now leads with how the shops actually get loaded, and
says why that power is kept narrow.

Who uses the system gains the new job and a box explaining what changed for
shop managers, who no longer add items or change prices. Rules that keep the
records safe gains six lines. The practice logins now list twenty.

The handbook inside the system had a summary for the new job but no entry for
the screen that job spends all its time on. Step names in both books now match
what is written on the screen.

Co-Authored-By: Claude Opus 5 <noreply@anthropic.com>
</commit_message>
<xml_diff>
--- a/docs/Abu-Twins-Shop-System-User-Guide.docx
+++ b/docs/Abu-Twins-Shop-System-User-Guide.docx
@@ -459,7 +459,7 @@
                 <w:sz w:val="20"/>
                 <w:szCs w:val="20"/>
               </w:rPr>
-              <w:t xml:space="preserve">1.15</w:t>
+              <w:t xml:space="preserve">1.16</w:t>
             </w:r>
           </w:p>
         </w:tc>
@@ -533,7 +533,7 @@
                 <w:sz w:val="20"/>
                 <w:szCs w:val="20"/>
               </w:rPr>
-              <w:t xml:space="preserve">Updated: Three shops, separate shop records, and a shop-by-shop view for head office</w:t>
+              <w:t xml:space="preserve">Updated: Loading the shops from a sheet, the stock uploader job, and receipts</w:t>
             </w:r>
           </w:p>
         </w:tc>
@@ -788,6 +788,63 @@
           <w:szCs w:val="22"/>
         </w:rPr>
         <w:t xml:space="preserve">That last point is the one to try first. A weak shop hides inside a healthy total. Now you can pick Bodija at the top of the screen and read Bodija alone, then pick All shops together and read the business. The figures are the same figures your staff are working from, not a report someone prepared for you.</w:t>
+      </w:r>
+    </w:p>
+    <w:p>
+      <w:pPr>
+        <w:spacing w:after="160" w:before="0" w:line="276"/>
+        <w:jc w:val="left"/>
+      </w:pPr>
+      <w:r>
+        <w:rPr>
+          <w:rFonts w:ascii="Calibri" w:cs="Calibri" w:eastAsia="Calibri" w:hAnsi="Calibri"/>
+          <w:b w:val="false"/>
+          <w:bCs w:val="false"/>
+          <w:i w:val="false"/>
+          <w:iCs w:val="false"/>
+          <w:color w:val="000000"/>
+          <w:sz w:val="22"/>
+          <w:szCs w:val="22"/>
+        </w:rPr>
+        <w:t xml:space="preserve">This release also answers the question of how the shops get loaded in the first place. Your team can now put the whole business into the system from an Excel sheet: the item list, what is on each shelf, and every phone by IMEI. Booking a container in by hand, one phone at a time, is where an evening goes. A sheet does it in one press.</w:t>
+      </w:r>
+    </w:p>
+    <w:p>
+      <w:pPr>
+        <w:spacing w:after="160" w:before="0" w:line="276"/>
+        <w:jc w:val="left"/>
+      </w:pPr>
+      <w:r>
+        <w:rPr>
+          <w:rFonts w:ascii="Calibri" w:cs="Calibri" w:eastAsia="Calibri" w:hAnsi="Calibri"/>
+          <w:b w:val="false"/>
+          <w:bCs w:val="false"/>
+          <w:i w:val="false"/>
+          <w:iCs w:val="false"/>
+          <w:color w:val="000000"/>
+          <w:sz w:val="22"/>
+          <w:szCs w:val="22"/>
+        </w:rPr>
+        <w:t xml:space="preserve">Because that is powerful, it is also narrow. A new job called Stock uploader does only that work. It cannot sell, cannot see money, and cannot approve anything. Loading the item list is now limited to that job and to Super Admin, so three shops cannot end up with three different names for the same phone.</w:t>
+      </w:r>
+    </w:p>
+    <w:p>
+      <w:pPr>
+        <w:spacing w:after="160" w:before="0" w:line="276"/>
+        <w:jc w:val="left"/>
+      </w:pPr>
+      <w:r>
+        <w:rPr>
+          <w:rFonts w:ascii="Calibri" w:cs="Calibri" w:eastAsia="Calibri" w:hAnsi="Calibri"/>
+          <w:b w:val="false"/>
+          <w:bCs w:val="false"/>
+          <w:i w:val="false"/>
+          <w:iCs w:val="false"/>
+          <w:color w:val="000000"/>
+          <w:sz w:val="22"/>
+          <w:szCs w:val="22"/>
+        </w:rPr>
+        <w:t xml:space="preserve">Every sale can now be handed over as a receipt: saved as a file to send to a customer, printed for a whole day at once, or printed the moment the sale is finished at the till.</w:t>
       </w:r>
     </w:p>
     <w:p>
@@ -7617,7 +7674,7 @@
                 <w:sz w:val="20"/>
                 <w:szCs w:val="20"/>
               </w:rPr>
-              <w:t xml:space="preserve">Run one shop. Sell, receive, transfer, approve shop work. Sees only that shop.</w:t>
+              <w:t xml:space="preserve">Run one shop. Sell, receive, transfer, approve shop work. Sees only that shop. Does not add items or change prices.</w:t>
             </w:r>
           </w:p>
         </w:tc>
@@ -7775,7 +7832,7 @@
                 <w:sz w:val="20"/>
                 <w:szCs w:val="20"/>
               </w:rPr>
-              <w:t xml:space="preserve">Cashier</w:t>
+              <w:t xml:space="preserve">Stock uploader</w:t>
             </w:r>
           </w:p>
         </w:tc>
@@ -7812,7 +7869,7 @@
                 <w:sz w:val="20"/>
                 <w:szCs w:val="20"/>
               </w:rPr>
-              <w:t xml:space="preserve">Front desk money person</w:t>
+              <w:t xml:space="preserve">The person who loads the system from a sheet</w:t>
             </w:r>
           </w:p>
         </w:tc>
@@ -7849,7 +7906,7 @@
                 <w:sz w:val="20"/>
                 <w:szCs w:val="20"/>
               </w:rPr>
-              <w:t xml:space="preserve">Sell now. Close the day. Collect money. Record a return.</w:t>
+              <w:t xml:space="preserve">Upload the item list, the shelf counts, the phones by IMEI, and customers. Nothing else. No selling, no money, no approving.</w:t>
             </w:r>
           </w:p>
         </w:tc>
@@ -7891,7 +7948,7 @@
                 <w:sz w:val="20"/>
                 <w:szCs w:val="20"/>
               </w:rPr>
-              <w:t xml:space="preserve">Sales person</w:t>
+              <w:t xml:space="preserve">Cashier</w:t>
             </w:r>
           </w:p>
         </w:tc>
@@ -7928,7 +7985,7 @@
                 <w:sz w:val="20"/>
                 <w:szCs w:val="20"/>
               </w:rPr>
-              <w:t xml:space="preserve">Floor seller</w:t>
+              <w:t xml:space="preserve">Front desk money person</w:t>
             </w:r>
           </w:p>
         </w:tc>
@@ -7965,7 +8022,7 @@
                 <w:sz w:val="20"/>
                 <w:szCs w:val="20"/>
               </w:rPr>
-              <w:t xml:space="preserve">Sell now. Close the day. See customers and items.</w:t>
+              <w:t xml:space="preserve">Sell now. Close the day. Collect money. Record a return.</w:t>
             </w:r>
           </w:p>
         </w:tc>
@@ -8007,6 +8064,122 @@
                 <w:sz w:val="20"/>
                 <w:szCs w:val="20"/>
               </w:rPr>
+              <w:t xml:space="preserve">Sales person</w:t>
+            </w:r>
+          </w:p>
+        </w:tc>
+        <w:tc>
+          <w:tcPr>
+            <w:tcW w:type="dxa" w:w="3000"/>
+            <w:tcBorders>
+              <w:top w:val="single" w:color="000000" w:sz="8"/>
+              <w:left w:val="single" w:color="000000" w:sz="8"/>
+              <w:bottom w:val="single" w:color="000000" w:sz="8"/>
+              <w:right w:val="single" w:color="000000" w:sz="8"/>
+            </w:tcBorders>
+            <w:shd w:fill="FFFFFF" w:color="FFFFFF" w:val="clear"/>
+            <w:tcMar>
+              <w:top w:type="dxa" w:w="60"/>
+              <w:left w:type="dxa" w:w="80"/>
+              <w:bottom w:type="dxa" w:w="60"/>
+              <w:right w:type="dxa" w:w="80"/>
+            </w:tcMar>
+            <w:vAlign w:val="center"/>
+          </w:tcPr>
+          <w:p>
+            <w:pPr>
+              <w:jc w:val="left"/>
+            </w:pPr>
+            <w:r>
+              <w:rPr>
+                <w:rFonts w:ascii="Calibri" w:cs="Calibri" w:eastAsia="Calibri" w:hAnsi="Calibri"/>
+                <w:b w:val="false"/>
+                <w:bCs w:val="false"/>
+                <w:i w:val="false"/>
+                <w:iCs w:val="false"/>
+                <w:color w:val="000000"/>
+                <w:sz w:val="20"/>
+                <w:szCs w:val="20"/>
+              </w:rPr>
+              <w:t xml:space="preserve">Floor seller</w:t>
+            </w:r>
+          </w:p>
+        </w:tc>
+        <w:tc>
+          <w:tcPr>
+            <w:tcW w:type="dxa" w:w="4160"/>
+            <w:tcBorders>
+              <w:top w:val="single" w:color="000000" w:sz="8"/>
+              <w:left w:val="single" w:color="000000" w:sz="8"/>
+              <w:bottom w:val="single" w:color="000000" w:sz="8"/>
+              <w:right w:val="single" w:color="000000" w:sz="8"/>
+            </w:tcBorders>
+            <w:shd w:fill="FFFFFF" w:color="FFFFFF" w:val="clear"/>
+            <w:tcMar>
+              <w:top w:type="dxa" w:w="60"/>
+              <w:left w:type="dxa" w:w="80"/>
+              <w:bottom w:type="dxa" w:w="60"/>
+              <w:right w:type="dxa" w:w="80"/>
+            </w:tcMar>
+            <w:vAlign w:val="center"/>
+          </w:tcPr>
+          <w:p>
+            <w:pPr>
+              <w:jc w:val="left"/>
+            </w:pPr>
+            <w:r>
+              <w:rPr>
+                <w:rFonts w:ascii="Calibri" w:cs="Calibri" w:eastAsia="Calibri" w:hAnsi="Calibri"/>
+                <w:b w:val="false"/>
+                <w:bCs w:val="false"/>
+                <w:i w:val="false"/>
+                <w:iCs w:val="false"/>
+                <w:color w:val="000000"/>
+                <w:sz w:val="20"/>
+                <w:szCs w:val="20"/>
+              </w:rPr>
+              <w:t xml:space="preserve">Sell now. Close the day. See customers and items.</w:t>
+            </w:r>
+          </w:p>
+        </w:tc>
+      </w:tr>
+      <w:tr>
+        <w:trPr>
+          <w:trHeight w:val="320" w:hRule="atLeast"/>
+        </w:trPr>
+        <w:tc>
+          <w:tcPr>
+            <w:tcW w:type="dxa" w:w="2200"/>
+            <w:tcBorders>
+              <w:top w:val="single" w:color="000000" w:sz="8"/>
+              <w:left w:val="single" w:color="000000" w:sz="8"/>
+              <w:bottom w:val="single" w:color="000000" w:sz="8"/>
+              <w:right w:val="single" w:color="000000" w:sz="8"/>
+            </w:tcBorders>
+            <w:shd w:fill="F7F7F7" w:color="F7F7F7" w:val="clear"/>
+            <w:tcMar>
+              <w:top w:type="dxa" w:w="60"/>
+              <w:left w:type="dxa" w:w="80"/>
+              <w:bottom w:type="dxa" w:w="60"/>
+              <w:right w:type="dxa" w:w="80"/>
+            </w:tcMar>
+            <w:vAlign w:val="center"/>
+          </w:tcPr>
+          <w:p>
+            <w:pPr>
+              <w:jc w:val="left"/>
+            </w:pPr>
+            <w:r>
+              <w:rPr>
+                <w:rFonts w:ascii="Calibri" w:cs="Calibri" w:eastAsia="Calibri" w:hAnsi="Calibri"/>
+                <w:b w:val="false"/>
+                <w:bCs w:val="false"/>
+                <w:i w:val="false"/>
+                <w:iCs w:val="false"/>
+                <w:color w:val="000000"/>
+                <w:sz w:val="20"/>
+                <w:szCs w:val="20"/>
+              </w:rPr>
               <w:t xml:space="preserve">Repair engineer</w:t>
             </w:r>
           </w:p>
@@ -8020,7 +8193,7 @@
               <w:bottom w:val="single" w:color="000000" w:sz="8"/>
               <w:right w:val="single" w:color="000000" w:sz="8"/>
             </w:tcBorders>
-            <w:shd w:fill="FFFFFF" w:color="FFFFFF" w:val="clear"/>
+            <w:shd w:fill="F7F7F7" w:color="F7F7F7" w:val="clear"/>
             <w:tcMar>
               <w:top w:type="dxa" w:w="60"/>
               <w:left w:type="dxa" w:w="80"/>
@@ -8057,7 +8230,7 @@
               <w:bottom w:val="single" w:color="000000" w:sz="8"/>
               <w:right w:val="single" w:color="000000" w:sz="8"/>
             </w:tcBorders>
-            <w:shd w:fill="FFFFFF" w:color="FFFFFF" w:val="clear"/>
+            <w:shd w:fill="F7F7F7" w:color="F7F7F7" w:val="clear"/>
             <w:tcMar>
               <w:top w:type="dxa" w:w="60"/>
               <w:left w:type="dxa" w:w="80"/>
@@ -8082,6 +8255,155 @@
                 <w:szCs w:val="20"/>
               </w:rPr>
               <w:t xml:space="preserve">Take phones for repair. Move a repair from step to step.</w:t>
+            </w:r>
+          </w:p>
+        </w:tc>
+      </w:tr>
+    </w:tbl>
+    <w:p>
+      <w:pPr>
+        <w:spacing w:after="160" w:before="0" w:line="276"/>
+        <w:jc w:val="left"/>
+      </w:pPr>
+      <w:r>
+        <w:rPr>
+          <w:rFonts w:ascii="Calibri" w:cs="Calibri" w:eastAsia="Calibri" w:hAnsi="Calibri"/>
+          <w:b w:val="false"/>
+          <w:bCs w:val="false"/>
+          <w:i w:val="false"/>
+          <w:iCs w:val="false"/>
+          <w:color w:val="000000"/>
+          <w:sz w:val="22"/>
+          <w:szCs w:val="22"/>
+        </w:rPr>
+        <w:t xml:space="preserve"/>
+      </w:r>
+    </w:p>
+    <w:tbl>
+      <w:tblPr>
+        <w:tblW w:type="dxa" w:w="9360"/>
+        <w:tblBorders>
+          <w:top w:val="single" w:color="auto" w:sz="4"/>
+          <w:left w:val="single" w:color="auto" w:sz="4"/>
+          <w:bottom w:val="single" w:color="auto" w:sz="4"/>
+          <w:right w:val="single" w:color="auto" w:sz="4"/>
+          <w:insideH w:val="single" w:color="auto" w:sz="4"/>
+          <w:insideV w:val="single" w:color="auto" w:sz="4"/>
+        </w:tblBorders>
+      </w:tblPr>
+      <w:tblGrid>
+        <w:gridCol w:w="9360"/>
+      </w:tblGrid>
+      <w:tr>
+        <w:tc>
+          <w:tcPr>
+            <w:tcW w:type="dxa" w:w="9360"/>
+            <w:tcBorders>
+              <w:top w:val="single" w:color="000000" w:sz="8"/>
+              <w:left w:val="single" w:color="BC0004" w:sz="24"/>
+              <w:bottom w:val="single" w:color="000000" w:sz="8"/>
+              <w:right w:val="single" w:color="000000" w:sz="8"/>
+            </w:tcBorders>
+            <w:tcMar>
+              <w:top w:type="dxa" w:w="100"/>
+              <w:left w:type="dxa" w:w="140"/>
+              <w:bottom w:type="dxa" w:w="100"/>
+              <w:right w:type="dxa" w:w="140"/>
+            </w:tcMar>
+          </w:tcPr>
+          <w:p>
+            <w:pPr>
+              <w:spacing w:after="80" w:before="0" w:line="276"/>
+              <w:jc w:val="left"/>
+            </w:pPr>
+            <w:r>
+              <w:rPr>
+                <w:rFonts w:ascii="Calibri" w:cs="Calibri" w:eastAsia="Calibri" w:hAnsi="Calibri"/>
+                <w:b/>
+                <w:bCs/>
+                <w:i w:val="false"/>
+                <w:iCs w:val="false"/>
+                <w:color w:val="000000"/>
+                <w:sz w:val="22"/>
+                <w:szCs w:val="22"/>
+              </w:rPr>
+              <w:t xml:space="preserve">What changed for shop managers</w:t>
+            </w:r>
+          </w:p>
+          <w:p>
+            <w:pPr>
+              <w:spacing w:after="60" w:before="0" w:line="276"/>
+              <w:jc w:val="left"/>
+            </w:pPr>
+            <w:r>
+              <w:rPr>
+                <w:rFonts w:ascii="Calibri" w:cs="Calibri" w:eastAsia="Calibri" w:hAnsi="Calibri"/>
+                <w:b w:val="false"/>
+                <w:bCs w:val="false"/>
+                <w:i w:val="false"/>
+                <w:iCs w:val="false"/>
+                <w:color w:val="000000"/>
+                <w:sz w:val="21"/>
+                <w:szCs w:val="21"/>
+              </w:rPr>
+              <w:t xml:space="preserve">Adding an item to the list, and changing a price, has moved to the Stock uploader and Super Admin.</w:t>
+            </w:r>
+          </w:p>
+          <w:p>
+            <w:pPr>
+              <w:spacing w:after="60" w:before="0" w:line="276"/>
+              <w:jc w:val="left"/>
+            </w:pPr>
+            <w:r>
+              <w:rPr>
+                <w:rFonts w:ascii="Calibri" w:cs="Calibri" w:eastAsia="Calibri" w:hAnsi="Calibri"/>
+                <w:b w:val="false"/>
+                <w:bCs w:val="false"/>
+                <w:i w:val="false"/>
+                <w:iCs w:val="false"/>
+                <w:color w:val="000000"/>
+                <w:sz w:val="21"/>
+                <w:szCs w:val="21"/>
+              </w:rPr>
+              <w:t xml:space="preserve">This is on purpose. When each shop could add its own items, one phone ended up on the system under three names, and no report could add them up.</w:t>
+            </w:r>
+          </w:p>
+          <w:p>
+            <w:pPr>
+              <w:spacing w:after="60" w:before="0" w:line="276"/>
+              <w:jc w:val="left"/>
+            </w:pPr>
+            <w:r>
+              <w:rPr>
+                <w:rFonts w:ascii="Calibri" w:cs="Calibri" w:eastAsia="Calibri" w:hAnsi="Calibri"/>
+                <w:b w:val="false"/>
+                <w:bCs w:val="false"/>
+                <w:i w:val="false"/>
+                <w:iCs w:val="false"/>
+                <w:color w:val="000000"/>
+                <w:sz w:val="21"/>
+                <w:szCs w:val="21"/>
+              </w:rPr>
+              <w:t xml:space="preserve">A shop manager still sells, receives goods, transfers, approves shop work, and runs their own staff.</w:t>
+            </w:r>
+          </w:p>
+          <w:p>
+            <w:pPr>
+              <w:spacing w:after="60" w:before="0" w:line="276"/>
+              <w:jc w:val="left"/>
+            </w:pPr>
+            <w:r>
+              <w:rPr>
+                <w:rFonts w:ascii="Calibri" w:cs="Calibri" w:eastAsia="Calibri" w:hAnsi="Calibri"/>
+                <w:b w:val="false"/>
+                <w:bCs w:val="false"/>
+                <w:i w:val="false"/>
+                <w:iCs w:val="false"/>
+                <w:color w:val="000000"/>
+                <w:sz w:val="21"/>
+                <w:szCs w:val="21"/>
+              </w:rPr>
+              <w:t xml:space="preserve">If your shop needs a new item on the list, send it to whoever holds the Stock uploader login.</w:t>
             </w:r>
           </w:p>
         </w:tc>
@@ -26246,6 +26568,1491 @@
     </w:p>
     <w:p>
       <w:pPr>
+        <w:pStyle w:val="Heading2"/>
+        <w:spacing w:after="120" w:before="280"/>
+      </w:pPr>
+      <w:r>
+        <w:rPr>
+          <w:rFonts w:ascii="Calibri" w:cs="Calibri" w:eastAsia="Calibri" w:hAnsi="Calibri"/>
+          <w:b/>
+          <w:bCs/>
+          <w:i w:val="false"/>
+          <w:iCs w:val="false"/>
+          <w:color w:val="000000"/>
+          <w:sz w:val="26"/>
+          <w:szCs w:val="26"/>
+        </w:rPr>
+        <w:t xml:space="preserve">10.39 Upload stock. Loading the shops from a sheet</w:t>
+      </w:r>
+    </w:p>
+    <w:p>
+      <w:pPr>
+        <w:pStyle w:val="Heading3"/>
+        <w:spacing w:after="80" w:before="200"/>
+      </w:pPr>
+      <w:r>
+        <w:rPr>
+          <w:rFonts w:ascii="Calibri" w:cs="Calibri" w:eastAsia="Calibri" w:hAnsi="Calibri"/>
+          <w:b/>
+          <w:bCs/>
+          <w:i w:val="false"/>
+          <w:iCs w:val="false"/>
+          <w:color w:val="000000"/>
+          <w:sz w:val="24"/>
+          <w:szCs w:val="24"/>
+        </w:rPr>
+        <w:t xml:space="preserve">What this page is</w:t>
+      </w:r>
+    </w:p>
+    <w:p>
+      <w:pPr>
+        <w:spacing w:after="160" w:before="0" w:line="276"/>
+        <w:jc w:val="left"/>
+      </w:pPr>
+      <w:r>
+        <w:rPr>
+          <w:rFonts w:ascii="Calibri" w:cs="Calibri" w:eastAsia="Calibri" w:hAnsi="Calibri"/>
+          <w:b w:val="false"/>
+          <w:bCs w:val="false"/>
+          <w:i w:val="false"/>
+          <w:iCs w:val="false"/>
+          <w:color w:val="000000"/>
+          <w:sz w:val="22"/>
+          <w:szCs w:val="22"/>
+        </w:rPr>
+        <w:t xml:space="preserve">Upload stock is one screen with four steps, in the order the work has to happen. Step 1 is The item list. Step 2 is Pieces on the shelf. Step 3 is Phones by IMEI. Step 4 is Customers. Excel or CSV both work. Steps 2, 3, and 4 stay shut until step 1 is done.</w:t>
+      </w:r>
+    </w:p>
+    <w:p>
+      <w:pPr>
+        <w:pStyle w:val="Heading3"/>
+        <w:spacing w:after="80" w:before="200"/>
+      </w:pPr>
+      <w:r>
+        <w:rPr>
+          <w:rFonts w:ascii="Calibri" w:cs="Calibri" w:eastAsia="Calibri" w:hAnsi="Calibri"/>
+          <w:b/>
+          <w:bCs/>
+          <w:i w:val="false"/>
+          <w:iCs w:val="false"/>
+          <w:color w:val="000000"/>
+          <w:sz w:val="24"/>
+          <w:szCs w:val="24"/>
+        </w:rPr>
+        <w:t xml:space="preserve">Why it is here</w:t>
+      </w:r>
+    </w:p>
+    <w:p>
+      <w:pPr>
+        <w:spacing w:after="160" w:before="0" w:line="276"/>
+        <w:jc w:val="left"/>
+      </w:pPr>
+      <w:r>
+        <w:rPr>
+          <w:rFonts w:ascii="Calibri" w:cs="Calibri" w:eastAsia="Calibri" w:hAnsi="Calibri"/>
+          <w:b w:val="false"/>
+          <w:bCs w:val="false"/>
+          <w:i w:val="false"/>
+          <w:iCs w:val="false"/>
+          <w:color w:val="000000"/>
+          <w:sz w:val="22"/>
+          <w:szCs w:val="22"/>
+        </w:rPr>
+        <w:t xml:space="preserve">A shop cannot be put on a computer one line at a time. A container of two hundred phones typed by hand is an evening lost and a night of mistakes. The order is not a suggestion either: nothing can be counted or booked in until the system has been told what the item is. That is why the later steps stay shut until the item list is in.</w:t>
+      </w:r>
+    </w:p>
+    <w:p>
+      <w:pPr>
+        <w:pStyle w:val="Heading3"/>
+        <w:spacing w:after="80" w:before="200"/>
+      </w:pPr>
+      <w:r>
+        <w:rPr>
+          <w:rFonts w:ascii="Calibri" w:cs="Calibri" w:eastAsia="Calibri" w:hAnsi="Calibri"/>
+          <w:b/>
+          <w:bCs/>
+          <w:i w:val="false"/>
+          <w:iCs w:val="false"/>
+          <w:color w:val="000000"/>
+          <w:sz w:val="24"/>
+          <w:szCs w:val="24"/>
+        </w:rPr>
+        <w:t xml:space="preserve">A real shop story</w:t>
+      </w:r>
+    </w:p>
+    <w:p>
+      <w:pPr>
+        <w:spacing w:after="160" w:before="0" w:line="276"/>
+        <w:jc w:val="left"/>
+      </w:pPr>
+      <w:r>
+        <w:rPr>
+          <w:rFonts w:ascii="Calibri" w:cs="Calibri" w:eastAsia="Calibri" w:hAnsi="Calibri"/>
+          <w:b w:val="false"/>
+          <w:bCs w:val="false"/>
+          <w:i w:val="false"/>
+          <w:iCs w:val="false"/>
+          <w:color w:val="000000"/>
+          <w:sz w:val="22"/>
+          <w:szCs w:val="22"/>
+        </w:rPr>
+        <w:t xml:space="preserve">Abu Twins is putting Bodija on the system. The uploader sends the item list first: every model, one row each. The screen then opens the other three steps. He sends the shelf counts for cords and chargers, then the container sheet of two hundred and forty IMEIs. Bodija now shows two hundred and forty phones In shop, and Shop stock agrees with the IMEI list, because booking the phones in raised the shelf count at the same time.</w:t>
+      </w:r>
+    </w:p>
+    <w:p>
+      <w:pPr>
+        <w:pStyle w:val="Heading3"/>
+        <w:spacing w:after="80" w:before="200"/>
+      </w:pPr>
+      <w:r>
+        <w:rPr>
+          <w:rFonts w:ascii="Calibri" w:cs="Calibri" w:eastAsia="Calibri" w:hAnsi="Calibri"/>
+          <w:b/>
+          <w:bCs/>
+          <w:i w:val="false"/>
+          <w:iCs w:val="false"/>
+          <w:color w:val="000000"/>
+          <w:sz w:val="24"/>
+          <w:szCs w:val="24"/>
+        </w:rPr>
+        <w:t xml:space="preserve">How to try it</w:t>
+      </w:r>
+    </w:p>
+    <w:p>
+      <w:pPr>
+        <w:spacing w:after="80" w:line="276"/>
+      </w:pPr>
+      <w:r>
+        <w:rPr>
+          <w:rFonts w:ascii="Calibri" w:cs="Calibri" w:eastAsia="Calibri" w:hAnsi="Calibri"/>
+          <w:b/>
+          <w:bCs/>
+          <w:i w:val="false"/>
+          <w:iCs w:val="false"/>
+          <w:color w:val="000000"/>
+          <w:sz w:val="22"/>
+          <w:szCs w:val="22"/>
+        </w:rPr>
+        <w:t xml:space="preserve">1. </w:t>
+      </w:r>
+      <w:r>
+        <w:rPr>
+          <w:rFonts w:ascii="Calibri" w:cs="Calibri" w:eastAsia="Calibri" w:hAnsi="Calibri"/>
+          <w:b w:val="false"/>
+          <w:bCs w:val="false"/>
+          <w:i w:val="false"/>
+          <w:iCs w:val="false"/>
+          <w:color w:val="000000"/>
+          <w:sz w:val="22"/>
+          <w:szCs w:val="22"/>
+        </w:rPr>
+        <w:t xml:space="preserve">Sign in as uploader@abutwins.com.</w:t>
+      </w:r>
+    </w:p>
+    <w:p>
+      <w:pPr>
+        <w:spacing w:after="80" w:line="276"/>
+      </w:pPr>
+      <w:r>
+        <w:rPr>
+          <w:rFonts w:ascii="Calibri" w:cs="Calibri" w:eastAsia="Calibri" w:hAnsi="Calibri"/>
+          <w:b/>
+          <w:bCs/>
+          <w:i w:val="false"/>
+          <w:iCs w:val="false"/>
+          <w:color w:val="000000"/>
+          <w:sz w:val="22"/>
+          <w:szCs w:val="22"/>
+        </w:rPr>
+        <w:t xml:space="preserve">2. </w:t>
+      </w:r>
+      <w:r>
+        <w:rPr>
+          <w:rFonts w:ascii="Calibri" w:cs="Calibri" w:eastAsia="Calibri" w:hAnsi="Calibri"/>
+          <w:b w:val="false"/>
+          <w:bCs w:val="false"/>
+          <w:i w:val="false"/>
+          <w:iCs w:val="false"/>
+          <w:color w:val="000000"/>
+          <w:sz w:val="22"/>
+          <w:szCs w:val="22"/>
+        </w:rPr>
+        <w:t xml:space="preserve">Open Upload stock from the left menu, under Stock.</w:t>
+      </w:r>
+    </w:p>
+    <w:p>
+      <w:pPr>
+        <w:spacing w:after="80" w:line="276"/>
+      </w:pPr>
+      <w:r>
+        <w:rPr>
+          <w:rFonts w:ascii="Calibri" w:cs="Calibri" w:eastAsia="Calibri" w:hAnsi="Calibri"/>
+          <w:b/>
+          <w:bCs/>
+          <w:i w:val="false"/>
+          <w:iCs w:val="false"/>
+          <w:color w:val="000000"/>
+          <w:sz w:val="22"/>
+          <w:szCs w:val="22"/>
+        </w:rPr>
+        <w:t xml:space="preserve">3. </w:t>
+      </w:r>
+      <w:r>
+        <w:rPr>
+          <w:rFonts w:ascii="Calibri" w:cs="Calibri" w:eastAsia="Calibri" w:hAnsi="Calibri"/>
+          <w:b w:val="false"/>
+          <w:bCs w:val="false"/>
+          <w:i w:val="false"/>
+          <w:iCs w:val="false"/>
+          <w:color w:val="000000"/>
+          <w:sz w:val="22"/>
+          <w:szCs w:val="22"/>
+        </w:rPr>
+        <w:t xml:space="preserve">Read the column names listed under step 1, then prepare your sheet with those names in the first row.</w:t>
+      </w:r>
+    </w:p>
+    <w:p>
+      <w:pPr>
+        <w:spacing w:after="80" w:line="276"/>
+      </w:pPr>
+      <w:r>
+        <w:rPr>
+          <w:rFonts w:ascii="Calibri" w:cs="Calibri" w:eastAsia="Calibri" w:hAnsi="Calibri"/>
+          <w:b/>
+          <w:bCs/>
+          <w:i w:val="false"/>
+          <w:iCs w:val="false"/>
+          <w:color w:val="000000"/>
+          <w:sz w:val="22"/>
+          <w:szCs w:val="22"/>
+        </w:rPr>
+        <w:t xml:space="preserve">4. </w:t>
+      </w:r>
+      <w:r>
+        <w:rPr>
+          <w:rFonts w:ascii="Calibri" w:cs="Calibri" w:eastAsia="Calibri" w:hAnsi="Calibri"/>
+          <w:b w:val="false"/>
+          <w:bCs w:val="false"/>
+          <w:i w:val="false"/>
+          <w:iCs w:val="false"/>
+          <w:color w:val="000000"/>
+          <w:sz w:val="22"/>
+          <w:szCs w:val="22"/>
+        </w:rPr>
+        <w:t xml:space="preserve">Upload the item list. Wait for the count at the top right of the step to rise.</w:t>
+      </w:r>
+    </w:p>
+    <w:p>
+      <w:pPr>
+        <w:spacing w:after="80" w:line="276"/>
+      </w:pPr>
+      <w:r>
+        <w:rPr>
+          <w:rFonts w:ascii="Calibri" w:cs="Calibri" w:eastAsia="Calibri" w:hAnsi="Calibri"/>
+          <w:b/>
+          <w:bCs/>
+          <w:i w:val="false"/>
+          <w:iCs w:val="false"/>
+          <w:color w:val="000000"/>
+          <w:sz w:val="22"/>
+          <w:szCs w:val="22"/>
+        </w:rPr>
+        <w:t xml:space="preserve">5. </w:t>
+      </w:r>
+      <w:r>
+        <w:rPr>
+          <w:rFonts w:ascii="Calibri" w:cs="Calibri" w:eastAsia="Calibri" w:hAnsi="Calibri"/>
+          <w:b w:val="false"/>
+          <w:bCs w:val="false"/>
+          <w:i w:val="false"/>
+          <w:iCs w:val="false"/>
+          <w:color w:val="000000"/>
+          <w:sz w:val="22"/>
+          <w:szCs w:val="22"/>
+        </w:rPr>
+        <w:t xml:space="preserve">Upload Pieces on the shelf, then Phones by IMEI, then Customers.</w:t>
+      </w:r>
+    </w:p>
+    <w:p>
+      <w:pPr>
+        <w:spacing w:after="80" w:line="276"/>
+      </w:pPr>
+      <w:r>
+        <w:rPr>
+          <w:rFonts w:ascii="Calibri" w:cs="Calibri" w:eastAsia="Calibri" w:hAnsi="Calibri"/>
+          <w:b/>
+          <w:bCs/>
+          <w:i w:val="false"/>
+          <w:iCs w:val="false"/>
+          <w:color w:val="000000"/>
+          <w:sz w:val="22"/>
+          <w:szCs w:val="22"/>
+        </w:rPr>
+        <w:t xml:space="preserve">6. </w:t>
+      </w:r>
+      <w:r>
+        <w:rPr>
+          <w:rFonts w:ascii="Calibri" w:cs="Calibri" w:eastAsia="Calibri" w:hAnsi="Calibri"/>
+          <w:b w:val="false"/>
+          <w:bCs w:val="false"/>
+          <w:i w:val="false"/>
+          <w:iCs w:val="false"/>
+          <w:color w:val="000000"/>
+          <w:sz w:val="22"/>
+          <w:szCs w:val="22"/>
+        </w:rPr>
+        <w:t xml:space="preserve">Deliberately put one wrong line in a sheet, such as a shop that does not exist, and upload it.</w:t>
+      </w:r>
+    </w:p>
+    <w:p>
+      <w:pPr>
+        <w:spacing w:after="80" w:line="276"/>
+      </w:pPr>
+      <w:r>
+        <w:rPr>
+          <w:rFonts w:ascii="Calibri" w:cs="Calibri" w:eastAsia="Calibri" w:hAnsi="Calibri"/>
+          <w:b/>
+          <w:bCs/>
+          <w:i w:val="false"/>
+          <w:iCs w:val="false"/>
+          <w:color w:val="000000"/>
+          <w:sz w:val="22"/>
+          <w:szCs w:val="22"/>
+        </w:rPr>
+        <w:t xml:space="preserve">7. </w:t>
+      </w:r>
+      <w:r>
+        <w:rPr>
+          <w:rFonts w:ascii="Calibri" w:cs="Calibri" w:eastAsia="Calibri" w:hAnsi="Calibri"/>
+          <w:b w:val="false"/>
+          <w:bCs w:val="false"/>
+          <w:i w:val="false"/>
+          <w:iCs w:val="false"/>
+          <w:color w:val="000000"/>
+          <w:sz w:val="22"/>
+          <w:szCs w:val="22"/>
+        </w:rPr>
+        <w:t xml:space="preserve">Send the same phones sheet a second time.</w:t>
+      </w:r>
+    </w:p>
+    <w:p>
+      <w:pPr>
+        <w:pStyle w:val="Heading3"/>
+        <w:spacing w:after="80" w:before="200"/>
+      </w:pPr>
+      <w:r>
+        <w:rPr>
+          <w:rFonts w:ascii="Calibri" w:cs="Calibri" w:eastAsia="Calibri" w:hAnsi="Calibri"/>
+          <w:b/>
+          <w:bCs/>
+          <w:i w:val="false"/>
+          <w:iCs w:val="false"/>
+          <w:color w:val="000000"/>
+          <w:sz w:val="24"/>
+          <w:szCs w:val="24"/>
+        </w:rPr>
+        <w:t xml:space="preserve">What you should see</w:t>
+      </w:r>
+    </w:p>
+    <w:p>
+      <w:pPr>
+        <w:pStyle w:val="ListParagraph"/>
+        <w:numPr>
+          <w:ilvl w:val="0"/>
+          <w:numId w:val="2"/>
+        </w:numPr>
+        <w:spacing w:after="80" w:line="276"/>
+      </w:pPr>
+      <w:r>
+        <w:rPr>
+          <w:rFonts w:ascii="Calibri" w:cs="Calibri" w:eastAsia="Calibri" w:hAnsi="Calibri"/>
+          <w:b w:val="false"/>
+          <w:bCs w:val="false"/>
+          <w:i w:val="false"/>
+          <w:iCs w:val="false"/>
+          <w:color w:val="000000"/>
+          <w:sz w:val="22"/>
+          <w:szCs w:val="22"/>
+        </w:rPr>
+        <w:t xml:space="preserve">Steps 2, 3, and 4 are shut with a note until the item list is loaded.</w:t>
+      </w:r>
+    </w:p>
+    <w:p>
+      <w:pPr>
+        <w:pStyle w:val="ListParagraph"/>
+        <w:numPr>
+          <w:ilvl w:val="0"/>
+          <w:numId w:val="2"/>
+        </w:numPr>
+        <w:spacing w:after="80" w:line="276"/>
+      </w:pPr>
+      <w:r>
+        <w:rPr>
+          <w:rFonts w:ascii="Calibri" w:cs="Calibri" w:eastAsia="Calibri" w:hAnsi="Calibri"/>
+          <w:b w:val="false"/>
+          <w:bCs w:val="false"/>
+          <w:i w:val="false"/>
+          <w:iCs w:val="false"/>
+          <w:color w:val="000000"/>
+          <w:sz w:val="22"/>
+          <w:szCs w:val="22"/>
+        </w:rPr>
+        <w:t xml:space="preserve">Each step shows how far the shop has got, such as how many items are on the list and how many phones are In shop.</w:t>
+      </w:r>
+    </w:p>
+    <w:p>
+      <w:pPr>
+        <w:pStyle w:val="ListParagraph"/>
+        <w:numPr>
+          <w:ilvl w:val="0"/>
+          <w:numId w:val="2"/>
+        </w:numPr>
+        <w:spacing w:after="80" w:line="276"/>
+      </w:pPr>
+      <w:r>
+        <w:rPr>
+          <w:rFonts w:ascii="Calibri" w:cs="Calibri" w:eastAsia="Calibri" w:hAnsi="Calibri"/>
+          <w:b w:val="false"/>
+          <w:bCs w:val="false"/>
+          <w:i w:val="false"/>
+          <w:iCs w:val="false"/>
+          <w:color w:val="000000"/>
+          <w:sz w:val="22"/>
+          <w:szCs w:val="22"/>
+        </w:rPr>
+        <w:t xml:space="preserve">A sheet with a bad line loads nothing at all, and names the lines to fix by their spreadsheet line number.</w:t>
+      </w:r>
+    </w:p>
+    <w:p>
+      <w:pPr>
+        <w:pStyle w:val="ListParagraph"/>
+        <w:numPr>
+          <w:ilvl w:val="0"/>
+          <w:numId w:val="2"/>
+        </w:numPr>
+        <w:spacing w:after="80" w:line="276"/>
+      </w:pPr>
+      <w:r>
+        <w:rPr>
+          <w:rFonts w:ascii="Calibri" w:cs="Calibri" w:eastAsia="Calibri" w:hAnsi="Calibri"/>
+          <w:b w:val="false"/>
+          <w:bCs w:val="false"/>
+          <w:i w:val="false"/>
+          <w:iCs w:val="false"/>
+          <w:color w:val="000000"/>
+          <w:sz w:val="22"/>
+          <w:szCs w:val="22"/>
+        </w:rPr>
+        <w:t xml:space="preserve">Sending the same sheet twice adds nothing the second time. A phone already on the system is left exactly as it is.</w:t>
+      </w:r>
+    </w:p>
+    <w:p>
+      <w:pPr>
+        <w:pStyle w:val="ListParagraph"/>
+        <w:numPr>
+          <w:ilvl w:val="0"/>
+          <w:numId w:val="2"/>
+        </w:numPr>
+        <w:spacing w:after="80" w:line="276"/>
+      </w:pPr>
+      <w:r>
+        <w:rPr>
+          <w:rFonts w:ascii="Calibri" w:cs="Calibri" w:eastAsia="Calibri" w:hAnsi="Calibri"/>
+          <w:b w:val="false"/>
+          <w:bCs w:val="false"/>
+          <w:i w:val="false"/>
+          <w:iCs w:val="false"/>
+          <w:color w:val="000000"/>
+          <w:sz w:val="22"/>
+          <w:szCs w:val="22"/>
+        </w:rPr>
+        <w:t xml:space="preserve">After the phones sheet, Shop stock and Phone IMEIs agree, with no stock count needed.</w:t>
+      </w:r>
+    </w:p>
+    <w:p>
+      <w:pPr>
+        <w:pStyle w:val="ListParagraph"/>
+        <w:numPr>
+          <w:ilvl w:val="0"/>
+          <w:numId w:val="2"/>
+        </w:numPr>
+        <w:spacing w:after="80" w:line="276"/>
+      </w:pPr>
+      <w:r>
+        <w:rPr>
+          <w:rFonts w:ascii="Calibri" w:cs="Calibri" w:eastAsia="Calibri" w:hAnsi="Calibri"/>
+          <w:b w:val="false"/>
+          <w:bCs w:val="false"/>
+          <w:i w:val="false"/>
+          <w:iCs w:val="false"/>
+          <w:color w:val="000000"/>
+          <w:sz w:val="22"/>
+          <w:szCs w:val="22"/>
+        </w:rPr>
+        <w:t xml:space="preserve">Column names are forgiving. Item code, SKU, and code all work. So do IMEI, IMEI1, and phone.</w:t>
+      </w:r>
+    </w:p>
+    <w:p>
+      <w:pPr>
+        <w:pStyle w:val="ListParagraph"/>
+        <w:numPr>
+          <w:ilvl w:val="0"/>
+          <w:numId w:val="2"/>
+        </w:numPr>
+        <w:spacing w:after="80" w:line="276"/>
+      </w:pPr>
+      <w:r>
+        <w:rPr>
+          <w:rFonts w:ascii="Calibri" w:cs="Calibri" w:eastAsia="Calibri" w:hAnsi="Calibri"/>
+          <w:b w:val="false"/>
+          <w:bCs w:val="false"/>
+          <w:i w:val="false"/>
+          <w:iCs w:val="false"/>
+          <w:color w:val="000000"/>
+          <w:sz w:val="22"/>
+          <w:szCs w:val="22"/>
+        </w:rPr>
+        <w:t xml:space="preserve">Shops can be named in full or by their short code: IWO, BOD, CHL.</w:t>
+      </w:r>
+    </w:p>
+    <w:p>
+      <w:pPr>
+        <w:pStyle w:val="Heading2"/>
+        <w:spacing w:after="120" w:before="280"/>
+      </w:pPr>
+      <w:r>
+        <w:rPr>
+          <w:rFonts w:ascii="Calibri" w:cs="Calibri" w:eastAsia="Calibri" w:hAnsi="Calibri"/>
+          <w:b/>
+          <w:bCs/>
+          <w:i w:val="false"/>
+          <w:iCs w:val="false"/>
+          <w:color w:val="000000"/>
+          <w:sz w:val="26"/>
+          <w:szCs w:val="26"/>
+        </w:rPr>
+        <w:t xml:space="preserve">10.40 Stock uploader. A job that only loads data</w:t>
+      </w:r>
+    </w:p>
+    <w:p>
+      <w:pPr>
+        <w:pStyle w:val="Heading3"/>
+        <w:spacing w:after="80" w:before="200"/>
+      </w:pPr>
+      <w:r>
+        <w:rPr>
+          <w:rFonts w:ascii="Calibri" w:cs="Calibri" w:eastAsia="Calibri" w:hAnsi="Calibri"/>
+          <w:b/>
+          <w:bCs/>
+          <w:i w:val="false"/>
+          <w:iCs w:val="false"/>
+          <w:color w:val="000000"/>
+          <w:sz w:val="24"/>
+          <w:szCs w:val="24"/>
+        </w:rPr>
+        <w:t xml:space="preserve">What this page is</w:t>
+      </w:r>
+    </w:p>
+    <w:p>
+      <w:pPr>
+        <w:spacing w:after="160" w:before="0" w:line="276"/>
+        <w:jc w:val="left"/>
+      </w:pPr>
+      <w:r>
+        <w:rPr>
+          <w:rFonts w:ascii="Calibri" w:cs="Calibri" w:eastAsia="Calibri" w:hAnsi="Calibri"/>
+          <w:b w:val="false"/>
+          <w:bCs w:val="false"/>
+          <w:i w:val="false"/>
+          <w:iCs w:val="false"/>
+          <w:color w:val="000000"/>
+          <w:sz w:val="22"/>
+          <w:szCs w:val="22"/>
+        </w:rPr>
+        <w:t xml:space="preserve">A job whose whole purpose is putting data into the system. It sees Upload stock, the item list, the phone list, and shop stock. It cannot sell, cannot open money pages, cannot approve anything, and cannot add staff.</w:t>
+      </w:r>
+    </w:p>
+    <w:p>
+      <w:pPr>
+        <w:pStyle w:val="Heading3"/>
+        <w:spacing w:after="80" w:before="200"/>
+      </w:pPr>
+      <w:r>
+        <w:rPr>
+          <w:rFonts w:ascii="Calibri" w:cs="Calibri" w:eastAsia="Calibri" w:hAnsi="Calibri"/>
+          <w:b/>
+          <w:bCs/>
+          <w:i w:val="false"/>
+          <w:iCs w:val="false"/>
+          <w:color w:val="000000"/>
+          <w:sz w:val="24"/>
+          <w:szCs w:val="24"/>
+        </w:rPr>
+        <w:t xml:space="preserve">Why it is here</w:t>
+      </w:r>
+    </w:p>
+    <w:p>
+      <w:pPr>
+        <w:spacing w:after="160" w:before="0" w:line="276"/>
+        <w:jc w:val="left"/>
+      </w:pPr>
+      <w:r>
+        <w:rPr>
+          <w:rFonts w:ascii="Calibri" w:cs="Calibri" w:eastAsia="Calibri" w:hAnsi="Calibri"/>
+          <w:b w:val="false"/>
+          <w:bCs w:val="false"/>
+          <w:i w:val="false"/>
+          <w:iCs w:val="false"/>
+          <w:color w:val="000000"/>
+          <w:sz w:val="22"/>
+          <w:szCs w:val="22"/>
+        </w:rPr>
+        <w:t xml:space="preserve">Loading the shops is powerful work and it is usually done by whoever is helping to set the system up, sometimes from outside the shop. That person needs no ability to sell or to see what the business is worth. Giving them one narrow job means the door they hold opens one room.</w:t>
+      </w:r>
+    </w:p>
+    <w:p>
+      <w:pPr>
+        <w:pStyle w:val="Heading3"/>
+        <w:spacing w:after="80" w:before="200"/>
+      </w:pPr>
+      <w:r>
+        <w:rPr>
+          <w:rFonts w:ascii="Calibri" w:cs="Calibri" w:eastAsia="Calibri" w:hAnsi="Calibri"/>
+          <w:b/>
+          <w:bCs/>
+          <w:i w:val="false"/>
+          <w:iCs w:val="false"/>
+          <w:color w:val="000000"/>
+          <w:sz w:val="24"/>
+          <w:szCs w:val="24"/>
+        </w:rPr>
+        <w:t xml:space="preserve">A real shop story</w:t>
+      </w:r>
+    </w:p>
+    <w:p>
+      <w:pPr>
+        <w:spacing w:after="160" w:before="0" w:line="276"/>
+        <w:jc w:val="left"/>
+      </w:pPr>
+      <w:r>
+        <w:rPr>
+          <w:rFonts w:ascii="Calibri" w:cs="Calibri" w:eastAsia="Calibri" w:hAnsi="Calibri"/>
+          <w:b w:val="false"/>
+          <w:bCs w:val="false"/>
+          <w:i w:val="false"/>
+          <w:iCs w:val="false"/>
+          <w:color w:val="000000"/>
+          <w:sz w:val="22"/>
+          <w:szCs w:val="22"/>
+        </w:rPr>
+        <w:t xml:space="preserve">Techvaults is helping Abu Twins load the three shops. They are given the Stock uploader login. They load the item list, the shelf counts, and every IMEI in all three shops. At no point can they open Money in and out, ring up a sale, or see what a customer owes.</w:t>
+      </w:r>
+    </w:p>
+    <w:p>
+      <w:pPr>
+        <w:pStyle w:val="Heading3"/>
+        <w:spacing w:after="80" w:before="200"/>
+      </w:pPr>
+      <w:r>
+        <w:rPr>
+          <w:rFonts w:ascii="Calibri" w:cs="Calibri" w:eastAsia="Calibri" w:hAnsi="Calibri"/>
+          <w:b/>
+          <w:bCs/>
+          <w:i w:val="false"/>
+          <w:iCs w:val="false"/>
+          <w:color w:val="000000"/>
+          <w:sz w:val="24"/>
+          <w:szCs w:val="24"/>
+        </w:rPr>
+        <w:t xml:space="preserve">How to try it</w:t>
+      </w:r>
+    </w:p>
+    <w:p>
+      <w:pPr>
+        <w:spacing w:after="80" w:line="276"/>
+      </w:pPr>
+      <w:r>
+        <w:rPr>
+          <w:rFonts w:ascii="Calibri" w:cs="Calibri" w:eastAsia="Calibri" w:hAnsi="Calibri"/>
+          <w:b/>
+          <w:bCs/>
+          <w:i w:val="false"/>
+          <w:iCs w:val="false"/>
+          <w:color w:val="000000"/>
+          <w:sz w:val="22"/>
+          <w:szCs w:val="22"/>
+        </w:rPr>
+        <w:t xml:space="preserve">1. </w:t>
+      </w:r>
+      <w:r>
+        <w:rPr>
+          <w:rFonts w:ascii="Calibri" w:cs="Calibri" w:eastAsia="Calibri" w:hAnsi="Calibri"/>
+          <w:b w:val="false"/>
+          <w:bCs w:val="false"/>
+          <w:i w:val="false"/>
+          <w:iCs w:val="false"/>
+          <w:color w:val="000000"/>
+          <w:sz w:val="22"/>
+          <w:szCs w:val="22"/>
+        </w:rPr>
+        <w:t xml:space="preserve">Sign in as uploader@abutwins.com.</w:t>
+      </w:r>
+    </w:p>
+    <w:p>
+      <w:pPr>
+        <w:spacing w:after="80" w:line="276"/>
+      </w:pPr>
+      <w:r>
+        <w:rPr>
+          <w:rFonts w:ascii="Calibri" w:cs="Calibri" w:eastAsia="Calibri" w:hAnsi="Calibri"/>
+          <w:b/>
+          <w:bCs/>
+          <w:i w:val="false"/>
+          <w:iCs w:val="false"/>
+          <w:color w:val="000000"/>
+          <w:sz w:val="22"/>
+          <w:szCs w:val="22"/>
+        </w:rPr>
+        <w:t xml:space="preserve">2. </w:t>
+      </w:r>
+      <w:r>
+        <w:rPr>
+          <w:rFonts w:ascii="Calibri" w:cs="Calibri" w:eastAsia="Calibri" w:hAnsi="Calibri"/>
+          <w:b w:val="false"/>
+          <w:bCs w:val="false"/>
+          <w:i w:val="false"/>
+          <w:iCs w:val="false"/>
+          <w:color w:val="000000"/>
+          <w:sz w:val="22"/>
+          <w:szCs w:val="22"/>
+        </w:rPr>
+        <w:t xml:space="preserve">Look at the left menu and note how short it is.</w:t>
+      </w:r>
+    </w:p>
+    <w:p>
+      <w:pPr>
+        <w:spacing w:after="80" w:line="276"/>
+      </w:pPr>
+      <w:r>
+        <w:rPr>
+          <w:rFonts w:ascii="Calibri" w:cs="Calibri" w:eastAsia="Calibri" w:hAnsi="Calibri"/>
+          <w:b/>
+          <w:bCs/>
+          <w:i w:val="false"/>
+          <w:iCs w:val="false"/>
+          <w:color w:val="000000"/>
+          <w:sz w:val="22"/>
+          <w:szCs w:val="22"/>
+        </w:rPr>
+        <w:t xml:space="preserve">3. </w:t>
+      </w:r>
+      <w:r>
+        <w:rPr>
+          <w:rFonts w:ascii="Calibri" w:cs="Calibri" w:eastAsia="Calibri" w:hAnsi="Calibri"/>
+          <w:b w:val="false"/>
+          <w:bCs w:val="false"/>
+          <w:i w:val="false"/>
+          <w:iCs w:val="false"/>
+          <w:color w:val="000000"/>
+          <w:sz w:val="22"/>
+          <w:szCs w:val="22"/>
+        </w:rPr>
+        <w:t xml:space="preserve">Type /finance at the end of the web address and press enter.</w:t>
+      </w:r>
+    </w:p>
+    <w:p>
+      <w:pPr>
+        <w:spacing w:after="80" w:line="276"/>
+      </w:pPr>
+      <w:r>
+        <w:rPr>
+          <w:rFonts w:ascii="Calibri" w:cs="Calibri" w:eastAsia="Calibri" w:hAnsi="Calibri"/>
+          <w:b/>
+          <w:bCs/>
+          <w:i w:val="false"/>
+          <w:iCs w:val="false"/>
+          <w:color w:val="000000"/>
+          <w:sz w:val="22"/>
+          <w:szCs w:val="22"/>
+        </w:rPr>
+        <w:t xml:space="preserve">4. </w:t>
+      </w:r>
+      <w:r>
+        <w:rPr>
+          <w:rFonts w:ascii="Calibri" w:cs="Calibri" w:eastAsia="Calibri" w:hAnsi="Calibri"/>
+          <w:b w:val="false"/>
+          <w:bCs w:val="false"/>
+          <w:i w:val="false"/>
+          <w:iCs w:val="false"/>
+          <w:color w:val="000000"/>
+          <w:sz w:val="22"/>
+          <w:szCs w:val="22"/>
+        </w:rPr>
+        <w:t xml:space="preserve">Try /pos, /sales, and /staff the same way.</w:t>
+      </w:r>
+    </w:p>
+    <w:p>
+      <w:pPr>
+        <w:spacing w:after="80" w:line="276"/>
+      </w:pPr>
+      <w:r>
+        <w:rPr>
+          <w:rFonts w:ascii="Calibri" w:cs="Calibri" w:eastAsia="Calibri" w:hAnsi="Calibri"/>
+          <w:b/>
+          <w:bCs/>
+          <w:i w:val="false"/>
+          <w:iCs w:val="false"/>
+          <w:color w:val="000000"/>
+          <w:sz w:val="22"/>
+          <w:szCs w:val="22"/>
+        </w:rPr>
+        <w:t xml:space="preserve">5. </w:t>
+      </w:r>
+      <w:r>
+        <w:rPr>
+          <w:rFonts w:ascii="Calibri" w:cs="Calibri" w:eastAsia="Calibri" w:hAnsi="Calibri"/>
+          <w:b w:val="false"/>
+          <w:bCs w:val="false"/>
+          <w:i w:val="false"/>
+          <w:iCs w:val="false"/>
+          <w:color w:val="000000"/>
+          <w:sz w:val="22"/>
+          <w:szCs w:val="22"/>
+        </w:rPr>
+        <w:t xml:space="preserve">Sign in as manager@abutwins.com and try to open Upload stock.</w:t>
+      </w:r>
+    </w:p>
+    <w:p>
+      <w:pPr>
+        <w:spacing w:after="80" w:line="276"/>
+      </w:pPr>
+      <w:r>
+        <w:rPr>
+          <w:rFonts w:ascii="Calibri" w:cs="Calibri" w:eastAsia="Calibri" w:hAnsi="Calibri"/>
+          <w:b/>
+          <w:bCs/>
+          <w:i w:val="false"/>
+          <w:iCs w:val="false"/>
+          <w:color w:val="000000"/>
+          <w:sz w:val="22"/>
+          <w:szCs w:val="22"/>
+        </w:rPr>
+        <w:t xml:space="preserve">6. </w:t>
+      </w:r>
+      <w:r>
+        <w:rPr>
+          <w:rFonts w:ascii="Calibri" w:cs="Calibri" w:eastAsia="Calibri" w:hAnsi="Calibri"/>
+          <w:b w:val="false"/>
+          <w:bCs w:val="false"/>
+          <w:i w:val="false"/>
+          <w:iCs w:val="false"/>
+          <w:color w:val="000000"/>
+          <w:sz w:val="22"/>
+          <w:szCs w:val="22"/>
+        </w:rPr>
+        <w:t xml:space="preserve">Sign in as admin@abutwins.com and open Who did what.</w:t>
+      </w:r>
+    </w:p>
+    <w:p>
+      <w:pPr>
+        <w:pStyle w:val="Heading3"/>
+        <w:spacing w:after="80" w:before="200"/>
+      </w:pPr>
+      <w:r>
+        <w:rPr>
+          <w:rFonts w:ascii="Calibri" w:cs="Calibri" w:eastAsia="Calibri" w:hAnsi="Calibri"/>
+          <w:b/>
+          <w:bCs/>
+          <w:i w:val="false"/>
+          <w:iCs w:val="false"/>
+          <w:color w:val="000000"/>
+          <w:sz w:val="24"/>
+          <w:szCs w:val="24"/>
+        </w:rPr>
+        <w:t xml:space="preserve">What you should see</w:t>
+      </w:r>
+    </w:p>
+    <w:p>
+      <w:pPr>
+        <w:pStyle w:val="ListParagraph"/>
+        <w:numPr>
+          <w:ilvl w:val="0"/>
+          <w:numId w:val="2"/>
+        </w:numPr>
+        <w:spacing w:after="80" w:line="276"/>
+      </w:pPr>
+      <w:r>
+        <w:rPr>
+          <w:rFonts w:ascii="Calibri" w:cs="Calibri" w:eastAsia="Calibri" w:hAnsi="Calibri"/>
+          <w:b w:val="false"/>
+          <w:bCs w:val="false"/>
+          <w:i w:val="false"/>
+          <w:iCs w:val="false"/>
+          <w:color w:val="000000"/>
+          <w:sz w:val="22"/>
+          <w:szCs w:val="22"/>
+        </w:rPr>
+        <w:t xml:space="preserve">The uploader is sent back to Home from any page outside its job.</w:t>
+      </w:r>
+    </w:p>
+    <w:p>
+      <w:pPr>
+        <w:pStyle w:val="ListParagraph"/>
+        <w:numPr>
+          <w:ilvl w:val="0"/>
+          <w:numId w:val="2"/>
+        </w:numPr>
+        <w:spacing w:after="80" w:line="276"/>
+      </w:pPr>
+      <w:r>
+        <w:rPr>
+          <w:rFonts w:ascii="Calibri" w:cs="Calibri" w:eastAsia="Calibri" w:hAnsi="Calibri"/>
+          <w:b w:val="false"/>
+          <w:bCs w:val="false"/>
+          <w:i w:val="false"/>
+          <w:iCs w:val="false"/>
+          <w:color w:val="000000"/>
+          <w:sz w:val="22"/>
+          <w:szCs w:val="22"/>
+        </w:rPr>
+        <w:t xml:space="preserve">A shop manager cannot open Upload stock at all.</w:t>
+      </w:r>
+    </w:p>
+    <w:p>
+      <w:pPr>
+        <w:pStyle w:val="ListParagraph"/>
+        <w:numPr>
+          <w:ilvl w:val="0"/>
+          <w:numId w:val="2"/>
+        </w:numPr>
+        <w:spacing w:after="80" w:line="276"/>
+      </w:pPr>
+      <w:r>
+        <w:rPr>
+          <w:rFonts w:ascii="Calibri" w:cs="Calibri" w:eastAsia="Calibri" w:hAnsi="Calibri"/>
+          <w:b w:val="false"/>
+          <w:bCs w:val="false"/>
+          <w:i w:val="false"/>
+          <w:iCs w:val="false"/>
+          <w:color w:val="000000"/>
+          <w:sz w:val="22"/>
+          <w:szCs w:val="22"/>
+        </w:rPr>
+        <w:t xml:space="preserve">Super Admin can still do everything, including uploading.</w:t>
+      </w:r>
+    </w:p>
+    <w:p>
+      <w:pPr>
+        <w:pStyle w:val="ListParagraph"/>
+        <w:numPr>
+          <w:ilvl w:val="0"/>
+          <w:numId w:val="2"/>
+        </w:numPr>
+        <w:spacing w:after="80" w:line="276"/>
+      </w:pPr>
+      <w:r>
+        <w:rPr>
+          <w:rFonts w:ascii="Calibri" w:cs="Calibri" w:eastAsia="Calibri" w:hAnsi="Calibri"/>
+          <w:b w:val="false"/>
+          <w:bCs w:val="false"/>
+          <w:i w:val="false"/>
+          <w:iCs w:val="false"/>
+          <w:color w:val="000000"/>
+          <w:sz w:val="22"/>
+          <w:szCs w:val="22"/>
+        </w:rPr>
+        <w:t xml:space="preserve">The CEO can see every figure in the business but does not load data. That is the uploader's job.</w:t>
+      </w:r>
+    </w:p>
+    <w:p>
+      <w:pPr>
+        <w:pStyle w:val="ListParagraph"/>
+        <w:numPr>
+          <w:ilvl w:val="0"/>
+          <w:numId w:val="2"/>
+        </w:numPr>
+        <w:spacing w:after="80" w:line="276"/>
+      </w:pPr>
+      <w:r>
+        <w:rPr>
+          <w:rFonts w:ascii="Calibri" w:cs="Calibri" w:eastAsia="Calibri" w:hAnsi="Calibri"/>
+          <w:b w:val="false"/>
+          <w:bCs w:val="false"/>
+          <w:i w:val="false"/>
+          <w:iCs w:val="false"/>
+          <w:color w:val="000000"/>
+          <w:sz w:val="22"/>
+          <w:szCs w:val="22"/>
+        </w:rPr>
+        <w:t xml:space="preserve">Every refused attempt is written into Who did what as a high-risk line, with the job that tried it.</w:t>
+      </w:r>
+    </w:p>
+    <w:p>
+      <w:pPr>
+        <w:pStyle w:val="Heading2"/>
+        <w:spacing w:after="120" w:before="280"/>
+      </w:pPr>
+      <w:r>
+        <w:rPr>
+          <w:rFonts w:ascii="Calibri" w:cs="Calibri" w:eastAsia="Calibri" w:hAnsi="Calibri"/>
+          <w:b/>
+          <w:bCs/>
+          <w:i w:val="false"/>
+          <w:iCs w:val="false"/>
+          <w:color w:val="000000"/>
+          <w:sz w:val="26"/>
+          <w:szCs w:val="26"/>
+        </w:rPr>
+        <w:t xml:space="preserve">10.41 Receipts. What the customer goes home with</w:t>
+      </w:r>
+    </w:p>
+    <w:p>
+      <w:pPr>
+        <w:pStyle w:val="Heading3"/>
+        <w:spacing w:after="80" w:before="200"/>
+      </w:pPr>
+      <w:r>
+        <w:rPr>
+          <w:rFonts w:ascii="Calibri" w:cs="Calibri" w:eastAsia="Calibri" w:hAnsi="Calibri"/>
+          <w:b/>
+          <w:bCs/>
+          <w:i w:val="false"/>
+          <w:iCs w:val="false"/>
+          <w:color w:val="000000"/>
+          <w:sz w:val="24"/>
+          <w:szCs w:val="24"/>
+        </w:rPr>
+        <w:t xml:space="preserve">What this page is</w:t>
+      </w:r>
+    </w:p>
+    <w:p>
+      <w:pPr>
+        <w:spacing w:after="160" w:before="0" w:line="276"/>
+        <w:jc w:val="left"/>
+      </w:pPr>
+      <w:r>
+        <w:rPr>
+          <w:rFonts w:ascii="Calibri" w:cs="Calibri" w:eastAsia="Calibri" w:hAnsi="Calibri"/>
+          <w:b w:val="false"/>
+          <w:bCs w:val="false"/>
+          <w:i w:val="false"/>
+          <w:iCs w:val="false"/>
+          <w:color w:val="000000"/>
+          <w:sz w:val="22"/>
+          <w:szCs w:val="22"/>
+        </w:rPr>
+        <w:t xml:space="preserve">Every finished sale can be handed over three ways. Printed from the sale, saved as a file to send to the customer, or printed for a whole stretch of days at once from Sales.</w:t>
+      </w:r>
+    </w:p>
+    <w:p>
+      <w:pPr>
+        <w:pStyle w:val="Heading3"/>
+        <w:spacing w:after="80" w:before="200"/>
+      </w:pPr>
+      <w:r>
+        <w:rPr>
+          <w:rFonts w:ascii="Calibri" w:cs="Calibri" w:eastAsia="Calibri" w:hAnsi="Calibri"/>
+          <w:b/>
+          <w:bCs/>
+          <w:i w:val="false"/>
+          <w:iCs w:val="false"/>
+          <w:color w:val="000000"/>
+          <w:sz w:val="24"/>
+          <w:szCs w:val="24"/>
+        </w:rPr>
+        <w:t xml:space="preserve">Why it is here</w:t>
+      </w:r>
+    </w:p>
+    <w:p>
+      <w:pPr>
+        <w:spacing w:after="160" w:before="0" w:line="276"/>
+        <w:jc w:val="left"/>
+      </w:pPr>
+      <w:r>
+        <w:rPr>
+          <w:rFonts w:ascii="Calibri" w:cs="Calibri" w:eastAsia="Calibri" w:hAnsi="Calibri"/>
+          <w:b w:val="false"/>
+          <w:bCs w:val="false"/>
+          <w:i w:val="false"/>
+          <w:iCs w:val="false"/>
+          <w:color w:val="000000"/>
+          <w:sz w:val="22"/>
+          <w:szCs w:val="22"/>
+        </w:rPr>
+        <w:t xml:space="preserve">A customer who has spent several hundred thousand naira on a phone wants something in their hand. A customer who comes back in six months with a warranty question needs the shop to find that sale. And accounts want the day's receipts together, not one at a time.</w:t>
+      </w:r>
+    </w:p>
+    <w:p>
+      <w:pPr>
+        <w:pStyle w:val="Heading3"/>
+        <w:spacing w:after="80" w:before="200"/>
+      </w:pPr>
+      <w:r>
+        <w:rPr>
+          <w:rFonts w:ascii="Calibri" w:cs="Calibri" w:eastAsia="Calibri" w:hAnsi="Calibri"/>
+          <w:b/>
+          <w:bCs/>
+          <w:i w:val="false"/>
+          <w:iCs w:val="false"/>
+          <w:color w:val="000000"/>
+          <w:sz w:val="24"/>
+          <w:szCs w:val="24"/>
+        </w:rPr>
+        <w:t xml:space="preserve">A real shop story</w:t>
+      </w:r>
+    </w:p>
+    <w:p>
+      <w:pPr>
+        <w:spacing w:after="160" w:before="0" w:line="276"/>
+        <w:jc w:val="left"/>
+      </w:pPr>
+      <w:r>
+        <w:rPr>
+          <w:rFonts w:ascii="Calibri" w:cs="Calibri" w:eastAsia="Calibri" w:hAnsi="Calibri"/>
+          <w:b w:val="false"/>
+          <w:bCs w:val="false"/>
+          <w:i w:val="false"/>
+          <w:iCs w:val="false"/>
+          <w:color w:val="000000"/>
+          <w:sz w:val="22"/>
+          <w:szCs w:val="22"/>
+        </w:rPr>
+        <w:t xml:space="preserve">Blessing finishes a sale at Iwo Road. The receipt opens and starts printing on its own while the customer is still at the counter. Later the customer asks for a copy on WhatsApp, so Blessing opens the sale and saves the receipt as a file to send. At the end of the month, accounts opens Sales, picks the first and last day, and downloads every receipt for that stretch in one file.</w:t>
+      </w:r>
+    </w:p>
+    <w:p>
+      <w:pPr>
+        <w:pStyle w:val="Heading3"/>
+        <w:spacing w:after="80" w:before="200"/>
+      </w:pPr>
+      <w:r>
+        <w:rPr>
+          <w:rFonts w:ascii="Calibri" w:cs="Calibri" w:eastAsia="Calibri" w:hAnsi="Calibri"/>
+          <w:b/>
+          <w:bCs/>
+          <w:i w:val="false"/>
+          <w:iCs w:val="false"/>
+          <w:color w:val="000000"/>
+          <w:sz w:val="24"/>
+          <w:szCs w:val="24"/>
+        </w:rPr>
+        <w:t xml:space="preserve">How to try it</w:t>
+      </w:r>
+    </w:p>
+    <w:p>
+      <w:pPr>
+        <w:spacing w:after="80" w:line="276"/>
+      </w:pPr>
+      <w:r>
+        <w:rPr>
+          <w:rFonts w:ascii="Calibri" w:cs="Calibri" w:eastAsia="Calibri" w:hAnsi="Calibri"/>
+          <w:b/>
+          <w:bCs/>
+          <w:i w:val="false"/>
+          <w:iCs w:val="false"/>
+          <w:color w:val="000000"/>
+          <w:sz w:val="22"/>
+          <w:szCs w:val="22"/>
+        </w:rPr>
+        <w:t xml:space="preserve">1. </w:t>
+      </w:r>
+      <w:r>
+        <w:rPr>
+          <w:rFonts w:ascii="Calibri" w:cs="Calibri" w:eastAsia="Calibri" w:hAnsi="Calibri"/>
+          <w:b w:val="false"/>
+          <w:bCs w:val="false"/>
+          <w:i w:val="false"/>
+          <w:iCs w:val="false"/>
+          <w:color w:val="000000"/>
+          <w:sz w:val="22"/>
+          <w:szCs w:val="22"/>
+        </w:rPr>
+        <w:t xml:space="preserve">Sign in as cashier@abutwins.com and complete a sale at Sell now.</w:t>
+      </w:r>
+    </w:p>
+    <w:p>
+      <w:pPr>
+        <w:spacing w:after="80" w:line="276"/>
+      </w:pPr>
+      <w:r>
+        <w:rPr>
+          <w:rFonts w:ascii="Calibri" w:cs="Calibri" w:eastAsia="Calibri" w:hAnsi="Calibri"/>
+          <w:b/>
+          <w:bCs/>
+          <w:i w:val="false"/>
+          <w:iCs w:val="false"/>
+          <w:color w:val="000000"/>
+          <w:sz w:val="22"/>
+          <w:szCs w:val="22"/>
+        </w:rPr>
+        <w:t xml:space="preserve">2. </w:t>
+      </w:r>
+      <w:r>
+        <w:rPr>
+          <w:rFonts w:ascii="Calibri" w:cs="Calibri" w:eastAsia="Calibri" w:hAnsi="Calibri"/>
+          <w:b w:val="false"/>
+          <w:bCs w:val="false"/>
+          <w:i w:val="false"/>
+          <w:iCs w:val="false"/>
+          <w:color w:val="000000"/>
+          <w:sz w:val="22"/>
+          <w:szCs w:val="22"/>
+        </w:rPr>
+        <w:t xml:space="preserve">Watch what happens as soon as the sale is saved.</w:t>
+      </w:r>
+    </w:p>
+    <w:p>
+      <w:pPr>
+        <w:spacing w:after="80" w:line="276"/>
+      </w:pPr>
+      <w:r>
+        <w:rPr>
+          <w:rFonts w:ascii="Calibri" w:cs="Calibri" w:eastAsia="Calibri" w:hAnsi="Calibri"/>
+          <w:b/>
+          <w:bCs/>
+          <w:i w:val="false"/>
+          <w:iCs w:val="false"/>
+          <w:color w:val="000000"/>
+          <w:sz w:val="22"/>
+          <w:szCs w:val="22"/>
+        </w:rPr>
+        <w:t xml:space="preserve">3. </w:t>
+      </w:r>
+      <w:r>
+        <w:rPr>
+          <w:rFonts w:ascii="Calibri" w:cs="Calibri" w:eastAsia="Calibri" w:hAnsi="Calibri"/>
+          <w:b w:val="false"/>
+          <w:bCs w:val="false"/>
+          <w:i w:val="false"/>
+          <w:iCs w:val="false"/>
+          <w:color w:val="000000"/>
+          <w:sz w:val="22"/>
+          <w:szCs w:val="22"/>
+        </w:rPr>
+        <w:t xml:space="preserve">On the same sale, press Download receipt.</w:t>
+      </w:r>
+    </w:p>
+    <w:p>
+      <w:pPr>
+        <w:spacing w:after="80" w:line="276"/>
+      </w:pPr>
+      <w:r>
+        <w:rPr>
+          <w:rFonts w:ascii="Calibri" w:cs="Calibri" w:eastAsia="Calibri" w:hAnsi="Calibri"/>
+          <w:b/>
+          <w:bCs/>
+          <w:i w:val="false"/>
+          <w:iCs w:val="false"/>
+          <w:color w:val="000000"/>
+          <w:sz w:val="22"/>
+          <w:szCs w:val="22"/>
+        </w:rPr>
+        <w:t xml:space="preserve">4. </w:t>
+      </w:r>
+      <w:r>
+        <w:rPr>
+          <w:rFonts w:ascii="Calibri" w:cs="Calibri" w:eastAsia="Calibri" w:hAnsi="Calibri"/>
+          <w:b w:val="false"/>
+          <w:bCs w:val="false"/>
+          <w:i w:val="false"/>
+          <w:iCs w:val="false"/>
+          <w:color w:val="000000"/>
+          <w:sz w:val="22"/>
+          <w:szCs w:val="22"/>
+        </w:rPr>
+        <w:t xml:space="preserve">Open Sales, find Print a stretch of receipts, pick a first and last day, and download.</w:t>
+      </w:r>
+    </w:p>
+    <w:p>
+      <w:pPr>
+        <w:spacing w:after="80" w:line="276"/>
+      </w:pPr>
+      <w:r>
+        <w:rPr>
+          <w:rFonts w:ascii="Calibri" w:cs="Calibri" w:eastAsia="Calibri" w:hAnsi="Calibri"/>
+          <w:b/>
+          <w:bCs/>
+          <w:i w:val="false"/>
+          <w:iCs w:val="false"/>
+          <w:color w:val="000000"/>
+          <w:sz w:val="22"/>
+          <w:szCs w:val="22"/>
+        </w:rPr>
+        <w:t xml:space="preserve">5. </w:t>
+      </w:r>
+      <w:r>
+        <w:rPr>
+          <w:rFonts w:ascii="Calibri" w:cs="Calibri" w:eastAsia="Calibri" w:hAnsi="Calibri"/>
+          <w:b w:val="false"/>
+          <w:bCs w:val="false"/>
+          <w:i w:val="false"/>
+          <w:iCs w:val="false"/>
+          <w:color w:val="000000"/>
+          <w:sz w:val="22"/>
+          <w:szCs w:val="22"/>
+        </w:rPr>
+        <w:t xml:space="preserve">Open a sale from a week ago and check it does not print by itself.</w:t>
+      </w:r>
+    </w:p>
+    <w:p>
+      <w:pPr>
+        <w:pStyle w:val="Heading3"/>
+        <w:spacing w:after="80" w:before="200"/>
+      </w:pPr>
+      <w:r>
+        <w:rPr>
+          <w:rFonts w:ascii="Calibri" w:cs="Calibri" w:eastAsia="Calibri" w:hAnsi="Calibri"/>
+          <w:b/>
+          <w:bCs/>
+          <w:i w:val="false"/>
+          <w:iCs w:val="false"/>
+          <w:color w:val="000000"/>
+          <w:sz w:val="24"/>
+          <w:szCs w:val="24"/>
+        </w:rPr>
+        <w:t xml:space="preserve">What you should see</w:t>
+      </w:r>
+    </w:p>
+    <w:p>
+      <w:pPr>
+        <w:pStyle w:val="ListParagraph"/>
+        <w:numPr>
+          <w:ilvl w:val="0"/>
+          <w:numId w:val="2"/>
+        </w:numPr>
+        <w:spacing w:after="80" w:line="276"/>
+      </w:pPr>
+      <w:r>
+        <w:rPr>
+          <w:rFonts w:ascii="Calibri" w:cs="Calibri" w:eastAsia="Calibri" w:hAnsi="Calibri"/>
+          <w:b w:val="false"/>
+          <w:bCs w:val="false"/>
+          <w:i w:val="false"/>
+          <w:iCs w:val="false"/>
+          <w:color w:val="000000"/>
+          <w:sz w:val="22"/>
+          <w:szCs w:val="22"/>
+        </w:rPr>
+        <w:t xml:space="preserve">Finishing a sale opens the receipt and the print box appears on its own.</w:t>
+      </w:r>
+    </w:p>
+    <w:p>
+      <w:pPr>
+        <w:pStyle w:val="ListParagraph"/>
+        <w:numPr>
+          <w:ilvl w:val="0"/>
+          <w:numId w:val="2"/>
+        </w:numPr>
+        <w:spacing w:after="80" w:line="276"/>
+      </w:pPr>
+      <w:r>
+        <w:rPr>
+          <w:rFonts w:ascii="Calibri" w:cs="Calibri" w:eastAsia="Calibri" w:hAnsi="Calibri"/>
+          <w:b w:val="false"/>
+          <w:bCs w:val="false"/>
+          <w:i w:val="false"/>
+          <w:iCs w:val="false"/>
+          <w:color w:val="000000"/>
+          <w:sz w:val="22"/>
+          <w:szCs w:val="22"/>
+        </w:rPr>
+        <w:t xml:space="preserve">Download receipt saves a file named after the invoice number.</w:t>
+      </w:r>
+    </w:p>
+    <w:p>
+      <w:pPr>
+        <w:pStyle w:val="ListParagraph"/>
+        <w:numPr>
+          <w:ilvl w:val="0"/>
+          <w:numId w:val="2"/>
+        </w:numPr>
+        <w:spacing w:after="80" w:line="276"/>
+      </w:pPr>
+      <w:r>
+        <w:rPr>
+          <w:rFonts w:ascii="Calibri" w:cs="Calibri" w:eastAsia="Calibri" w:hAnsi="Calibri"/>
+          <w:b w:val="false"/>
+          <w:bCs w:val="false"/>
+          <w:i w:val="false"/>
+          <w:iCs w:val="false"/>
+          <w:color w:val="000000"/>
+          <w:sz w:val="22"/>
+          <w:szCs w:val="22"/>
+        </w:rPr>
+        <w:t xml:space="preserve">The receipt shows the shop, the IMEI of each phone, the warranty, what was paid, and anything still owing.</w:t>
+      </w:r>
+    </w:p>
+    <w:p>
+      <w:pPr>
+        <w:pStyle w:val="ListParagraph"/>
+        <w:numPr>
+          <w:ilvl w:val="0"/>
+          <w:numId w:val="2"/>
+        </w:numPr>
+        <w:spacing w:after="80" w:line="276"/>
+      </w:pPr>
+      <w:r>
+        <w:rPr>
+          <w:rFonts w:ascii="Calibri" w:cs="Calibri" w:eastAsia="Calibri" w:hAnsi="Calibri"/>
+          <w:b w:val="false"/>
+          <w:bCs w:val="false"/>
+          <w:i w:val="false"/>
+          <w:iCs w:val="false"/>
+          <w:color w:val="000000"/>
+          <w:sz w:val="22"/>
+          <w:szCs w:val="22"/>
+        </w:rPr>
+        <w:t xml:space="preserve">A stretch of days downloads as one file with one receipt to a page.</w:t>
+      </w:r>
+    </w:p>
+    <w:p>
+      <w:pPr>
+        <w:pStyle w:val="ListParagraph"/>
+        <w:numPr>
+          <w:ilvl w:val="0"/>
+          <w:numId w:val="2"/>
+        </w:numPr>
+        <w:spacing w:after="80" w:line="276"/>
+      </w:pPr>
+      <w:r>
+        <w:rPr>
+          <w:rFonts w:ascii="Calibri" w:cs="Calibri" w:eastAsia="Calibri" w:hAnsi="Calibri"/>
+          <w:b w:val="false"/>
+          <w:bCs w:val="false"/>
+          <w:i w:val="false"/>
+          <w:iCs w:val="false"/>
+          <w:color w:val="000000"/>
+          <w:sz w:val="22"/>
+          <w:szCs w:val="22"/>
+        </w:rPr>
+        <w:t xml:space="preserve">Opening an old sale later shows the receipt but does not print by itself.</w:t>
+      </w:r>
+    </w:p>
+    <w:p>
+      <w:pPr>
+        <w:pStyle w:val="ListParagraph"/>
+        <w:numPr>
+          <w:ilvl w:val="0"/>
+          <w:numId w:val="2"/>
+        </w:numPr>
+        <w:spacing w:after="80" w:line="276"/>
+      </w:pPr>
+      <w:r>
+        <w:rPr>
+          <w:rFonts w:ascii="Calibri" w:cs="Calibri" w:eastAsia="Calibri" w:hAnsi="Calibri"/>
+          <w:b w:val="false"/>
+          <w:bCs w:val="false"/>
+          <w:i w:val="false"/>
+          <w:iCs w:val="false"/>
+          <w:color w:val="000000"/>
+          <w:sz w:val="22"/>
+          <w:szCs w:val="22"/>
+        </w:rPr>
+        <w:t xml:space="preserve">None of this changes the sale. A receipt only reprints what the sale already says.</w:t>
+      </w:r>
+    </w:p>
+    <w:p>
+      <w:pPr>
         <w:pStyle w:val="Heading1"/>
         <w:pageBreakBefore/>
         <w:pBdr>
@@ -26702,7 +28509,7 @@
           <w:sz w:val="22"/>
           <w:szCs w:val="22"/>
         </w:rPr>
-        <w:t xml:space="preserve">There are nineteen practice logins: four at head office and five in each of the three shops. That is every job, in every shop, so any workflow in this book can be tried by the person who would really do it.</w:t>
+        <w:t xml:space="preserve">There are twenty practice logins: five at head office and five in each of the three shops. That is every job, in every shop, so any workflow in this book can be tried by the person who would really do it.</w:t>
       </w:r>
     </w:p>
     <w:p>
@@ -27508,6 +29315,159 @@
           </w:p>
         </w:tc>
       </w:tr>
+      <w:tr>
+        <w:trPr>
+          <w:trHeight w:val="320" w:hRule="atLeast"/>
+        </w:trPr>
+        <w:tc>
+          <w:tcPr>
+            <w:tcW w:type="dxa" w:w="2000"/>
+            <w:tcBorders>
+              <w:top w:val="single" w:color="000000" w:sz="8"/>
+              <w:left w:val="single" w:color="000000" w:sz="8"/>
+              <w:bottom w:val="single" w:color="000000" w:sz="8"/>
+              <w:right w:val="single" w:color="000000" w:sz="8"/>
+            </w:tcBorders>
+            <w:shd w:fill="FFFFFF" w:color="FFFFFF" w:val="clear"/>
+            <w:tcMar>
+              <w:top w:type="dxa" w:w="60"/>
+              <w:left w:type="dxa" w:w="80"/>
+              <w:bottom w:type="dxa" w:w="60"/>
+              <w:right w:type="dxa" w:w="80"/>
+            </w:tcMar>
+            <w:vAlign w:val="center"/>
+          </w:tcPr>
+          <w:p>
+            <w:pPr>
+              <w:jc w:val="left"/>
+            </w:pPr>
+            <w:r>
+              <w:rPr>
+                <w:rFonts w:ascii="Calibri" w:cs="Calibri" w:eastAsia="Calibri" w:hAnsi="Calibri"/>
+                <w:b w:val="false"/>
+                <w:bCs w:val="false"/>
+                <w:i w:val="false"/>
+                <w:iCs w:val="false"/>
+                <w:color w:val="000000"/>
+                <w:sz w:val="20"/>
+                <w:szCs w:val="20"/>
+              </w:rPr>
+              <w:t xml:space="preserve">Stock uploader</w:t>
+            </w:r>
+          </w:p>
+        </w:tc>
+        <w:tc>
+          <w:tcPr>
+            <w:tcW w:type="dxa" w:w="2400"/>
+            <w:tcBorders>
+              <w:top w:val="single" w:color="000000" w:sz="8"/>
+              <w:left w:val="single" w:color="000000" w:sz="8"/>
+              <w:bottom w:val="single" w:color="000000" w:sz="8"/>
+              <w:right w:val="single" w:color="000000" w:sz="8"/>
+            </w:tcBorders>
+            <w:shd w:fill="FFFFFF" w:color="FFFFFF" w:val="clear"/>
+            <w:tcMar>
+              <w:top w:type="dxa" w:w="60"/>
+              <w:left w:type="dxa" w:w="80"/>
+              <w:bottom w:type="dxa" w:w="60"/>
+              <w:right w:type="dxa" w:w="80"/>
+            </w:tcMar>
+            <w:vAlign w:val="center"/>
+          </w:tcPr>
+          <w:p>
+            <w:pPr>
+              <w:jc w:val="left"/>
+            </w:pPr>
+            <w:r>
+              <w:rPr>
+                <w:rFonts w:ascii="Calibri" w:cs="Calibri" w:eastAsia="Calibri" w:hAnsi="Calibri"/>
+                <w:b w:val="false"/>
+                <w:bCs w:val="false"/>
+                <w:i w:val="false"/>
+                <w:iCs w:val="false"/>
+                <w:color w:val="000000"/>
+                <w:sz w:val="20"/>
+                <w:szCs w:val="20"/>
+              </w:rPr>
+              <w:t xml:space="preserve">Data Uploader</w:t>
+            </w:r>
+          </w:p>
+        </w:tc>
+        <w:tc>
+          <w:tcPr>
+            <w:tcW w:type="dxa" w:w="3000"/>
+            <w:tcBorders>
+              <w:top w:val="single" w:color="000000" w:sz="8"/>
+              <w:left w:val="single" w:color="000000" w:sz="8"/>
+              <w:bottom w:val="single" w:color="000000" w:sz="8"/>
+              <w:right w:val="single" w:color="000000" w:sz="8"/>
+            </w:tcBorders>
+            <w:shd w:fill="FFFFFF" w:color="FFFFFF" w:val="clear"/>
+            <w:tcMar>
+              <w:top w:type="dxa" w:w="60"/>
+              <w:left w:type="dxa" w:w="80"/>
+              <w:bottom w:type="dxa" w:w="60"/>
+              <w:right w:type="dxa" w:w="80"/>
+            </w:tcMar>
+            <w:vAlign w:val="center"/>
+          </w:tcPr>
+          <w:p>
+            <w:pPr>
+              <w:jc w:val="left"/>
+            </w:pPr>
+            <w:r>
+              <w:rPr>
+                <w:rFonts w:ascii="Calibri" w:cs="Calibri" w:eastAsia="Calibri" w:hAnsi="Calibri"/>
+                <w:b w:val="false"/>
+                <w:bCs w:val="false"/>
+                <w:i w:val="false"/>
+                <w:iCs w:val="false"/>
+                <w:color w:val="000000"/>
+                <w:sz w:val="20"/>
+                <w:szCs w:val="20"/>
+              </w:rPr>
+              <w:t xml:space="preserve">uploader@abutwins.com</w:t>
+            </w:r>
+          </w:p>
+        </w:tc>
+        <w:tc>
+          <w:tcPr>
+            <w:tcW w:type="dxa" w:w="1960"/>
+            <w:tcBorders>
+              <w:top w:val="single" w:color="000000" w:sz="8"/>
+              <w:left w:val="single" w:color="000000" w:sz="8"/>
+              <w:bottom w:val="single" w:color="000000" w:sz="8"/>
+              <w:right w:val="single" w:color="000000" w:sz="8"/>
+            </w:tcBorders>
+            <w:shd w:fill="FFFFFF" w:color="FFFFFF" w:val="clear"/>
+            <w:tcMar>
+              <w:top w:type="dxa" w:w="60"/>
+              <w:left w:type="dxa" w:w="80"/>
+              <w:bottom w:type="dxa" w:w="60"/>
+              <w:right w:type="dxa" w:w="80"/>
+            </w:tcMar>
+            <w:vAlign w:val="center"/>
+          </w:tcPr>
+          <w:p>
+            <w:pPr>
+              <w:jc w:val="left"/>
+            </w:pPr>
+            <w:r>
+              <w:rPr>
+                <w:rFonts w:ascii="Calibri" w:cs="Calibri" w:eastAsia="Calibri" w:hAnsi="Calibri"/>
+                <w:b w:val="false"/>
+                <w:bCs w:val="false"/>
+                <w:i w:val="false"/>
+                <w:iCs w:val="false"/>
+                <w:color w:val="000000"/>
+                <w:sz w:val="20"/>
+                <w:szCs w:val="20"/>
+              </w:rPr>
+              <w:t xml:space="preserve">uploader123</w:t>
+            </w:r>
+          </w:p>
+        </w:tc>
+      </w:tr>
     </w:tbl>
     <w:p>
       <w:pPr>
@@ -31370,6 +33330,164 @@
                 <w:sz w:val="20"/>
                 <w:szCs w:val="20"/>
               </w:rPr>
+              <w:t xml:space="preserve">Loading the shops from an Excel sheet</w:t>
+            </w:r>
+          </w:p>
+        </w:tc>
+        <w:tc>
+          <w:tcPr>
+            <w:tcW w:type="dxa" w:w="4160"/>
+            <w:tcBorders>
+              <w:top w:val="single" w:color="000000" w:sz="8"/>
+              <w:left w:val="single" w:color="000000" w:sz="8"/>
+              <w:bottom w:val="single" w:color="000000" w:sz="8"/>
+              <w:right w:val="single" w:color="000000" w:sz="8"/>
+            </w:tcBorders>
+            <w:shd w:fill="FFFFFF" w:color="FFFFFF" w:val="clear"/>
+            <w:tcMar>
+              <w:top w:type="dxa" w:w="60"/>
+              <w:left w:type="dxa" w:w="80"/>
+              <w:bottom w:type="dxa" w:w="60"/>
+              <w:right w:type="dxa" w:w="80"/>
+            </w:tcMar>
+            <w:vAlign w:val="center"/>
+          </w:tcPr>
+          <w:p>
+            <w:pPr>
+              <w:jc w:val="left"/>
+            </w:pPr>
+            <w:r>
+              <w:rPr>
+                <w:rFonts w:ascii="Calibri" w:cs="Calibri" w:eastAsia="Calibri" w:hAnsi="Calibri"/>
+                <w:b w:val="false"/>
+                <w:bCs w:val="false"/>
+                <w:i w:val="false"/>
+                <w:iCs w:val="false"/>
+                <w:color w:val="000000"/>
+                <w:sz w:val="20"/>
+                <w:szCs w:val="20"/>
+              </w:rPr>
+              <w:t xml:space="preserve">uploader@abutwins.com</w:t>
+            </w:r>
+          </w:p>
+        </w:tc>
+      </w:tr>
+      <w:tr>
+        <w:trPr>
+          <w:trHeight w:val="320" w:hRule="atLeast"/>
+        </w:trPr>
+        <w:tc>
+          <w:tcPr>
+            <w:tcW w:type="dxa" w:w="5200"/>
+            <w:tcBorders>
+              <w:top w:val="single" w:color="000000" w:sz="8"/>
+              <w:left w:val="single" w:color="000000" w:sz="8"/>
+              <w:bottom w:val="single" w:color="000000" w:sz="8"/>
+              <w:right w:val="single" w:color="000000" w:sz="8"/>
+            </w:tcBorders>
+            <w:shd w:fill="F7F7F7" w:color="F7F7F7" w:val="clear"/>
+            <w:tcMar>
+              <w:top w:type="dxa" w:w="60"/>
+              <w:left w:type="dxa" w:w="80"/>
+              <w:bottom w:type="dxa" w:w="60"/>
+              <w:right w:type="dxa" w:w="80"/>
+            </w:tcMar>
+            <w:vAlign w:val="center"/>
+          </w:tcPr>
+          <w:p>
+            <w:pPr>
+              <w:jc w:val="left"/>
+            </w:pPr>
+            <w:r>
+              <w:rPr>
+                <w:rFonts w:ascii="Calibri" w:cs="Calibri" w:eastAsia="Calibri" w:hAnsi="Calibri"/>
+                <w:b w:val="false"/>
+                <w:bCs w:val="false"/>
+                <w:i w:val="false"/>
+                <w:iCs w:val="false"/>
+                <w:color w:val="000000"/>
+                <w:sz w:val="20"/>
+                <w:szCs w:val="20"/>
+              </w:rPr>
+              <w:t xml:space="preserve">Checking that the uploader cannot sell or see money</w:t>
+            </w:r>
+          </w:p>
+        </w:tc>
+        <w:tc>
+          <w:tcPr>
+            <w:tcW w:type="dxa" w:w="4160"/>
+            <w:tcBorders>
+              <w:top w:val="single" w:color="000000" w:sz="8"/>
+              <w:left w:val="single" w:color="000000" w:sz="8"/>
+              <w:bottom w:val="single" w:color="000000" w:sz="8"/>
+              <w:right w:val="single" w:color="000000" w:sz="8"/>
+            </w:tcBorders>
+            <w:shd w:fill="F7F7F7" w:color="F7F7F7" w:val="clear"/>
+            <w:tcMar>
+              <w:top w:type="dxa" w:w="60"/>
+              <w:left w:type="dxa" w:w="80"/>
+              <w:bottom w:type="dxa" w:w="60"/>
+              <w:right w:type="dxa" w:w="80"/>
+            </w:tcMar>
+            <w:vAlign w:val="center"/>
+          </w:tcPr>
+          <w:p>
+            <w:pPr>
+              <w:jc w:val="left"/>
+            </w:pPr>
+            <w:r>
+              <w:rPr>
+                <w:rFonts w:ascii="Calibri" w:cs="Calibri" w:eastAsia="Calibri" w:hAnsi="Calibri"/>
+                <w:b w:val="false"/>
+                <w:bCs w:val="false"/>
+                <w:i w:val="false"/>
+                <w:iCs w:val="false"/>
+                <w:color w:val="000000"/>
+                <w:sz w:val="20"/>
+                <w:szCs w:val="20"/>
+              </w:rPr>
+              <w:t xml:space="preserve">uploader@abutwins.com, then try /pos and /finance</w:t>
+            </w:r>
+          </w:p>
+        </w:tc>
+      </w:tr>
+      <w:tr>
+        <w:trPr>
+          <w:trHeight w:val="320" w:hRule="atLeast"/>
+        </w:trPr>
+        <w:tc>
+          <w:tcPr>
+            <w:tcW w:type="dxa" w:w="5200"/>
+            <w:tcBorders>
+              <w:top w:val="single" w:color="000000" w:sz="8"/>
+              <w:left w:val="single" w:color="000000" w:sz="8"/>
+              <w:bottom w:val="single" w:color="000000" w:sz="8"/>
+              <w:right w:val="single" w:color="000000" w:sz="8"/>
+            </w:tcBorders>
+            <w:shd w:fill="FFFFFF" w:color="FFFFFF" w:val="clear"/>
+            <w:tcMar>
+              <w:top w:type="dxa" w:w="60"/>
+              <w:left w:type="dxa" w:w="80"/>
+              <w:bottom w:type="dxa" w:w="60"/>
+              <w:right w:type="dxa" w:w="80"/>
+            </w:tcMar>
+            <w:vAlign w:val="center"/>
+          </w:tcPr>
+          <w:p>
+            <w:pPr>
+              <w:jc w:val="left"/>
+            </w:pPr>
+            <w:r>
+              <w:rPr>
+                <w:rFonts w:ascii="Calibri" w:cs="Calibri" w:eastAsia="Calibri" w:hAnsi="Calibri"/>
+                <w:b w:val="false"/>
+                <w:bCs w:val="false"/>
+                <w:i w:val="false"/>
+                <w:iCs w:val="false"/>
+                <w:color w:val="000000"/>
+                <w:sz w:val="20"/>
+                <w:szCs w:val="20"/>
+              </w:rPr>
               <w:t xml:space="preserve">Repair steps</w:t>
             </w:r>
           </w:p>
@@ -38205,6 +40323,144 @@
           <w:sz w:val="22"/>
           <w:szCs w:val="22"/>
         </w:rPr>
+        <w:t xml:space="preserve">The item list is loaded centrally. Only Super Admin and the Stock uploader may add items or change prices. Shop managers no longer do.</w:t>
+      </w:r>
+    </w:p>
+    <w:p>
+      <w:pPr>
+        <w:pStyle w:val="ListParagraph"/>
+        <w:numPr>
+          <w:ilvl w:val="0"/>
+          <w:numId w:val="2"/>
+        </w:numPr>
+        <w:spacing w:after="80" w:line="276"/>
+      </w:pPr>
+      <w:r>
+        <w:rPr>
+          <w:rFonts w:ascii="Calibri" w:cs="Calibri" w:eastAsia="Calibri" w:hAnsi="Calibri"/>
+          <w:b w:val="false"/>
+          <w:bCs w:val="false"/>
+          <w:i w:val="false"/>
+          <w:iCs w:val="false"/>
+          <w:color w:val="000000"/>
+          <w:sz w:val="22"/>
+          <w:szCs w:val="22"/>
+        </w:rPr>
+        <w:t xml:space="preserve">A sheet is checked from top to bottom before anything is saved. One bad line means nothing is loaded, and the lines to fix are named.</w:t>
+      </w:r>
+    </w:p>
+    <w:p>
+      <w:pPr>
+        <w:pStyle w:val="ListParagraph"/>
+        <w:numPr>
+          <w:ilvl w:val="0"/>
+          <w:numId w:val="2"/>
+        </w:numPr>
+        <w:spacing w:after="80" w:line="276"/>
+      </w:pPr>
+      <w:r>
+        <w:rPr>
+          <w:rFonts w:ascii="Calibri" w:cs="Calibri" w:eastAsia="Calibri" w:hAnsi="Calibri"/>
+          <w:b w:val="false"/>
+          <w:bCs w:val="false"/>
+          <w:i w:val="false"/>
+          <w:iCs w:val="false"/>
+          <w:color w:val="000000"/>
+          <w:sz w:val="22"/>
+          <w:szCs w:val="22"/>
+        </w:rPr>
+        <w:t xml:space="preserve">Load the item list before anything else. Nothing can be counted or booked in until the system knows what the item is.</w:t>
+      </w:r>
+    </w:p>
+    <w:p>
+      <w:pPr>
+        <w:pStyle w:val="ListParagraph"/>
+        <w:numPr>
+          <w:ilvl w:val="0"/>
+          <w:numId w:val="2"/>
+        </w:numPr>
+        <w:spacing w:after="80" w:line="276"/>
+      </w:pPr>
+      <w:r>
+        <w:rPr>
+          <w:rFonts w:ascii="Calibri" w:cs="Calibri" w:eastAsia="Calibri" w:hAnsi="Calibri"/>
+          <w:b w:val="false"/>
+          <w:bCs w:val="false"/>
+          <w:i w:val="false"/>
+          <w:iCs w:val="false"/>
+          <w:color w:val="000000"/>
+          <w:sz w:val="22"/>
+          <w:szCs w:val="22"/>
+        </w:rPr>
+        <w:t xml:space="preserve">Sending the same sheet twice is safe. A phone or customer already on the system is left exactly as it is.</w:t>
+      </w:r>
+    </w:p>
+    <w:p>
+      <w:pPr>
+        <w:pStyle w:val="ListParagraph"/>
+        <w:numPr>
+          <w:ilvl w:val="0"/>
+          <w:numId w:val="2"/>
+        </w:numPr>
+        <w:spacing w:after="80" w:line="276"/>
+      </w:pPr>
+      <w:r>
+        <w:rPr>
+          <w:rFonts w:ascii="Calibri" w:cs="Calibri" w:eastAsia="Calibri" w:hAnsi="Calibri"/>
+          <w:b w:val="false"/>
+          <w:bCs w:val="false"/>
+          <w:i w:val="false"/>
+          <w:iCs w:val="false"/>
+          <w:color w:val="000000"/>
+          <w:sz w:val="22"/>
+          <w:szCs w:val="22"/>
+        </w:rPr>
+        <w:t xml:space="preserve">A receipt only reprints what the sale already says. Printing one never changes a sale.</w:t>
+      </w:r>
+    </w:p>
+    <w:p>
+      <w:pPr>
+        <w:pStyle w:val="ListParagraph"/>
+        <w:numPr>
+          <w:ilvl w:val="0"/>
+          <w:numId w:val="2"/>
+        </w:numPr>
+        <w:spacing w:after="80" w:line="276"/>
+      </w:pPr>
+      <w:r>
+        <w:rPr>
+          <w:rFonts w:ascii="Calibri" w:cs="Calibri" w:eastAsia="Calibri" w:hAnsi="Calibri"/>
+          <w:b w:val="false"/>
+          <w:bCs w:val="false"/>
+          <w:i w:val="false"/>
+          <w:iCs w:val="false"/>
+          <w:color w:val="000000"/>
+          <w:sz w:val="22"/>
+          <w:szCs w:val="22"/>
+        </w:rPr>
+        <w:t xml:space="preserve">If your job may not open a page, you are sent back to Home and the attempt is written into Who did what.</w:t>
+      </w:r>
+    </w:p>
+    <w:p>
+      <w:pPr>
+        <w:pStyle w:val="ListParagraph"/>
+        <w:numPr>
+          <w:ilvl w:val="0"/>
+          <w:numId w:val="2"/>
+        </w:numPr>
+        <w:spacing w:after="80" w:line="276"/>
+      </w:pPr>
+      <w:r>
+        <w:rPr>
+          <w:rFonts w:ascii="Calibri" w:cs="Calibri" w:eastAsia="Calibri" w:hAnsi="Calibri"/>
+          <w:b w:val="false"/>
+          <w:bCs w:val="false"/>
+          <w:i w:val="false"/>
+          <w:iCs w:val="false"/>
+          <w:color w:val="000000"/>
+          <w:sz w:val="22"/>
+          <w:szCs w:val="22"/>
+        </w:rPr>
         <w:t xml:space="preserve">Check the books does not change any invoice. It reprints the add-up so the accountant and records checker can sign.</w:t>
       </w:r>
     </w:p>
@@ -38996,6 +41252,25 @@
           <w:szCs w:val="22"/>
         </w:rPr>
         <w:t xml:space="preserve">Version 1.15 opens Bodija and keeps each shop's records apart. There are now three shops: Iwo Road, Bodija, and Challenge, each with its own manager, goods intake, cashier, sales person, and repair engineer. A person who works in one shop now sees only that shop's stock, sales, customers, and money, even if they are handed a link to another shop's invoice. Head office gets a shop picker at the top of the screen and can look at the three shops together or one shop on its own. Two tills can no longer sell the same phone. Every button now says when it is working, so a slow line no longer makes staff press twice. Screens keep themselves current, so a sale rung up at another till shows without opening the page again.</w:t>
+      </w:r>
+    </w:p>
+    <w:p>
+      <w:pPr>
+        <w:spacing w:after="160" w:before="0" w:line="276"/>
+        <w:jc w:val="left"/>
+      </w:pPr>
+      <w:r>
+        <w:rPr>
+          <w:rFonts w:ascii="Calibri" w:cs="Calibri" w:eastAsia="Calibri" w:hAnsi="Calibri"/>
+          <w:b w:val="false"/>
+          <w:bCs w:val="false"/>
+          <w:i w:val="false"/>
+          <w:iCs w:val="false"/>
+          <w:color w:val="000000"/>
+          <w:sz w:val="22"/>
+          <w:szCs w:val="22"/>
+        </w:rPr>
+        <w:t xml:space="preserve">Version 1.16 lets the shops be loaded from an Excel or CSV sheet. Upload stock takes the item list, the shelf counts, every phone by IMEI, and customers, in that order, and the later steps stay shut until the item list is in. A sheet is checked from top to bottom before anything is saved, so one bad line loads nothing and names what to fix. A new job, Stock uploader, does only that work: it cannot sell, see money, or approve. Adding items and changing prices moved to that job and Super Admin, so three shops cannot invent three names for one phone. Every sale can now be saved as a receipt file, printed for a stretch of days at once, or printed the moment the sale is finished. Screens are now checked on the server before they are drawn, and a refused visit is written into Who did what.</w:t>
       </w:r>
     </w:p>
     <w:p>

</xml_diff>

<commit_message>
Accept the Abu Twins opening stock Excel as their shops already fill it.
One file per shop with PHONES, ACCESSORIES, SCREEN, and LAPTOPS now loads item names, In shop units, and piece counts from Upload stock, so staff do not retype stock into a new layout.

Co-authored-by: Cursor <cursoragent@cursor.com>
</commit_message>
<xml_diff>
--- a/docs/Abu-Twins-Shop-System-User-Guide.docx
+++ b/docs/Abu-Twins-Shop-System-User-Guide.docx
@@ -459,7 +459,7 @@
                 <w:sz w:val="20"/>
                 <w:szCs w:val="20"/>
               </w:rPr>
-              <w:t xml:space="preserve">1.16</w:t>
+              <w:t xml:space="preserve">1.17</w:t>
             </w:r>
           </w:p>
         </w:tc>
@@ -533,7 +533,7 @@
                 <w:sz w:val="20"/>
                 <w:szCs w:val="20"/>
               </w:rPr>
-              <w:t xml:space="preserve">Updated: Loading the shops from a sheet, the stock uploader job, and receipts</w:t>
+              <w:t xml:space="preserve">Updated: Opening stock uses the Abu Twins shop Excel as it is</w:t>
             </w:r>
           </w:p>
         </w:tc>
@@ -5429,7 +5429,7 @@
                 <w:sz w:val="20"/>
                 <w:szCs w:val="20"/>
               </w:rPr>
-              <w:t xml:space="preserve">Upload list</w:t>
+              <w:t xml:space="preserve">Opening stock sheet</w:t>
             </w:r>
           </w:p>
         </w:tc>
@@ -5466,7 +5466,7 @@
                 <w:sz w:val="20"/>
                 <w:szCs w:val="20"/>
               </w:rPr>
-              <w:t xml:space="preserve">Add many item names from an Excel or CSV file. This does not put stock on the shelf. Use Goods on the way for that.</w:t>
+              <w:t xml:space="preserve">The Excel Abu Twins already uses: one file per shop, with PHONES, ACCESSORIES, SCREEN, and LAPTOPS. Upload it on Upload stock.</w:t>
             </w:r>
           </w:p>
         </w:tc>
@@ -5508,7 +5508,7 @@
                 <w:sz w:val="20"/>
                 <w:szCs w:val="20"/>
               </w:rPr>
-              <w:t xml:space="preserve">Your login</w:t>
+              <w:t xml:space="preserve">Upload list</w:t>
             </w:r>
           </w:p>
         </w:tc>
@@ -5545,7 +5545,7 @@
                 <w:sz w:val="20"/>
                 <w:szCs w:val="20"/>
               </w:rPr>
-              <w:t xml:space="preserve">The page where a person changes their own password.</w:t>
+              <w:t xml:space="preserve">Add many item names from an Excel or CSV file. This does not put stock on the shelf. Use Goods on the way for that.</w:t>
             </w:r>
           </w:p>
         </w:tc>
@@ -5587,7 +5587,7 @@
                 <w:sz w:val="20"/>
                 <w:szCs w:val="20"/>
               </w:rPr>
-              <w:t xml:space="preserve">Shop backup</w:t>
+              <w:t xml:space="preserve">Your login</w:t>
             </w:r>
           </w:p>
         </w:tc>
@@ -5624,7 +5624,7 @@
                 <w:sz w:val="20"/>
                 <w:szCs w:val="20"/>
               </w:rPr>
-              <w:t xml:space="preserve">A Super Admin copy of shops, staff emails, stock, IMEIs, sales, and purchases. Keep that file off this computer.</w:t>
+              <w:t xml:space="preserve">The page where a person changes their own password.</w:t>
             </w:r>
           </w:p>
         </w:tc>
@@ -5666,7 +5666,7 @@
                 <w:sz w:val="20"/>
                 <w:szCs w:val="20"/>
               </w:rPr>
-              <w:t xml:space="preserve">How to use this</w:t>
+              <w:t xml:space="preserve">Shop backup</w:t>
             </w:r>
           </w:p>
         </w:tc>
@@ -5703,7 +5703,7 @@
                 <w:sz w:val="20"/>
                 <w:szCs w:val="20"/>
               </w:rPr>
-              <w:t xml:space="preserve">The handbook for your job. Look up a word. Print the book. It only covers pages you can open.</w:t>
+              <w:t xml:space="preserve">A Super Admin copy of shops, staff emails, stock, IMEIs, sales, and purchases. Keep that file off this computer.</w:t>
             </w:r>
           </w:p>
         </w:tc>
@@ -5745,7 +5745,7 @@
                 <w:sz w:val="20"/>
                 <w:szCs w:val="20"/>
               </w:rPr>
-              <w:t xml:space="preserve">Shop to shop</w:t>
+              <w:t xml:space="preserve">How to use this</w:t>
             </w:r>
           </w:p>
         </w:tc>
@@ -5782,7 +5782,7 @@
                 <w:sz w:val="20"/>
                 <w:szCs w:val="20"/>
               </w:rPr>
-              <w:t xml:space="preserve">Send stock that already belongs to Abu Twins from Iwo Road to Challenge, or the other way. The list is a CSV of IMEIs and accessory lines.</w:t>
+              <w:t xml:space="preserve">The handbook for your job. Look up a word. Print the book. It only covers pages you can open.</w:t>
             </w:r>
           </w:p>
         </w:tc>
@@ -5824,7 +5824,7 @@
                 <w:sz w:val="20"/>
                 <w:szCs w:val="20"/>
               </w:rPr>
-              <w:t xml:space="preserve">Neighbor shop fill</w:t>
+              <w:t xml:space="preserve">Shop to shop</w:t>
             </w:r>
           </w:p>
         </w:tc>
@@ -5861,7 +5861,7 @@
                 <w:sz w:val="20"/>
                 <w:szCs w:val="20"/>
               </w:rPr>
-              <w:t xml:space="preserve">Collect one unit from a neighboring dealer for a named customer. Sell it here. Return their money. Keep the profit.</w:t>
+              <w:t xml:space="preserve">Send stock that already belongs to Abu Twins from Iwo Road to Challenge, or the other way. The list is a CSV of IMEIs and accessory lines.</w:t>
             </w:r>
           </w:p>
         </w:tc>
@@ -5903,7 +5903,7 @@
                 <w:sz w:val="20"/>
                 <w:szCs w:val="20"/>
               </w:rPr>
-              <w:t xml:space="preserve">Expected goods</w:t>
+              <w:t xml:space="preserve">Neighbor shop fill</w:t>
             </w:r>
           </w:p>
         </w:tc>
@@ -5940,7 +5940,7 @@
                 <w:sz w:val="20"/>
                 <w:szCs w:val="20"/>
               </w:rPr>
-              <w:t xml:space="preserve">What a supplier still owes you in units. Coming is not In shop until the carton is checked.</w:t>
+              <w:t xml:space="preserve">Collect one unit from a neighboring dealer for a named customer. Sell it here. Return their money. Keep the profit.</w:t>
             </w:r>
           </w:p>
         </w:tc>
@@ -5982,7 +5982,7 @@
                 <w:sz w:val="20"/>
                 <w:szCs w:val="20"/>
               </w:rPr>
-              <w:t xml:space="preserve">Never scanned versus the bill</w:t>
+              <w:t xml:space="preserve">Expected goods</w:t>
             </w:r>
           </w:p>
         </w:tc>
@@ -6019,7 +6019,7 @@
                 <w:sz w:val="20"/>
                 <w:szCs w:val="20"/>
               </w:rPr>
-              <w:t xml:space="preserve">Units on the supplier bill that were never given an IMEI or piece count on this system.</w:t>
+              <w:t xml:space="preserve">What a supplier still owes you in units. Coming is not In shop until the carton is checked.</w:t>
             </w:r>
           </w:p>
         </w:tc>
@@ -6061,7 +6061,7 @@
                 <w:sz w:val="20"/>
                 <w:szCs w:val="20"/>
               </w:rPr>
-              <w:t xml:space="preserve">Sold today</w:t>
+              <w:t xml:space="preserve">Never scanned versus the bill</w:t>
             </w:r>
           </w:p>
         </w:tc>
@@ -6098,7 +6098,7 @@
                 <w:sz w:val="20"/>
                 <w:szCs w:val="20"/>
               </w:rPr>
-              <w:t xml:space="preserve">Units from that supplier carton that already have an invoice on this Lagos day. Check this before Close the day.</w:t>
+              <w:t xml:space="preserve">Units on the supplier bill that were never given an IMEI or piece count on this system.</w:t>
             </w:r>
           </w:p>
         </w:tc>
@@ -6140,7 +6140,7 @@
                 <w:sz w:val="20"/>
                 <w:szCs w:val="20"/>
               </w:rPr>
-              <w:t xml:space="preserve">Still in shop</w:t>
+              <w:t xml:space="preserve">Sold today</w:t>
             </w:r>
           </w:p>
         </w:tc>
@@ -6177,7 +6177,7 @@
                 <w:sz w:val="20"/>
                 <w:szCs w:val="20"/>
               </w:rPr>
-              <w:t xml:space="preserve">What the system still believes is on the shelf from that carton. If the shelf has fewer, open Stock count.</w:t>
+              <w:t xml:space="preserve">Units from that supplier carton that already have an invoice on this Lagos day. Check this before Close the day.</w:t>
             </w:r>
           </w:p>
         </w:tc>
@@ -6219,7 +6219,7 @@
                 <w:sz w:val="20"/>
                 <w:szCs w:val="20"/>
               </w:rPr>
-              <w:t xml:space="preserve">Stock count</w:t>
+              <w:t xml:space="preserve">Still in shop</w:t>
             </w:r>
           </w:p>
         </w:tc>
@@ -6256,7 +6256,7 @@
                 <w:sz w:val="20"/>
                 <w:szCs w:val="20"/>
               </w:rPr>
-              <w:t xml:space="preserve">Count the shelf with your hands. Compare with the system. A manager must approve before any number changes.</w:t>
+              <w:t xml:space="preserve">What the system still believes is on the shelf from that carton. If the shelf has fewer, open Stock count.</w:t>
             </w:r>
           </w:p>
         </w:tc>
@@ -6298,6 +6298,85 @@
                 <w:sz w:val="20"/>
                 <w:szCs w:val="20"/>
               </w:rPr>
+              <w:t xml:space="preserve">Stock count</w:t>
+            </w:r>
+          </w:p>
+        </w:tc>
+        <w:tc>
+          <w:tcPr>
+            <w:tcW w:type="dxa" w:w="6560"/>
+            <w:tcBorders>
+              <w:top w:val="single" w:color="000000" w:sz="8"/>
+              <w:left w:val="single" w:color="000000" w:sz="8"/>
+              <w:bottom w:val="single" w:color="000000" w:sz="8"/>
+              <w:right w:val="single" w:color="000000" w:sz="8"/>
+            </w:tcBorders>
+            <w:shd w:fill="F7F7F7" w:color="F7F7F7" w:val="clear"/>
+            <w:tcMar>
+              <w:top w:type="dxa" w:w="60"/>
+              <w:left w:type="dxa" w:w="80"/>
+              <w:bottom w:type="dxa" w:w="60"/>
+              <w:right w:type="dxa" w:w="80"/>
+            </w:tcMar>
+            <w:vAlign w:val="center"/>
+          </w:tcPr>
+          <w:p>
+            <w:pPr>
+              <w:jc w:val="left"/>
+            </w:pPr>
+            <w:r>
+              <w:rPr>
+                <w:rFonts w:ascii="Calibri" w:cs="Calibri" w:eastAsia="Calibri" w:hAnsi="Calibri"/>
+                <w:b w:val="false"/>
+                <w:bCs w:val="false"/>
+                <w:i w:val="false"/>
+                <w:iCs w:val="false"/>
+                <w:color w:val="000000"/>
+                <w:sz w:val="20"/>
+                <w:szCs w:val="20"/>
+              </w:rPr>
+              <w:t xml:space="preserve">Count the shelf with your hands. Compare with the system. A manager must approve before any number changes.</w:t>
+            </w:r>
+          </w:p>
+        </w:tc>
+      </w:tr>
+      <w:tr>
+        <w:trPr>
+          <w:trHeight w:val="320" w:hRule="atLeast"/>
+        </w:trPr>
+        <w:tc>
+          <w:tcPr>
+            <w:tcW w:type="dxa" w:w="2800"/>
+            <w:tcBorders>
+              <w:top w:val="single" w:color="000000" w:sz="8"/>
+              <w:left w:val="single" w:color="000000" w:sz="8"/>
+              <w:bottom w:val="single" w:color="000000" w:sz="8"/>
+              <w:right w:val="single" w:color="000000" w:sz="8"/>
+            </w:tcBorders>
+            <w:shd w:fill="FFFFFF" w:color="FFFFFF" w:val="clear"/>
+            <w:tcMar>
+              <w:top w:type="dxa" w:w="60"/>
+              <w:left w:type="dxa" w:w="80"/>
+              <w:bottom w:type="dxa" w:w="60"/>
+              <w:right w:type="dxa" w:w="80"/>
+            </w:tcMar>
+            <w:vAlign w:val="center"/>
+          </w:tcPr>
+          <w:p>
+            <w:pPr>
+              <w:jc w:val="left"/>
+            </w:pPr>
+            <w:r>
+              <w:rPr>
+                <w:rFonts w:ascii="Calibri" w:cs="Calibri" w:eastAsia="Calibri" w:hAnsi="Calibri"/>
+                <w:b w:val="false"/>
+                <w:bCs w:val="false"/>
+                <w:i w:val="false"/>
+                <w:iCs w:val="false"/>
+                <w:color w:val="000000"/>
+                <w:sz w:val="20"/>
+                <w:szCs w:val="20"/>
+              </w:rPr>
               <w:t xml:space="preserve">Profit</w:t>
             </w:r>
           </w:p>
@@ -6311,7 +6390,7 @@
               <w:bottom w:val="single" w:color="000000" w:sz="8"/>
               <w:right w:val="single" w:color="000000" w:sz="8"/>
             </w:tcBorders>
-            <w:shd w:fill="F7F7F7" w:color="F7F7F7" w:val="clear"/>
+            <w:shd w:fill="FFFFFF" w:color="FFFFFF" w:val="clear"/>
             <w:tcMar>
               <w:top w:type="dxa" w:w="60"/>
               <w:left w:type="dxa" w:w="80"/>
@@ -7906,7 +7985,7 @@
                 <w:sz w:val="20"/>
                 <w:szCs w:val="20"/>
               </w:rPr>
-              <w:t xml:space="preserve">Upload the item list, the shelf counts, the phones by IMEI, and customers. Nothing else. No selling, no money, no approving.</w:t>
+              <w:t xml:space="preserve">Upload the Abu Twins opening stock Excel per shop, or the older step-by-step sheets. Nothing else. No selling, no money, no approving.</w:t>
             </w:r>
           </w:p>
         </w:tc>
@@ -9335,7 +9414,7 @@
                 <w:sz w:val="20"/>
                 <w:szCs w:val="20"/>
               </w:rPr>
-              <w:t xml:space="preserve">Phones &amp; items, Phone IMEIs, Shop stock, Goods on the way</w:t>
+              <w:t xml:space="preserve">Phones &amp; items, Upload stock, Phone IMEIs, Shop stock, Goods on the way</w:t>
             </w:r>
           </w:p>
         </w:tc>
@@ -9372,7 +9451,7 @@
                 <w:sz w:val="20"/>
                 <w:szCs w:val="20"/>
               </w:rPr>
-              <w:t xml:space="preserve">What you sell, selling prices, each phone number, what is here, what is still coming.</w:t>
+              <w:t xml:space="preserve">What you sell, loading the shelf from Excel, each phone number, what is here, what is still coming.</w:t>
             </w:r>
           </w:p>
         </w:tc>
@@ -26620,7 +26699,7 @@
           <w:sz w:val="22"/>
           <w:szCs w:val="22"/>
         </w:rPr>
-        <w:t xml:space="preserve">Upload stock is one screen with four steps, in the order the work has to happen. Step 1 is The item list. Step 2 is Pieces on the shelf. Step 3 is Phones by IMEI. Step 4 is Customers. Excel or CSV both work. Steps 2, 3, and 4 stay shut until step 1 is done.</w:t>
+        <w:t xml:space="preserve">Upload stock loads what is on the shelf from Excel. The easiest way is the Abu Twins opening stock workbook: one file for one shop, with tabs named PHONES, ACCESSORIES, SCREEN, and LAPTOPS. The same columns appear on every tab: PRODUCT NAME, BRAND, CATEGORY, QTY/IMEI/SERIAL NO, CONDITION, SPECIFICATION, UNIT COST PRICE, and MIN.SELLING PRICE. Pick the shop, upload the file, and the system adds missing item names, books phones and laptops as In shop, and sets piece counts for cords and screens. Older four-step sheets remain lower on the page for later top-ups.</w:t>
       </w:r>
     </w:p>
     <w:p>
@@ -26658,7 +26737,7 @@
           <w:sz w:val="22"/>
           <w:szCs w:val="22"/>
         </w:rPr>
-        <w:t xml:space="preserve">A shop cannot be put on a computer one line at a time. A container of two hundred phones typed by hand is an evening lost and a night of mistakes. The order is not a suggestion either: nothing can be counted or booked in until the system has been told what the item is. That is why the later steps stay shut until the item list is in.</w:t>
+        <w:t xml:space="preserve">The shop already counts stock in that Excel. Asking them to retype everything into a new Techvaults layout wastes a day and creates mistakes. The software should follow the shop's paper, not the other way around.</w:t>
       </w:r>
     </w:p>
     <w:p>
@@ -26696,7 +26775,7 @@
           <w:sz w:val="22"/>
           <w:szCs w:val="22"/>
         </w:rPr>
-        <w:t xml:space="preserve">Abu Twins is putting Bodija on the system. The uploader sends the item list first: every model, one row each. The screen then opens the other three steps. He sends the shelf counts for cords and chargers, then the container sheet of two hundred and forty IMEIs. Bodija now shows two hundred and forty phones In shop, and Shop stock agrees with the IMEI list, because booking the phones in raised the shelf count at the same time.</w:t>
+        <w:t xml:space="preserve">Iwo Road finishes tonight's count on the opening stock Excel. The uploader opens Upload stock, picks Iwo Road, Ibadan, and uploads that file. Phones with IMEIs appear In shop. Cords show the piece count. Challenge sends its own file the same way. Sell now can start tomorrow on real shelf units.</w:t>
       </w:r>
     </w:p>
     <w:p>
@@ -26746,7 +26825,7 @@
           <w:sz w:val="22"/>
           <w:szCs w:val="22"/>
         </w:rPr>
-        <w:t xml:space="preserve">Sign in as uploader@abutwins.com.</w:t>
+        <w:t xml:space="preserve">Sign in as uploader@abutwins.com or Super Admin.</w:t>
       </w:r>
     </w:p>
     <w:p>
@@ -26808,7 +26887,7 @@
           <w:sz w:val="22"/>
           <w:szCs w:val="22"/>
         </w:rPr>
-        <w:t xml:space="preserve">Read the column names listed under step 1, then prepare your sheet with those names in the first row.</w:t>
+        <w:t xml:space="preserve">Under Abu Twins opening stock sheet, pick the shop this file belongs to.</w:t>
       </w:r>
     </w:p>
     <w:p>
@@ -26839,7 +26918,7 @@
           <w:sz w:val="22"/>
           <w:szCs w:val="22"/>
         </w:rPr>
-        <w:t xml:space="preserve">Upload the item list. Wait for the count at the top right of the step to rise.</w:t>
+        <w:t xml:space="preserve">Upload the shop's opening stock Excel with PHONES, ACCESSORIES, SCREEN, and LAPTOPS filled.</w:t>
       </w:r>
     </w:p>
     <w:p>
@@ -26870,7 +26949,7 @@
           <w:sz w:val="22"/>
           <w:szCs w:val="22"/>
         </w:rPr>
-        <w:t xml:space="preserve">Upload Pieces on the shelf, then Phones by IMEI, then Customers.</w:t>
+        <w:t xml:space="preserve">Open Shop stock and Phone IMEIs. Confirm the numbers match the sheet.</w:t>
       </w:r>
     </w:p>
     <w:p>
@@ -26901,38 +26980,7 @@
           <w:sz w:val="22"/>
           <w:szCs w:val="22"/>
         </w:rPr>
-        <w:t xml:space="preserve">Deliberately put one wrong line in a sheet, such as a shop that does not exist, and upload it.</w:t>
-      </w:r>
-    </w:p>
-    <w:p>
-      <w:pPr>
-        <w:spacing w:after="80" w:line="276"/>
-      </w:pPr>
-      <w:r>
-        <w:rPr>
-          <w:rFonts w:ascii="Calibri" w:cs="Calibri" w:eastAsia="Calibri" w:hAnsi="Calibri"/>
-          <w:b/>
-          <w:bCs/>
-          <w:i w:val="false"/>
-          <w:iCs w:val="false"/>
-          <w:color w:val="000000"/>
-          <w:sz w:val="22"/>
-          <w:szCs w:val="22"/>
-        </w:rPr>
-        <w:t xml:space="preserve">7. </w:t>
-      </w:r>
-      <w:r>
-        <w:rPr>
-          <w:rFonts w:ascii="Calibri" w:cs="Calibri" w:eastAsia="Calibri" w:hAnsi="Calibri"/>
-          <w:b w:val="false"/>
-          <w:bCs w:val="false"/>
-          <w:i w:val="false"/>
-          <w:iCs w:val="false"/>
-          <w:color w:val="000000"/>
-          <w:sz w:val="22"/>
-          <w:szCs w:val="22"/>
-        </w:rPr>
-        <w:t xml:space="preserve">Send the same phones sheet a second time.</w:t>
+        <w:t xml:space="preserve">If a line is wrong, fix the Excel and upload again. Nothing is half loaded.</w:t>
       </w:r>
     </w:p>
     <w:p>
@@ -26974,7 +27022,7 @@
           <w:sz w:val="22"/>
           <w:szCs w:val="22"/>
         </w:rPr>
-        <w:t xml:space="preserve">Steps 2, 3, and 4 are shut with a note until the item list is loaded.</w:t>
+        <w:t xml:space="preserve">The opening stock card is at the top of Upload stock.</w:t>
       </w:r>
     </w:p>
     <w:p>
@@ -26997,7 +27045,7 @@
           <w:sz w:val="22"/>
           <w:szCs w:val="22"/>
         </w:rPr>
-        <w:t xml:space="preserve">Each step shows how far the shop has got, such as how many items are on the list and how many phones are In shop.</w:t>
+        <w:t xml:space="preserve">A good file adds item names, phones In shop, and piece lines for that shop.</w:t>
       </w:r>
     </w:p>
     <w:p>
@@ -27020,7 +27068,7 @@
           <w:sz w:val="22"/>
           <w:szCs w:val="22"/>
         </w:rPr>
-        <w:t xml:space="preserve">A sheet with a bad line loads nothing at all, and names the lines to fix by their spreadsheet line number.</w:t>
+        <w:t xml:space="preserve">A file with a bad line loads nothing and names the tab and line to fix.</w:t>
       </w:r>
     </w:p>
     <w:p>
@@ -27043,7 +27091,7 @@
           <w:sz w:val="22"/>
           <w:szCs w:val="22"/>
         </w:rPr>
-        <w:t xml:space="preserve">Sending the same sheet twice adds nothing the second time. A phone already on the system is left exactly as it is.</w:t>
+        <w:t xml:space="preserve">Sending the same phone twice leaves the first booking alone.</w:t>
       </w:r>
     </w:p>
     <w:p>
@@ -27066,7 +27114,7 @@
           <w:sz w:val="22"/>
           <w:szCs w:val="22"/>
         </w:rPr>
-        <w:t xml:space="preserve">After the phones sheet, Shop stock and Phone IMEIs agree, with no stock count needed.</w:t>
+        <w:t xml:space="preserve">After a good upload, Sell now can find those In shop IMEIs.</w:t>
       </w:r>
     </w:p>
     <w:p>
@@ -27089,30 +27137,7 @@
           <w:sz w:val="22"/>
           <w:szCs w:val="22"/>
         </w:rPr>
-        <w:t xml:space="preserve">Column names are forgiving. Item code, SKU, and code all work. So do IMEI, IMEI1, and phone.</w:t>
-      </w:r>
-    </w:p>
-    <w:p>
-      <w:pPr>
-        <w:pStyle w:val="ListParagraph"/>
-        <w:numPr>
-          <w:ilvl w:val="0"/>
-          <w:numId w:val="2"/>
-        </w:numPr>
-        <w:spacing w:after="80" w:line="276"/>
-      </w:pPr>
-      <w:r>
-        <w:rPr>
-          <w:rFonts w:ascii="Calibri" w:cs="Calibri" w:eastAsia="Calibri" w:hAnsi="Calibri"/>
-          <w:b w:val="false"/>
-          <w:bCs w:val="false"/>
-          <w:i w:val="false"/>
-          <w:iCs w:val="false"/>
-          <w:color w:val="000000"/>
-          <w:sz w:val="22"/>
-          <w:szCs w:val="22"/>
-        </w:rPr>
-        <w:t xml:space="preserve">Shops can be named in full or by their short code: IWO, BOD, CHL.</w:t>
+        <w:t xml:space="preserve">The older four steps are still there for later top-ups.</w:t>
       </w:r>
     </w:p>
     <w:p>
@@ -39796,6 +39821,159 @@
           </w:p>
         </w:tc>
       </w:tr>
+      <w:tr>
+        <w:trPr>
+          <w:trHeight w:val="320" w:hRule="atLeast"/>
+        </w:trPr>
+        <w:tc>
+          <w:tcPr>
+            <w:tcW w:type="dxa" w:w="600"/>
+            <w:tcBorders>
+              <w:top w:val="single" w:color="000000" w:sz="8"/>
+              <w:left w:val="single" w:color="000000" w:sz="8"/>
+              <w:bottom w:val="single" w:color="000000" w:sz="8"/>
+              <w:right w:val="single" w:color="000000" w:sz="8"/>
+            </w:tcBorders>
+            <w:shd w:fill="FFFFFF" w:color="FFFFFF" w:val="clear"/>
+            <w:tcMar>
+              <w:top w:type="dxa" w:w="60"/>
+              <w:left w:type="dxa" w:w="80"/>
+              <w:bottom w:type="dxa" w:w="60"/>
+              <w:right w:type="dxa" w:w="80"/>
+            </w:tcMar>
+            <w:vAlign w:val="center"/>
+          </w:tcPr>
+          <w:p>
+            <w:pPr>
+              <w:jc w:val="left"/>
+            </w:pPr>
+            <w:r>
+              <w:rPr>
+                <w:rFonts w:ascii="Calibri" w:cs="Calibri" w:eastAsia="Calibri" w:hAnsi="Calibri"/>
+                <w:b w:val="false"/>
+                <w:bCs w:val="false"/>
+                <w:i w:val="false"/>
+                <w:iCs w:val="false"/>
+                <w:color w:val="000000"/>
+                <w:sz w:val="20"/>
+                <w:szCs w:val="20"/>
+              </w:rPr>
+              <w:t xml:space="preserve">39</w:t>
+            </w:r>
+          </w:p>
+        </w:tc>
+        <w:tc>
+          <w:tcPr>
+            <w:tcW w:type="dxa" w:w="2800"/>
+            <w:tcBorders>
+              <w:top w:val="single" w:color="000000" w:sz="8"/>
+              <w:left w:val="single" w:color="000000" w:sz="8"/>
+              <w:bottom w:val="single" w:color="000000" w:sz="8"/>
+              <w:right w:val="single" w:color="000000" w:sz="8"/>
+            </w:tcBorders>
+            <w:shd w:fill="FFFFFF" w:color="FFFFFF" w:val="clear"/>
+            <w:tcMar>
+              <w:top w:type="dxa" w:w="60"/>
+              <w:left w:type="dxa" w:w="80"/>
+              <w:bottom w:type="dxa" w:w="60"/>
+              <w:right w:type="dxa" w:w="80"/>
+            </w:tcMar>
+            <w:vAlign w:val="center"/>
+          </w:tcPr>
+          <w:p>
+            <w:pPr>
+              <w:jc w:val="left"/>
+            </w:pPr>
+            <w:r>
+              <w:rPr>
+                <w:rFonts w:ascii="Calibri" w:cs="Calibri" w:eastAsia="Calibri" w:hAnsi="Calibri"/>
+                <w:b w:val="false"/>
+                <w:bCs w:val="false"/>
+                <w:i w:val="false"/>
+                <w:iCs w:val="false"/>
+                <w:color w:val="000000"/>
+                <w:sz w:val="20"/>
+                <w:szCs w:val="20"/>
+              </w:rPr>
+              <w:t xml:space="preserve">Load opening stock from the Abu Twins Excel</w:t>
+            </w:r>
+          </w:p>
+        </w:tc>
+        <w:tc>
+          <w:tcPr>
+            <w:tcW w:type="dxa" w:w="2600"/>
+            <w:tcBorders>
+              <w:top w:val="single" w:color="000000" w:sz="8"/>
+              <w:left w:val="single" w:color="000000" w:sz="8"/>
+              <w:bottom w:val="single" w:color="000000" w:sz="8"/>
+              <w:right w:val="single" w:color="000000" w:sz="8"/>
+            </w:tcBorders>
+            <w:shd w:fill="FFFFFF" w:color="FFFFFF" w:val="clear"/>
+            <w:tcMar>
+              <w:top w:type="dxa" w:w="60"/>
+              <w:left w:type="dxa" w:w="80"/>
+              <w:bottom w:type="dxa" w:w="60"/>
+              <w:right w:type="dxa" w:w="80"/>
+            </w:tcMar>
+            <w:vAlign w:val="center"/>
+          </w:tcPr>
+          <w:p>
+            <w:pPr>
+              <w:jc w:val="left"/>
+            </w:pPr>
+            <w:r>
+              <w:rPr>
+                <w:rFonts w:ascii="Calibri" w:cs="Calibri" w:eastAsia="Calibri" w:hAnsi="Calibri"/>
+                <w:b w:val="false"/>
+                <w:bCs w:val="false"/>
+                <w:i w:val="false"/>
+                <w:iCs w:val="false"/>
+                <w:color w:val="000000"/>
+                <w:sz w:val="20"/>
+                <w:szCs w:val="20"/>
+              </w:rPr>
+              <w:t xml:space="preserve">uploader@abutwins.com or Super Admin</w:t>
+            </w:r>
+          </w:p>
+        </w:tc>
+        <w:tc>
+          <w:tcPr>
+            <w:tcW w:type="dxa" w:w="3360"/>
+            <w:tcBorders>
+              <w:top w:val="single" w:color="000000" w:sz="8"/>
+              <w:left w:val="single" w:color="000000" w:sz="8"/>
+              <w:bottom w:val="single" w:color="000000" w:sz="8"/>
+              <w:right w:val="single" w:color="000000" w:sz="8"/>
+            </w:tcBorders>
+            <w:shd w:fill="FFFFFF" w:color="FFFFFF" w:val="clear"/>
+            <w:tcMar>
+              <w:top w:type="dxa" w:w="60"/>
+              <w:left w:type="dxa" w:w="80"/>
+              <w:bottom w:type="dxa" w:w="60"/>
+              <w:right w:type="dxa" w:w="80"/>
+            </w:tcMar>
+            <w:vAlign w:val="center"/>
+          </w:tcPr>
+          <w:p>
+            <w:pPr>
+              <w:jc w:val="left"/>
+            </w:pPr>
+            <w:r>
+              <w:rPr>
+                <w:rFonts w:ascii="Calibri" w:cs="Calibri" w:eastAsia="Calibri" w:hAnsi="Calibri"/>
+                <w:b w:val="false"/>
+                <w:bCs w:val="false"/>
+                <w:i w:val="false"/>
+                <w:iCs w:val="false"/>
+                <w:color w:val="000000"/>
+                <w:sz w:val="20"/>
+                <w:szCs w:val="20"/>
+              </w:rPr>
+              <w:t xml:space="preserve">Pick the shop. Upload the PHONES / ACCESSORIES / SCREEN / LAPTOPS file. Phones show In shop. Piece counts appear on Shop stock. A bad line loads nothing.</w:t>
+            </w:r>
+          </w:p>
+        </w:tc>
+      </w:tr>
     </w:tbl>
     <w:p>
       <w:pPr>
@@ -41271,6 +41449,25 @@
           <w:szCs w:val="22"/>
         </w:rPr>
         <w:t xml:space="preserve">Version 1.16 lets the shops be loaded from an Excel or CSV sheet. Upload stock takes the item list, the shelf counts, every phone by IMEI, and customers, in that order, and the later steps stay shut until the item list is in. A sheet is checked from top to bottom before anything is saved, so one bad line loads nothing and names what to fix. A new job, Stock uploader, does only that work: it cannot sell, see money, or approve. Adding items and changing prices moved to that job and Super Admin, so three shops cannot invent three names for one phone. Every sale can now be saved as a receipt file, printed for a stretch of days at once, or printed the moment the sale is finished. Screens are now checked on the server before they are drawn, and a refused visit is written into Who did what.</w:t>
+      </w:r>
+    </w:p>
+    <w:p>
+      <w:pPr>
+        <w:spacing w:after="160" w:before="0" w:line="276"/>
+        <w:jc w:val="left"/>
+      </w:pPr>
+      <w:r>
+        <w:rPr>
+          <w:rFonts w:ascii="Calibri" w:cs="Calibri" w:eastAsia="Calibri" w:hAnsi="Calibri"/>
+          <w:b w:val="false"/>
+          <w:bCs w:val="false"/>
+          <w:i w:val="false"/>
+          <w:iCs w:val="false"/>
+          <w:color w:val="000000"/>
+          <w:sz w:val="22"/>
+          <w:szCs w:val="22"/>
+        </w:rPr>
+        <w:t xml:space="preserve">Version 1.17 follows the opening stock Excel Abu Twins already uses. One file per shop, with PHONES, ACCESSORIES, SCREEN, and LAPTOPS. Staff pick the shop, upload that file, and the system adds the item names, books phones and laptops In shop, and sets piece counts. The older four-step sheets stay for later top-ups. The shop does not have to learn a new spreadsheet shape just to go live.</w:t>
       </w:r>
     </w:p>
     <w:p>

</xml_diff>

<commit_message>
Let staff add stock one unit at a time on Upload stock, keeping Excel for full loads.
Simplify the page so everyday IMEI, serial, and piece entry sits first, with the opening stock workbook and older sheet steps below.

Co-authored-by: Cursor <cursoragent@cursor.com>
</commit_message>
<xml_diff>
--- a/docs/Abu-Twins-Shop-System-User-Guide.docx
+++ b/docs/Abu-Twins-Shop-System-User-Guide.docx
@@ -459,7 +459,7 @@
                 <w:sz w:val="20"/>
                 <w:szCs w:val="20"/>
               </w:rPr>
-              <w:t xml:space="preserve">1.17</w:t>
+              <w:t xml:space="preserve">1.18</w:t>
             </w:r>
           </w:p>
         </w:tc>
@@ -533,7 +533,7 @@
                 <w:sz w:val="20"/>
                 <w:szCs w:val="20"/>
               </w:rPr>
-              <w:t xml:space="preserve">Updated: Opening stock uses the Abu Twins shop Excel as it is</w:t>
+              <w:t xml:space="preserve">Updated: Upload stock adds one item at a time or loads many from Excel</w:t>
             </w:r>
           </w:p>
         </w:tc>
@@ -5466,7 +5466,7 @@
                 <w:sz w:val="20"/>
                 <w:szCs w:val="20"/>
               </w:rPr>
-              <w:t xml:space="preserve">The Excel Abu Twins already uses: one file per shop, with PHONES, ACCESSORIES, SCREEN, and LAPTOPS. Upload it on Upload stock.</w:t>
+              <w:t xml:space="preserve">The Excel Abu Twins already uses: one file per shop, with PHONES, ACCESSORIES, SCREEN, and LAPTOPS. Upload it on Upload stock when you have many lines.</w:t>
             </w:r>
           </w:p>
         </w:tc>
@@ -5508,7 +5508,7 @@
                 <w:sz w:val="20"/>
                 <w:szCs w:val="20"/>
               </w:rPr>
-              <w:t xml:space="preserve">Upload list</w:t>
+              <w:t xml:space="preserve">Add one item to the shelf</w:t>
             </w:r>
           </w:p>
         </w:tc>
@@ -5545,7 +5545,7 @@
                 <w:sz w:val="20"/>
                 <w:szCs w:val="20"/>
               </w:rPr>
-              <w:t xml:space="preserve">Add many item names from an Excel or CSV file. This does not put stock on the shelf. Use Goods on the way for that.</w:t>
+              <w:t xml:space="preserve">On Upload stock, book a single phone, laptop, or piece count by hand. Scan or type the IMEI or serial. The form clears for the next unit.</w:t>
             </w:r>
           </w:p>
         </w:tc>
@@ -5587,7 +5587,7 @@
                 <w:sz w:val="20"/>
                 <w:szCs w:val="20"/>
               </w:rPr>
-              <w:t xml:space="preserve">Your login</w:t>
+              <w:t xml:space="preserve">Upload list</w:t>
             </w:r>
           </w:p>
         </w:tc>
@@ -5624,7 +5624,7 @@
                 <w:sz w:val="20"/>
                 <w:szCs w:val="20"/>
               </w:rPr>
-              <w:t xml:space="preserve">The page where a person changes their own password.</w:t>
+              <w:t xml:space="preserve">Add many item names from an Excel or CSV file. This does not put stock on the shelf. Use Goods on the way for that.</w:t>
             </w:r>
           </w:p>
         </w:tc>
@@ -5666,7 +5666,7 @@
                 <w:sz w:val="20"/>
                 <w:szCs w:val="20"/>
               </w:rPr>
-              <w:t xml:space="preserve">Shop backup</w:t>
+              <w:t xml:space="preserve">Your login</w:t>
             </w:r>
           </w:p>
         </w:tc>
@@ -5703,7 +5703,7 @@
                 <w:sz w:val="20"/>
                 <w:szCs w:val="20"/>
               </w:rPr>
-              <w:t xml:space="preserve">A Super Admin copy of shops, staff emails, stock, IMEIs, sales, and purchases. Keep that file off this computer.</w:t>
+              <w:t xml:space="preserve">The page where a person changes their own password.</w:t>
             </w:r>
           </w:p>
         </w:tc>
@@ -5745,7 +5745,7 @@
                 <w:sz w:val="20"/>
                 <w:szCs w:val="20"/>
               </w:rPr>
-              <w:t xml:space="preserve">How to use this</w:t>
+              <w:t xml:space="preserve">Shop backup</w:t>
             </w:r>
           </w:p>
         </w:tc>
@@ -5782,7 +5782,7 @@
                 <w:sz w:val="20"/>
                 <w:szCs w:val="20"/>
               </w:rPr>
-              <w:t xml:space="preserve">The handbook for your job. Look up a word. Print the book. It only covers pages you can open.</w:t>
+              <w:t xml:space="preserve">A Super Admin copy of shops, staff emails, stock, IMEIs, sales, and purchases. Keep that file off this computer.</w:t>
             </w:r>
           </w:p>
         </w:tc>
@@ -5824,7 +5824,7 @@
                 <w:sz w:val="20"/>
                 <w:szCs w:val="20"/>
               </w:rPr>
-              <w:t xml:space="preserve">Shop to shop</w:t>
+              <w:t xml:space="preserve">How to use this</w:t>
             </w:r>
           </w:p>
         </w:tc>
@@ -5861,7 +5861,7 @@
                 <w:sz w:val="20"/>
                 <w:szCs w:val="20"/>
               </w:rPr>
-              <w:t xml:space="preserve">Send stock that already belongs to Abu Twins from Iwo Road to Challenge, or the other way. The list is a CSV of IMEIs and accessory lines.</w:t>
+              <w:t xml:space="preserve">The handbook for your job. Look up a word. Print the book. It only covers pages you can open.</w:t>
             </w:r>
           </w:p>
         </w:tc>
@@ -5903,7 +5903,7 @@
                 <w:sz w:val="20"/>
                 <w:szCs w:val="20"/>
               </w:rPr>
-              <w:t xml:space="preserve">Neighbor shop fill</w:t>
+              <w:t xml:space="preserve">Shop to shop</w:t>
             </w:r>
           </w:p>
         </w:tc>
@@ -5940,7 +5940,7 @@
                 <w:sz w:val="20"/>
                 <w:szCs w:val="20"/>
               </w:rPr>
-              <w:t xml:space="preserve">Collect one unit from a neighboring dealer for a named customer. Sell it here. Return their money. Keep the profit.</w:t>
+              <w:t xml:space="preserve">Send stock that already belongs to Abu Twins from Iwo Road to Challenge, or the other way. The list is a CSV of IMEIs and accessory lines.</w:t>
             </w:r>
           </w:p>
         </w:tc>
@@ -5982,7 +5982,7 @@
                 <w:sz w:val="20"/>
                 <w:szCs w:val="20"/>
               </w:rPr>
-              <w:t xml:space="preserve">Expected goods</w:t>
+              <w:t xml:space="preserve">Neighbor shop fill</w:t>
             </w:r>
           </w:p>
         </w:tc>
@@ -6019,7 +6019,7 @@
                 <w:sz w:val="20"/>
                 <w:szCs w:val="20"/>
               </w:rPr>
-              <w:t xml:space="preserve">What a supplier still owes you in units. Coming is not In shop until the carton is checked.</w:t>
+              <w:t xml:space="preserve">Collect one unit from a neighboring dealer for a named customer. Sell it here. Return their money. Keep the profit.</w:t>
             </w:r>
           </w:p>
         </w:tc>
@@ -6061,7 +6061,7 @@
                 <w:sz w:val="20"/>
                 <w:szCs w:val="20"/>
               </w:rPr>
-              <w:t xml:space="preserve">Never scanned versus the bill</w:t>
+              <w:t xml:space="preserve">Expected goods</w:t>
             </w:r>
           </w:p>
         </w:tc>
@@ -6098,7 +6098,7 @@
                 <w:sz w:val="20"/>
                 <w:szCs w:val="20"/>
               </w:rPr>
-              <w:t xml:space="preserve">Units on the supplier bill that were never given an IMEI or piece count on this system.</w:t>
+              <w:t xml:space="preserve">What a supplier still owes you in units. Coming is not In shop until the carton is checked.</w:t>
             </w:r>
           </w:p>
         </w:tc>
@@ -6140,7 +6140,7 @@
                 <w:sz w:val="20"/>
                 <w:szCs w:val="20"/>
               </w:rPr>
-              <w:t xml:space="preserve">Sold today</w:t>
+              <w:t xml:space="preserve">Never scanned versus the bill</w:t>
             </w:r>
           </w:p>
         </w:tc>
@@ -6177,7 +6177,7 @@
                 <w:sz w:val="20"/>
                 <w:szCs w:val="20"/>
               </w:rPr>
-              <w:t xml:space="preserve">Units from that supplier carton that already have an invoice on this Lagos day. Check this before Close the day.</w:t>
+              <w:t xml:space="preserve">Units on the supplier bill that were never given an IMEI or piece count on this system.</w:t>
             </w:r>
           </w:p>
         </w:tc>
@@ -6219,7 +6219,7 @@
                 <w:sz w:val="20"/>
                 <w:szCs w:val="20"/>
               </w:rPr>
-              <w:t xml:space="preserve">Still in shop</w:t>
+              <w:t xml:space="preserve">Sold today</w:t>
             </w:r>
           </w:p>
         </w:tc>
@@ -6256,7 +6256,7 @@
                 <w:sz w:val="20"/>
                 <w:szCs w:val="20"/>
               </w:rPr>
-              <w:t xml:space="preserve">What the system still believes is on the shelf from that carton. If the shelf has fewer, open Stock count.</w:t>
+              <w:t xml:space="preserve">Units from that supplier carton that already have an invoice on this Lagos day. Check this before Close the day.</w:t>
             </w:r>
           </w:p>
         </w:tc>
@@ -6298,7 +6298,7 @@
                 <w:sz w:val="20"/>
                 <w:szCs w:val="20"/>
               </w:rPr>
-              <w:t xml:space="preserve">Stock count</w:t>
+              <w:t xml:space="preserve">Still in shop</w:t>
             </w:r>
           </w:p>
         </w:tc>
@@ -6335,7 +6335,7 @@
                 <w:sz w:val="20"/>
                 <w:szCs w:val="20"/>
               </w:rPr>
-              <w:t xml:space="preserve">Count the shelf with your hands. Compare with the system. A manager must approve before any number changes.</w:t>
+              <w:t xml:space="preserve">What the system still believes is on the shelf from that carton. If the shelf has fewer, open Stock count.</w:t>
             </w:r>
           </w:p>
         </w:tc>
@@ -6377,6 +6377,85 @@
                 <w:sz w:val="20"/>
                 <w:szCs w:val="20"/>
               </w:rPr>
+              <w:t xml:space="preserve">Stock count</w:t>
+            </w:r>
+          </w:p>
+        </w:tc>
+        <w:tc>
+          <w:tcPr>
+            <w:tcW w:type="dxa" w:w="6560"/>
+            <w:tcBorders>
+              <w:top w:val="single" w:color="000000" w:sz="8"/>
+              <w:left w:val="single" w:color="000000" w:sz="8"/>
+              <w:bottom w:val="single" w:color="000000" w:sz="8"/>
+              <w:right w:val="single" w:color="000000" w:sz="8"/>
+            </w:tcBorders>
+            <w:shd w:fill="FFFFFF" w:color="FFFFFF" w:val="clear"/>
+            <w:tcMar>
+              <w:top w:type="dxa" w:w="60"/>
+              <w:left w:type="dxa" w:w="80"/>
+              <w:bottom w:type="dxa" w:w="60"/>
+              <w:right w:type="dxa" w:w="80"/>
+            </w:tcMar>
+            <w:vAlign w:val="center"/>
+          </w:tcPr>
+          <w:p>
+            <w:pPr>
+              <w:jc w:val="left"/>
+            </w:pPr>
+            <w:r>
+              <w:rPr>
+                <w:rFonts w:ascii="Calibri" w:cs="Calibri" w:eastAsia="Calibri" w:hAnsi="Calibri"/>
+                <w:b w:val="false"/>
+                <w:bCs w:val="false"/>
+                <w:i w:val="false"/>
+                <w:iCs w:val="false"/>
+                <w:color w:val="000000"/>
+                <w:sz w:val="20"/>
+                <w:szCs w:val="20"/>
+              </w:rPr>
+              <w:t xml:space="preserve">Count the shelf with your hands. Compare with the system. A manager must approve before any number changes.</w:t>
+            </w:r>
+          </w:p>
+        </w:tc>
+      </w:tr>
+      <w:tr>
+        <w:trPr>
+          <w:trHeight w:val="320" w:hRule="atLeast"/>
+        </w:trPr>
+        <w:tc>
+          <w:tcPr>
+            <w:tcW w:type="dxa" w:w="2800"/>
+            <w:tcBorders>
+              <w:top w:val="single" w:color="000000" w:sz="8"/>
+              <w:left w:val="single" w:color="000000" w:sz="8"/>
+              <w:bottom w:val="single" w:color="000000" w:sz="8"/>
+              <w:right w:val="single" w:color="000000" w:sz="8"/>
+            </w:tcBorders>
+            <w:shd w:fill="F7F7F7" w:color="F7F7F7" w:val="clear"/>
+            <w:tcMar>
+              <w:top w:type="dxa" w:w="60"/>
+              <w:left w:type="dxa" w:w="80"/>
+              <w:bottom w:type="dxa" w:w="60"/>
+              <w:right w:type="dxa" w:w="80"/>
+            </w:tcMar>
+            <w:vAlign w:val="center"/>
+          </w:tcPr>
+          <w:p>
+            <w:pPr>
+              <w:jc w:val="left"/>
+            </w:pPr>
+            <w:r>
+              <w:rPr>
+                <w:rFonts w:ascii="Calibri" w:cs="Calibri" w:eastAsia="Calibri" w:hAnsi="Calibri"/>
+                <w:b w:val="false"/>
+                <w:bCs w:val="false"/>
+                <w:i w:val="false"/>
+                <w:iCs w:val="false"/>
+                <w:color w:val="000000"/>
+                <w:sz w:val="20"/>
+                <w:szCs w:val="20"/>
+              </w:rPr>
               <w:t xml:space="preserve">Profit</w:t>
             </w:r>
           </w:p>
@@ -6390,7 +6469,7 @@
               <w:bottom w:val="single" w:color="000000" w:sz="8"/>
               <w:right w:val="single" w:color="000000" w:sz="8"/>
             </w:tcBorders>
-            <w:shd w:fill="FFFFFF" w:color="FFFFFF" w:val="clear"/>
+            <w:shd w:fill="F7F7F7" w:color="F7F7F7" w:val="clear"/>
             <w:tcMar>
               <w:top w:type="dxa" w:w="60"/>
               <w:left w:type="dxa" w:w="80"/>
@@ -7948,7 +8027,7 @@
                 <w:sz w:val="20"/>
                 <w:szCs w:val="20"/>
               </w:rPr>
-              <w:t xml:space="preserve">The person who loads the system from a sheet</w:t>
+              <w:t xml:space="preserve">The person who puts stock on the shelf in the system</w:t>
             </w:r>
           </w:p>
         </w:tc>
@@ -7985,7 +8064,7 @@
                 <w:sz w:val="20"/>
                 <w:szCs w:val="20"/>
               </w:rPr>
-              <w:t xml:space="preserve">Upload the Abu Twins opening stock Excel per shop, or the older step-by-step sheets. Nothing else. No selling, no money, no approving.</w:t>
+              <w:t xml:space="preserve">Add one phone or cord at a time on Upload stock, or upload the Abu Twins opening stock Excel per shop. Nothing else. No selling, no money, no approving.</w:t>
             </w:r>
           </w:p>
         </w:tc>
@@ -9451,7 +9530,7 @@
                 <w:sz w:val="20"/>
                 <w:szCs w:val="20"/>
               </w:rPr>
-              <w:t xml:space="preserve">What you sell, loading the shelf from Excel, each phone number, what is here, what is still coming.</w:t>
+              <w:t xml:space="preserve">What you sell, adding stock one unit at a time or from Excel, each phone number, what is here, what is still coming.</w:t>
             </w:r>
           </w:p>
         </w:tc>
@@ -26661,7 +26740,7 @@
           <w:sz w:val="26"/>
           <w:szCs w:val="26"/>
         </w:rPr>
-        <w:t xml:space="preserve">10.39 Upload stock. Loading the shops from a sheet</w:t>
+        <w:t xml:space="preserve">10.39 Upload stock. One item or many from Excel</w:t>
       </w:r>
     </w:p>
     <w:p>
@@ -26699,7 +26778,7 @@
           <w:sz w:val="22"/>
           <w:szCs w:val="22"/>
         </w:rPr>
-        <w:t xml:space="preserve">Upload stock loads what is on the shelf from Excel. The easiest way is the Abu Twins opening stock workbook: one file for one shop, with tabs named PHONES, ACCESSORIES, SCREEN, and LAPTOPS. The same columns appear on every tab: PRODUCT NAME, BRAND, CATEGORY, QTY/IMEI/SERIAL NO, CONDITION, SPECIFICATION, UNIT COST PRICE, and MIN.SELLING PRICE. Pick the shop, upload the file, and the system adds missing item names, books phones and laptops as In shop, and sets piece counts for cords and screens. Older four-step sheets remain lower on the page for later top-ups.</w:t>
+        <w:t xml:space="preserve">Upload stock puts what is on the shelf into the system two ways. At the top, Add one item to the shelf lets staff pick the shop, pick or add the item name, and scan or type each IMEI, serial, or piece count one after another. When the form saves, the number fields clear for the next unit. Below that, the Abu Twins opening stock Excel still loads a full shop at once: one file per shop, with tabs named PHONES, ACCESSORIES, SCREEN, and LAPTOPS. Older four-step sheet uploads sit under Advanced for later top-ups.</w:t>
       </w:r>
     </w:p>
     <w:p>
@@ -26737,7 +26816,7 @@
           <w:sz w:val="22"/>
           <w:szCs w:val="22"/>
         </w:rPr>
-        <w:t xml:space="preserve">The shop already counts stock in that Excel. Asking them to retype everything into a new Techvaults layout wastes a day and creates mistakes. The software should follow the shop's paper, not the other way around.</w:t>
+        <w:t xml:space="preserve">Not every delivery is a full carton count. Sometimes one iPhone arrives, or three cords. Forcing a spreadsheet for that feels heavy. Keeping the big Excel for opening stock and day-end counts still saves hours when hundreds of lines must go in at once.</w:t>
       </w:r>
     </w:p>
     <w:p>
@@ -26775,7 +26854,7 @@
           <w:sz w:val="22"/>
           <w:szCs w:val="22"/>
         </w:rPr>
-        <w:t xml:space="preserve">Iwo Road finishes tonight's count on the opening stock Excel. The uploader opens Upload stock, picks Iwo Road, Ibadan, and uploads that file. Phones with IMEIs appear In shop. Cords show the piece count. Challenge sends its own file the same way. Sell now can start tomorrow on real shelf units.</w:t>
+        <w:t xml:space="preserve">Challenge receives one iPhone 17 Pro Max before the rest of the carton. The uploader opens Upload stock, picks Challenge, Ibadan, chooses the model from the list, scans the IMEI, and clicks Add this unit to the shelf. The IMEI field clears. They scan the next phone the same way. That evening, Bodija sends its full opening stock Excel. The uploader picks Bodija and uploads the file. Phones appear In shop. Cords show the piece count. Sell now works on real shelf units the next morning.</w:t>
       </w:r>
     </w:p>
     <w:p>
@@ -26887,7 +26966,7 @@
           <w:sz w:val="22"/>
           <w:szCs w:val="22"/>
         </w:rPr>
-        <w:t xml:space="preserve">Under Abu Twins opening stock sheet, pick the shop this file belongs to.</w:t>
+        <w:t xml:space="preserve">To add one unit, use Add one item to the shelf at the top.</w:t>
       </w:r>
     </w:p>
     <w:p>
@@ -26918,7 +26997,7 @@
           <w:sz w:val="22"/>
           <w:szCs w:val="22"/>
         </w:rPr>
-        <w:t xml:space="preserve">Upload the shop's opening stock Excel with PHONES, ACCESSORIES, SCREEN, and LAPTOPS filled.</w:t>
+        <w:t xml:space="preserve">Pick the shop, pick the item from the list or add a new name with prices, then scan or type the IMEI, serial, or piece count.</w:t>
       </w:r>
     </w:p>
     <w:p>
@@ -26949,7 +27028,7 @@
           <w:sz w:val="22"/>
           <w:szCs w:val="22"/>
         </w:rPr>
-        <w:t xml:space="preserve">Open Shop stock and Phone IMEIs. Confirm the numbers match the sheet.</w:t>
+        <w:t xml:space="preserve">Click Add this unit to the shelf or Add pieces to the shelf. Confirm the fields clear for the next entry.</w:t>
       </w:r>
     </w:p>
     <w:p>
@@ -26980,7 +27059,38 @@
           <w:sz w:val="22"/>
           <w:szCs w:val="22"/>
         </w:rPr>
-        <w:t xml:space="preserve">If a line is wrong, fix the Excel and upload again. Nothing is half loaded.</w:t>
+        <w:t xml:space="preserve">For a full shop load, scroll to Abu Twins opening stock Excel, pick the shop, and upload the PHONES / ACCESSORIES / SCREEN / LAPTOPS file.</w:t>
+      </w:r>
+    </w:p>
+    <w:p>
+      <w:pPr>
+        <w:spacing w:after="80" w:line="276"/>
+      </w:pPr>
+      <w:r>
+        <w:rPr>
+          <w:rFonts w:ascii="Calibri" w:cs="Calibri" w:eastAsia="Calibri" w:hAnsi="Calibri"/>
+          <w:b/>
+          <w:bCs/>
+          <w:i w:val="false"/>
+          <w:iCs w:val="false"/>
+          <w:color w:val="000000"/>
+          <w:sz w:val="22"/>
+          <w:szCs w:val="22"/>
+        </w:rPr>
+        <w:t xml:space="preserve">7. </w:t>
+      </w:r>
+      <w:r>
+        <w:rPr>
+          <w:rFonts w:ascii="Calibri" w:cs="Calibri" w:eastAsia="Calibri" w:hAnsi="Calibri"/>
+          <w:b w:val="false"/>
+          <w:bCs w:val="false"/>
+          <w:i w:val="false"/>
+          <w:iCs w:val="false"/>
+          <w:color w:val="000000"/>
+          <w:sz w:val="22"/>
+          <w:szCs w:val="22"/>
+        </w:rPr>
+        <w:t xml:space="preserve">Open Shop stock and Phone IMEIs. Confirm the numbers match what you entered.</w:t>
       </w:r>
     </w:p>
     <w:p>
@@ -27022,7 +27132,7 @@
           <w:sz w:val="22"/>
           <w:szCs w:val="22"/>
         </w:rPr>
-        <w:t xml:space="preserve">The opening stock card is at the top of Upload stock.</w:t>
+        <w:t xml:space="preserve">Add one item to the shelf is at the top of Upload stock.</w:t>
       </w:r>
     </w:p>
     <w:p>
@@ -27045,7 +27155,7 @@
           <w:sz w:val="22"/>
           <w:szCs w:val="22"/>
         </w:rPr>
-        <w:t xml:space="preserve">A good file adds item names, phones In shop, and piece lines for that shop.</w:t>
+        <w:t xml:space="preserve">A phone with an IMEI books In shop and raises the shelf count by one.</w:t>
       </w:r>
     </w:p>
     <w:p>
@@ -27068,7 +27178,7 @@
           <w:sz w:val="22"/>
           <w:szCs w:val="22"/>
         </w:rPr>
-        <w:t xml:space="preserve">A file with a bad line loads nothing and names the tab and line to fix.</w:t>
+        <w:t xml:space="preserve">A cord with no number raises the piece count by the number you typed.</w:t>
       </w:r>
     </w:p>
     <w:p>
@@ -27091,7 +27201,7 @@
           <w:sz w:val="22"/>
           <w:szCs w:val="22"/>
         </w:rPr>
-        <w:t xml:space="preserve">Sending the same phone twice leaves the first booking alone.</w:t>
+        <w:t xml:space="preserve">Sending the same IMEI twice is refused or left alone if it is already on the system.</w:t>
       </w:r>
     </w:p>
     <w:p>
@@ -27114,7 +27224,7 @@
           <w:sz w:val="22"/>
           <w:szCs w:val="22"/>
         </w:rPr>
-        <w:t xml:space="preserve">After a good upload, Sell now can find those In shop IMEIs.</w:t>
+        <w:t xml:space="preserve">A good opening stock file adds item names, phones In shop, and piece lines for that shop.</w:t>
       </w:r>
     </w:p>
     <w:p>
@@ -27137,7 +27247,30 @@
           <w:sz w:val="22"/>
           <w:szCs w:val="22"/>
         </w:rPr>
-        <w:t xml:space="preserve">The older four steps are still there for later top-ups.</w:t>
+        <w:t xml:space="preserve">A file with a bad line loads nothing and names the tab and line to fix.</w:t>
+      </w:r>
+    </w:p>
+    <w:p>
+      <w:pPr>
+        <w:pStyle w:val="ListParagraph"/>
+        <w:numPr>
+          <w:ilvl w:val="0"/>
+          <w:numId w:val="2"/>
+        </w:numPr>
+        <w:spacing w:after="80" w:line="276"/>
+      </w:pPr>
+      <w:r>
+        <w:rPr>
+          <w:rFonts w:ascii="Calibri" w:cs="Calibri" w:eastAsia="Calibri" w:hAnsi="Calibri"/>
+          <w:b w:val="false"/>
+          <w:bCs w:val="false"/>
+          <w:i w:val="false"/>
+          <w:iCs w:val="false"/>
+          <w:color w:val="000000"/>
+          <w:sz w:val="22"/>
+          <w:szCs w:val="22"/>
+        </w:rPr>
+        <w:t xml:space="preserve">Advanced sheet uploads are folded away until you open them.</w:t>
       </w:r>
     </w:p>
     <w:p>
@@ -39974,6 +40107,159 @@
           </w:p>
         </w:tc>
       </w:tr>
+      <w:tr>
+        <w:trPr>
+          <w:trHeight w:val="320" w:hRule="atLeast"/>
+        </w:trPr>
+        <w:tc>
+          <w:tcPr>
+            <w:tcW w:type="dxa" w:w="600"/>
+            <w:tcBorders>
+              <w:top w:val="single" w:color="000000" w:sz="8"/>
+              <w:left w:val="single" w:color="000000" w:sz="8"/>
+              <w:bottom w:val="single" w:color="000000" w:sz="8"/>
+              <w:right w:val="single" w:color="000000" w:sz="8"/>
+            </w:tcBorders>
+            <w:shd w:fill="F7F7F7" w:color="F7F7F7" w:val="clear"/>
+            <w:tcMar>
+              <w:top w:type="dxa" w:w="60"/>
+              <w:left w:type="dxa" w:w="80"/>
+              <w:bottom w:type="dxa" w:w="60"/>
+              <w:right w:type="dxa" w:w="80"/>
+            </w:tcMar>
+            <w:vAlign w:val="center"/>
+          </w:tcPr>
+          <w:p>
+            <w:pPr>
+              <w:jc w:val="left"/>
+            </w:pPr>
+            <w:r>
+              <w:rPr>
+                <w:rFonts w:ascii="Calibri" w:cs="Calibri" w:eastAsia="Calibri" w:hAnsi="Calibri"/>
+                <w:b w:val="false"/>
+                <w:bCs w:val="false"/>
+                <w:i w:val="false"/>
+                <w:iCs w:val="false"/>
+                <w:color w:val="000000"/>
+                <w:sz w:val="20"/>
+                <w:szCs w:val="20"/>
+              </w:rPr>
+              <w:t xml:space="preserve">40</w:t>
+            </w:r>
+          </w:p>
+        </w:tc>
+        <w:tc>
+          <w:tcPr>
+            <w:tcW w:type="dxa" w:w="2800"/>
+            <w:tcBorders>
+              <w:top w:val="single" w:color="000000" w:sz="8"/>
+              <w:left w:val="single" w:color="000000" w:sz="8"/>
+              <w:bottom w:val="single" w:color="000000" w:sz="8"/>
+              <w:right w:val="single" w:color="000000" w:sz="8"/>
+            </w:tcBorders>
+            <w:shd w:fill="F7F7F7" w:color="F7F7F7" w:val="clear"/>
+            <w:tcMar>
+              <w:top w:type="dxa" w:w="60"/>
+              <w:left w:type="dxa" w:w="80"/>
+              <w:bottom w:type="dxa" w:w="60"/>
+              <w:right w:type="dxa" w:w="80"/>
+            </w:tcMar>
+            <w:vAlign w:val="center"/>
+          </w:tcPr>
+          <w:p>
+            <w:pPr>
+              <w:jc w:val="left"/>
+            </w:pPr>
+            <w:r>
+              <w:rPr>
+                <w:rFonts w:ascii="Calibri" w:cs="Calibri" w:eastAsia="Calibri" w:hAnsi="Calibri"/>
+                <w:b w:val="false"/>
+                <w:bCs w:val="false"/>
+                <w:i w:val="false"/>
+                <w:iCs w:val="false"/>
+                <w:color w:val="000000"/>
+                <w:sz w:val="20"/>
+                <w:szCs w:val="20"/>
+              </w:rPr>
+              <w:t xml:space="preserve">Add one item to the shelf by hand</w:t>
+            </w:r>
+          </w:p>
+        </w:tc>
+        <w:tc>
+          <w:tcPr>
+            <w:tcW w:type="dxa" w:w="2600"/>
+            <w:tcBorders>
+              <w:top w:val="single" w:color="000000" w:sz="8"/>
+              <w:left w:val="single" w:color="000000" w:sz="8"/>
+              <w:bottom w:val="single" w:color="000000" w:sz="8"/>
+              <w:right w:val="single" w:color="000000" w:sz="8"/>
+            </w:tcBorders>
+            <w:shd w:fill="F7F7F7" w:color="F7F7F7" w:val="clear"/>
+            <w:tcMar>
+              <w:top w:type="dxa" w:w="60"/>
+              <w:left w:type="dxa" w:w="80"/>
+              <w:bottom w:type="dxa" w:w="60"/>
+              <w:right w:type="dxa" w:w="80"/>
+            </w:tcMar>
+            <w:vAlign w:val="center"/>
+          </w:tcPr>
+          <w:p>
+            <w:pPr>
+              <w:jc w:val="left"/>
+            </w:pPr>
+            <w:r>
+              <w:rPr>
+                <w:rFonts w:ascii="Calibri" w:cs="Calibri" w:eastAsia="Calibri" w:hAnsi="Calibri"/>
+                <w:b w:val="false"/>
+                <w:bCs w:val="false"/>
+                <w:i w:val="false"/>
+                <w:iCs w:val="false"/>
+                <w:color w:val="000000"/>
+                <w:sz w:val="20"/>
+                <w:szCs w:val="20"/>
+              </w:rPr>
+              <w:t xml:space="preserve">uploader@abutwins.com or Super Admin</w:t>
+            </w:r>
+          </w:p>
+        </w:tc>
+        <w:tc>
+          <w:tcPr>
+            <w:tcW w:type="dxa" w:w="3360"/>
+            <w:tcBorders>
+              <w:top w:val="single" w:color="000000" w:sz="8"/>
+              <w:left w:val="single" w:color="000000" w:sz="8"/>
+              <w:bottom w:val="single" w:color="000000" w:sz="8"/>
+              <w:right w:val="single" w:color="000000" w:sz="8"/>
+            </w:tcBorders>
+            <w:shd w:fill="F7F7F7" w:color="F7F7F7" w:val="clear"/>
+            <w:tcMar>
+              <w:top w:type="dxa" w:w="60"/>
+              <w:left w:type="dxa" w:w="80"/>
+              <w:bottom w:type="dxa" w:w="60"/>
+              <w:right w:type="dxa" w:w="80"/>
+            </w:tcMar>
+            <w:vAlign w:val="center"/>
+          </w:tcPr>
+          <w:p>
+            <w:pPr>
+              <w:jc w:val="left"/>
+            </w:pPr>
+            <w:r>
+              <w:rPr>
+                <w:rFonts w:ascii="Calibri" w:cs="Calibri" w:eastAsia="Calibri" w:hAnsi="Calibri"/>
+                <w:b w:val="false"/>
+                <w:bCs w:val="false"/>
+                <w:i w:val="false"/>
+                <w:iCs w:val="false"/>
+                <w:color w:val="000000"/>
+                <w:sz w:val="20"/>
+                <w:szCs w:val="20"/>
+              </w:rPr>
+              <w:t xml:space="preserve">Pick the shop and item. Scan or type one IMEI or serial. Form clears for the next unit. Sell now finds the new In shop IMEI.</w:t>
+            </w:r>
+          </w:p>
+        </w:tc>
+      </w:tr>
     </w:tbl>
     <w:p>
       <w:pPr>
@@ -41468,6 +41754,25 @@
           <w:szCs w:val="22"/>
         </w:rPr>
         <w:t xml:space="preserve">Version 1.17 follows the opening stock Excel Abu Twins already uses. One file per shop, with PHONES, ACCESSORIES, SCREEN, and LAPTOPS. Staff pick the shop, upload that file, and the system adds the item names, books phones and laptops In shop, and sets piece counts. The older four-step sheets stay for later top-ups. The shop does not have to learn a new spreadsheet shape just to go live.</w:t>
+      </w:r>
+    </w:p>
+    <w:p>
+      <w:pPr>
+        <w:spacing w:after="160" w:before="0" w:line="276"/>
+        <w:jc w:val="left"/>
+      </w:pPr>
+      <w:r>
+        <w:rPr>
+          <w:rFonts w:ascii="Calibri" w:cs="Calibri" w:eastAsia="Calibri" w:hAnsi="Calibri"/>
+          <w:b w:val="false"/>
+          <w:bCs w:val="false"/>
+          <w:i w:val="false"/>
+          <w:iCs w:val="false"/>
+          <w:color w:val="000000"/>
+          <w:sz w:val="22"/>
+          <w:szCs w:val="22"/>
+        </w:rPr>
+        <w:t xml:space="preserve">Version 1.18 adds Add one item to the shelf on Upload stock. Staff pick the shop, pick or add the item name, and scan or type each IMEI, serial, or piece count without opening a spreadsheet. The form clears after each save so the next unit is quick. The opening stock Excel stays for full shop loads. Older step-by-step sheet uploads move under Advanced so the page reads clearly for everyday work.</w:t>
       </w:r>
     </w:p>
     <w:p>

</xml_diff>

<commit_message>
Tie Upload stock loads to supplier bills with PO, value, and paid status.
Manual sessions and Excel uploads create RECEIVED purchase bills so Finance and auditors can trace stock, submission value, and what is still owed.

Co-authored-by: Cursor <cursoragent@cursor.com>
</commit_message>
<xml_diff>
--- a/docs/Abu-Twins-Shop-System-User-Guide.docx
+++ b/docs/Abu-Twins-Shop-System-User-Guide.docx
@@ -459,7 +459,7 @@
                 <w:sz w:val="20"/>
                 <w:szCs w:val="20"/>
               </w:rPr>
-              <w:t xml:space="preserve">1.18</w:t>
+              <w:t xml:space="preserve">1.19</w:t>
             </w:r>
           </w:p>
         </w:tc>
@@ -533,7 +533,7 @@
                 <w:sz w:val="20"/>
                 <w:szCs w:val="20"/>
               </w:rPr>
-              <w:t xml:space="preserve">Updated: Upload stock adds one item at a time or loads many from Excel</w:t>
+              <w:t xml:space="preserve">Updated: Upload stock creates a supplier bill with value and paid or not paid</w:t>
             </w:r>
           </w:p>
         </w:tc>
@@ -5466,7 +5466,7 @@
                 <w:sz w:val="20"/>
                 <w:szCs w:val="20"/>
               </w:rPr>
-              <w:t xml:space="preserve">The Excel Abu Twins already uses: one file per shop, with PHONES, ACCESSORIES, SCREEN, and LAPTOPS. Upload it on Upload stock when you have many lines.</w:t>
+              <w:t xml:space="preserve">The Excel Abu Twins already uses: one file per shop, with PHONES, ACCESSORIES, SCREEN, and LAPTOPS. Upload it on Upload stock when you have many lines. Pick the supplier and paid or not paid.</w:t>
             </w:r>
           </w:p>
         </w:tc>
@@ -5545,7 +5545,165 @@
                 <w:sz w:val="20"/>
                 <w:szCs w:val="20"/>
               </w:rPr>
-              <w:t xml:space="preserve">On Upload stock, book a single phone, laptop, or piece count by hand. Scan or type the IMEI or serial. The form clears for the next unit.</w:t>
+              <w:t xml:space="preserve">On Upload stock, book a single phone, laptop, or piece count by hand under an open upload bill. Scan or type the IMEI or serial. The form clears for the next unit.</w:t>
+            </w:r>
+          </w:p>
+        </w:tc>
+      </w:tr>
+      <w:tr>
+        <w:trPr>
+          <w:trHeight w:val="320" w:hRule="atLeast"/>
+        </w:trPr>
+        <w:tc>
+          <w:tcPr>
+            <w:tcW w:type="dxa" w:w="2800"/>
+            <w:tcBorders>
+              <w:top w:val="single" w:color="000000" w:sz="8"/>
+              <w:left w:val="single" w:color="000000" w:sz="8"/>
+              <w:bottom w:val="single" w:color="000000" w:sz="8"/>
+              <w:right w:val="single" w:color="000000" w:sz="8"/>
+            </w:tcBorders>
+            <w:shd w:fill="FFFFFF" w:color="FFFFFF" w:val="clear"/>
+            <w:tcMar>
+              <w:top w:type="dxa" w:w="60"/>
+              <w:left w:type="dxa" w:w="80"/>
+              <w:bottom w:type="dxa" w:w="60"/>
+              <w:right w:type="dxa" w:w="80"/>
+            </w:tcMar>
+            <w:vAlign w:val="center"/>
+          </w:tcPr>
+          <w:p>
+            <w:pPr>
+              <w:jc w:val="left"/>
+            </w:pPr>
+            <w:r>
+              <w:rPr>
+                <w:rFonts w:ascii="Calibri" w:cs="Calibri" w:eastAsia="Calibri" w:hAnsi="Calibri"/>
+                <w:b w:val="false"/>
+                <w:bCs w:val="false"/>
+                <w:i w:val="false"/>
+                <w:iCs w:val="false"/>
+                <w:color w:val="000000"/>
+                <w:sz w:val="20"/>
+                <w:szCs w:val="20"/>
+              </w:rPr>
+              <w:t xml:space="preserve">Upload bill</w:t>
+            </w:r>
+          </w:p>
+        </w:tc>
+        <w:tc>
+          <w:tcPr>
+            <w:tcW w:type="dxa" w:w="6560"/>
+            <w:tcBorders>
+              <w:top w:val="single" w:color="000000" w:sz="8"/>
+              <w:left w:val="single" w:color="000000" w:sz="8"/>
+              <w:bottom w:val="single" w:color="000000" w:sz="8"/>
+              <w:right w:val="single" w:color="000000" w:sz="8"/>
+            </w:tcBorders>
+            <w:shd w:fill="FFFFFF" w:color="FFFFFF" w:val="clear"/>
+            <w:tcMar>
+              <w:top w:type="dxa" w:w="60"/>
+              <w:left w:type="dxa" w:w="80"/>
+              <w:bottom w:type="dxa" w:w="60"/>
+              <w:right w:type="dxa" w:w="80"/>
+            </w:tcMar>
+            <w:vAlign w:val="center"/>
+          </w:tcPr>
+          <w:p>
+            <w:pPr>
+              <w:jc w:val="left"/>
+            </w:pPr>
+            <w:r>
+              <w:rPr>
+                <w:rFonts w:ascii="Calibri" w:cs="Calibri" w:eastAsia="Calibri" w:hAnsi="Calibri"/>
+                <w:b w:val="false"/>
+                <w:bCs w:val="false"/>
+                <w:i w:val="false"/>
+                <w:iCs w:val="false"/>
+                <w:color w:val="000000"/>
+                <w:sz w:val="20"/>
+                <w:szCs w:val="20"/>
+              </w:rPr>
+              <w:t xml:space="preserve">A Goods from supplier PO started on Upload stock. It carries the supplier, submission value, and paid or not paid for that load.</w:t>
+            </w:r>
+          </w:p>
+        </w:tc>
+      </w:tr>
+      <w:tr>
+        <w:trPr>
+          <w:trHeight w:val="320" w:hRule="atLeast"/>
+        </w:trPr>
+        <w:tc>
+          <w:tcPr>
+            <w:tcW w:type="dxa" w:w="2800"/>
+            <w:tcBorders>
+              <w:top w:val="single" w:color="000000" w:sz="8"/>
+              <w:left w:val="single" w:color="000000" w:sz="8"/>
+              <w:bottom w:val="single" w:color="000000" w:sz="8"/>
+              <w:right w:val="single" w:color="000000" w:sz="8"/>
+            </w:tcBorders>
+            <w:shd w:fill="F7F7F7" w:color="F7F7F7" w:val="clear"/>
+            <w:tcMar>
+              <w:top w:type="dxa" w:w="60"/>
+              <w:left w:type="dxa" w:w="80"/>
+              <w:bottom w:type="dxa" w:w="60"/>
+              <w:right w:type="dxa" w:w="80"/>
+            </w:tcMar>
+            <w:vAlign w:val="center"/>
+          </w:tcPr>
+          <w:p>
+            <w:pPr>
+              <w:jc w:val="left"/>
+            </w:pPr>
+            <w:r>
+              <w:rPr>
+                <w:rFonts w:ascii="Calibri" w:cs="Calibri" w:eastAsia="Calibri" w:hAnsi="Calibri"/>
+                <w:b w:val="false"/>
+                <w:bCs w:val="false"/>
+                <w:i w:val="false"/>
+                <w:iCs w:val="false"/>
+                <w:color w:val="000000"/>
+                <w:sz w:val="20"/>
+                <w:szCs w:val="20"/>
+              </w:rPr>
+              <w:t xml:space="preserve">Submission value</w:t>
+            </w:r>
+          </w:p>
+        </w:tc>
+        <w:tc>
+          <w:tcPr>
+            <w:tcW w:type="dxa" w:w="6560"/>
+            <w:tcBorders>
+              <w:top w:val="single" w:color="000000" w:sz="8"/>
+              <w:left w:val="single" w:color="000000" w:sz="8"/>
+              <w:bottom w:val="single" w:color="000000" w:sz="8"/>
+              <w:right w:val="single" w:color="000000" w:sz="8"/>
+            </w:tcBorders>
+            <w:shd w:fill="F7F7F7" w:color="F7F7F7" w:val="clear"/>
+            <w:tcMar>
+              <w:top w:type="dxa" w:w="60"/>
+              <w:left w:type="dxa" w:w="80"/>
+              <w:bottom w:type="dxa" w:w="60"/>
+              <w:right w:type="dxa" w:w="80"/>
+            </w:tcMar>
+            <w:vAlign w:val="center"/>
+          </w:tcPr>
+          <w:p>
+            <w:pPr>
+              <w:jc w:val="left"/>
+            </w:pPr>
+            <w:r>
+              <w:rPr>
+                <w:rFonts w:ascii="Calibri" w:cs="Calibri" w:eastAsia="Calibri" w:hAnsi="Calibri"/>
+                <w:b w:val="false"/>
+                <w:bCs w:val="false"/>
+                <w:i w:val="false"/>
+                <w:iCs w:val="false"/>
+                <w:color w:val="000000"/>
+                <w:sz w:val="20"/>
+                <w:szCs w:val="20"/>
+              </w:rPr>
+              <w:t xml:space="preserve">The cost total of everything loaded on that upload bill. Cost times quantity.</w:t>
             </w:r>
           </w:p>
         </w:tc>
@@ -8064,7 +8222,7 @@
                 <w:sz w:val="20"/>
                 <w:szCs w:val="20"/>
               </w:rPr>
-              <w:t xml:space="preserve">Add one phone or cord at a time on Upload stock, or upload the Abu Twins opening stock Excel per shop. Nothing else. No selling, no money, no approving.</w:t>
+              <w:t xml:space="preserve">Start an upload bill with a supplier, add units by hand or upload the opening stock Excel. Each load gets a PO. Nothing else. No selling, no posting cash, no approving.</w:t>
             </w:r>
           </w:p>
         </w:tc>
@@ -9530,7 +9688,7 @@
                 <w:sz w:val="20"/>
                 <w:szCs w:val="20"/>
               </w:rPr>
-              <w:t xml:space="preserve">What you sell, adding stock one unit at a time or from Excel, each phone number, what is here, what is still coming.</w:t>
+              <w:t xml:space="preserve">What you sell, adding stock with a supplier bill, each phone number, what is here, what is still coming.</w:t>
             </w:r>
           </w:p>
         </w:tc>
@@ -26740,7 +26898,7 @@
           <w:sz w:val="26"/>
           <w:szCs w:val="26"/>
         </w:rPr>
-        <w:t xml:space="preserve">10.39 Upload stock. One item or many from Excel</w:t>
+        <w:t xml:space="preserve">10.39 Upload stock. Supplier bill, one item, or many from Excel</w:t>
       </w:r>
     </w:p>
     <w:p>
@@ -26778,7 +26936,7 @@
           <w:sz w:val="22"/>
           <w:szCs w:val="22"/>
         </w:rPr>
-        <w:t xml:space="preserve">Upload stock puts what is on the shelf into the system two ways. At the top, Add one item to the shelf lets staff pick the shop, pick or add the item name, and scan or type each IMEI, serial, or piece count one after another. When the form saves, the number fields clear for the next unit. Below that, the Abu Twins opening stock Excel still loads a full shop at once: one file per shop, with tabs named PHONES, ACCESSORIES, SCREEN, and LAPTOPS. Older four-step sheet uploads sit under Advanced for later top-ups.</w:t>
+        <w:t xml:space="preserve">Upload stock puts what is on the shelf into the system and creates a real Goods from supplier bill. First, staff start an upload bill: shop, supplier, and paid or not paid. That bill gets a unique PO number and a running submission value from cost. Add one item to the shelf then books each IMEI, serial, or piece count under that same PO until the bill is closed. The Abu Twins opening stock Excel still loads a full shop at once: pick shop, supplier, and payment status, then upload PHONES, ACCESSORIES, SCREEN, and LAPTOPS. Unpaid bills show on Finance as still owed. Older four-step sheet uploads sit under Advanced.</w:t>
       </w:r>
     </w:p>
     <w:p>
@@ -26816,7 +26974,7 @@
           <w:sz w:val="22"/>
           <w:szCs w:val="22"/>
         </w:rPr>
-        <w:t xml:space="preserve">Not every delivery is a full carton count. Sometimes one iPhone arrives, or three cords. Forcing a spreadsheet for that feels heavy. Keeping the big Excel for opening stock and day-end counts still saves hours when hundreds of lines must go in at once.</w:t>
+        <w:t xml:space="preserve">Accountants and auditors need to know who supplied the stock, what it cost, whether it was paid, and which PO to open. Loading phones without that trail leaves money and goods unlinked. One session bill keeps a carton together. Excel still saves the big opening count.</w:t>
       </w:r>
     </w:p>
     <w:p>
@@ -26854,7 +27012,7 @@
           <w:sz w:val="22"/>
           <w:szCs w:val="22"/>
         </w:rPr>
-        <w:t xml:space="preserve">Challenge receives one iPhone 17 Pro Max before the rest of the carton. The uploader opens Upload stock, picks Challenge, Ibadan, chooses the model from the list, scans the IMEI, and clicks Add this unit to the shelf. The IMEI field clears. They scan the next phone the same way. That evening, Bodija sends its full opening stock Excel. The uploader picks Bodija and uploads the file. Phones appear In shop. Cords show the piece count. Sell now works on real shelf units the next morning.</w:t>
+        <w:t xml:space="preserve">Challenge receives part of a Dubai carton. The uploader starts an upload bill for that supplier, marks it not paid yet, and scans three iPhone 17 Pro Max units under the same PO. Finance shows the submission value as still owed. That evening, Bodija uploads its full opening stock Excel with the same supplier marked paid. A new PO appears on Goods from supplier as Loaded on Upload stock. Sell now works on real shelf units the next morning.</w:t>
       </w:r>
     </w:p>
     <w:p>
@@ -26966,7 +27124,7 @@
           <w:sz w:val="22"/>
           <w:szCs w:val="22"/>
         </w:rPr>
-        <w:t xml:space="preserve">To add one unit, use Add one item to the shelf at the top.</w:t>
+        <w:t xml:space="preserve">Start an upload bill: pick the shop, the supplier, and whether it is paid.</w:t>
       </w:r>
     </w:p>
     <w:p>
@@ -26997,7 +27155,7 @@
           <w:sz w:val="22"/>
           <w:szCs w:val="22"/>
         </w:rPr>
-        <w:t xml:space="preserve">Pick the shop, pick the item from the list or add a new name with prices, then scan or type the IMEI, serial, or piece count.</w:t>
+        <w:t xml:space="preserve">Add each unit: pick or add the item name, scan or type the IMEI, serial, or piece count, then save. Confirm the fields clear and the bill value grows.</w:t>
       </w:r>
     </w:p>
     <w:p>
@@ -27028,7 +27186,7 @@
           <w:sz w:val="22"/>
           <w:szCs w:val="22"/>
         </w:rPr>
-        <w:t xml:space="preserve">Click Add this unit to the shelf or Add pieces to the shelf. Confirm the fields clear for the next entry.</w:t>
+        <w:t xml:space="preserve">Close the bill when that carton is finished, or leave it open to add more.</w:t>
       </w:r>
     </w:p>
     <w:p>
@@ -27059,7 +27217,7 @@
           <w:sz w:val="22"/>
           <w:szCs w:val="22"/>
         </w:rPr>
-        <w:t xml:space="preserve">For a full shop load, scroll to Abu Twins opening stock Excel, pick the shop, and upload the PHONES / ACCESSORIES / SCREEN / LAPTOPS file.</w:t>
+        <w:t xml:space="preserve">For a full shop load, scroll to Abu Twins opening stock Excel, pick shop, supplier, and paid or not paid, then upload the file.</w:t>
       </w:r>
     </w:p>
     <w:p>
@@ -27090,7 +27248,7 @@
           <w:sz w:val="22"/>
           <w:szCs w:val="22"/>
         </w:rPr>
-        <w:t xml:space="preserve">Open Shop stock and Phone IMEIs. Confirm the numbers match what you entered.</w:t>
+        <w:t xml:space="preserve">Open Goods from supplier and Finance. Confirm the PO, submission value, and owed amount.</w:t>
       </w:r>
     </w:p>
     <w:p>
@@ -27132,7 +27290,7 @@
           <w:sz w:val="22"/>
           <w:szCs w:val="22"/>
         </w:rPr>
-        <w:t xml:space="preserve">Add one item to the shelf is at the top of Upload stock.</w:t>
+        <w:t xml:space="preserve">An open upload bill shows the PO number, supplier, submission value, and paid or not paid.</w:t>
       </w:r>
     </w:p>
     <w:p>
@@ -27155,7 +27313,7 @@
           <w:sz w:val="22"/>
           <w:szCs w:val="22"/>
         </w:rPr>
-        <w:t xml:space="preserve">A phone with an IMEI books In shop and raises the shelf count by one.</w:t>
+        <w:t xml:space="preserve">A phone with an IMEI books In shop, links to the PO, and raises the shelf count by one.</w:t>
       </w:r>
     </w:p>
     <w:p>
@@ -27178,7 +27336,7 @@
           <w:sz w:val="22"/>
           <w:szCs w:val="22"/>
         </w:rPr>
-        <w:t xml:space="preserve">A cord with no number raises the piece count by the number you typed.</w:t>
+        <w:t xml:space="preserve">A cord with no number raises the piece count and the bill value by cost times quantity.</w:t>
       </w:r>
     </w:p>
     <w:p>
@@ -27201,7 +27359,7 @@
           <w:sz w:val="22"/>
           <w:szCs w:val="22"/>
         </w:rPr>
-        <w:t xml:space="preserve">Sending the same IMEI twice is refused or left alone if it is already on the system.</w:t>
+        <w:t xml:space="preserve">Unpaid upload bills appear under Still owed to suppliers.</w:t>
       </w:r>
     </w:p>
     <w:p>
@@ -27224,7 +27382,7 @@
           <w:sz w:val="22"/>
           <w:szCs w:val="22"/>
         </w:rPr>
-        <w:t xml:space="preserve">A good opening stock file adds item names, phones In shop, and piece lines for that shop.</w:t>
+        <w:t xml:space="preserve">Goods from supplier labels upload bills as Loaded on Upload stock.</w:t>
       </w:r>
     </w:p>
     <w:p>
@@ -27247,7 +27405,7 @@
           <w:sz w:val="22"/>
           <w:szCs w:val="22"/>
         </w:rPr>
-        <w:t xml:space="preserve">A file with a bad line loads nothing and names the tab and line to fix.</w:t>
+        <w:t xml:space="preserve">A good opening stock file creates its own PO and books stock for that shop.</w:t>
       </w:r>
     </w:p>
     <w:p>
@@ -27270,7 +27428,7 @@
           <w:sz w:val="22"/>
           <w:szCs w:val="22"/>
         </w:rPr>
-        <w:t xml:space="preserve">Advanced sheet uploads are folded away until you open them.</w:t>
+        <w:t xml:space="preserve">A file with a bad line loads nothing and names the tab and line to fix.</w:t>
       </w:r>
     </w:p>
     <w:p>
@@ -27327,7 +27485,7 @@
           <w:sz w:val="22"/>
           <w:szCs w:val="22"/>
         </w:rPr>
-        <w:t xml:space="preserve">A job whose whole purpose is putting data into the system. It sees Upload stock, the item list, the phone list, and shop stock. It cannot sell, cannot open money pages, cannot approve anything, and cannot add staff.</w:t>
+        <w:t xml:space="preserve">A job whose whole purpose is putting stock and item names into the system. It sees Upload stock, the item list, Goods from supplier (to open the PO it created), the phone list, and shop stock. It cannot sell, cannot open money pages to post payments, cannot approve anything, and cannot add staff.</w:t>
       </w:r>
     </w:p>
     <w:p>
@@ -27365,7 +27523,7 @@
           <w:sz w:val="22"/>
           <w:szCs w:val="22"/>
         </w:rPr>
-        <w:t xml:space="preserve">Loading the shops is powerful work and it is usually done by whoever is helping to set the system up, sometimes from outside the shop. That person needs no ability to sell or to see what the business is worth. Giving them one narrow job means the door they hold opens one room.</w:t>
+        <w:t xml:space="preserve">Loading the shops is powerful work and it is usually done by whoever is helping to set the system up, sometimes from outside the shop. That person needs no ability to sell or to move cash. Giving them one narrow job means the door they hold opens one room.</w:t>
       </w:r>
     </w:p>
     <w:p>
@@ -27403,7 +27561,7 @@
           <w:sz w:val="22"/>
           <w:szCs w:val="22"/>
         </w:rPr>
-        <w:t xml:space="preserve">Techvaults is helping Abu Twins load the three shops. They are given the Stock uploader login. They load the item list, the shelf counts, and every IMEI in all three shops. At no point can they open Money in and out, ring up a sale, or see what a customer owes.</w:t>
+        <w:t xml:space="preserve">Techvaults is helping Abu Twins load the three shops. They are given the Stock uploader login. They start upload bills, load Excel files, and open each PO to check the submission value. At no point can they open Money in and out to pay a supplier, ring up a sale, or see what a customer owes.</w:t>
       </w:r>
     </w:p>
     <w:p>
@@ -27577,6 +27735,37 @@
           <w:sz w:val="22"/>
           <w:szCs w:val="22"/>
         </w:rPr>
+        <w:t xml:space="preserve">Open Goods from supplier and find a bill marked Loaded on Upload stock.</w:t>
+      </w:r>
+    </w:p>
+    <w:p>
+      <w:pPr>
+        <w:spacing w:after="80" w:line="276"/>
+      </w:pPr>
+      <w:r>
+        <w:rPr>
+          <w:rFonts w:ascii="Calibri" w:cs="Calibri" w:eastAsia="Calibri" w:hAnsi="Calibri"/>
+          <w:b/>
+          <w:bCs/>
+          <w:i w:val="false"/>
+          <w:iCs w:val="false"/>
+          <w:color w:val="000000"/>
+          <w:sz w:val="22"/>
+          <w:szCs w:val="22"/>
+        </w:rPr>
+        <w:t xml:space="preserve">6. </w:t>
+      </w:r>
+      <w:r>
+        <w:rPr>
+          <w:rFonts w:ascii="Calibri" w:cs="Calibri" w:eastAsia="Calibri" w:hAnsi="Calibri"/>
+          <w:b w:val="false"/>
+          <w:bCs w:val="false"/>
+          <w:i w:val="false"/>
+          <w:iCs w:val="false"/>
+          <w:color w:val="000000"/>
+          <w:sz w:val="22"/>
+          <w:szCs w:val="22"/>
+        </w:rPr>
         <w:t xml:space="preserve">Sign in as manager@abutwins.com and try to open Upload stock.</w:t>
       </w:r>
     </w:p>
@@ -27595,7 +27784,7 @@
           <w:sz w:val="22"/>
           <w:szCs w:val="22"/>
         </w:rPr>
-        <w:t xml:space="preserve">6. </w:t>
+        <w:t xml:space="preserve">7. </w:t>
       </w:r>
       <w:r>
         <w:rPr>
@@ -40102,7 +40291,7 @@
                 <w:sz w:val="20"/>
                 <w:szCs w:val="20"/>
               </w:rPr>
-              <w:t xml:space="preserve">Pick the shop. Upload the PHONES / ACCESSORIES / SCREEN / LAPTOPS file. Phones show In shop. Piece counts appear on Shop stock. A bad line loads nothing.</w:t>
+              <w:t xml:space="preserve">Pick shop, supplier, and paid or not paid. Upload the PHONES / ACCESSORIES / SCREEN / LAPTOPS file. A PO appears. Phones show In shop. Piece counts appear on Shop stock. A bad line loads nothing.</w:t>
             </w:r>
           </w:p>
         </w:tc>
@@ -40255,7 +40444,160 @@
                 <w:sz w:val="20"/>
                 <w:szCs w:val="20"/>
               </w:rPr>
-              <w:t xml:space="preserve">Pick the shop and item. Scan or type one IMEI or serial. Form clears for the next unit. Sell now finds the new In shop IMEI.</w:t>
+              <w:t xml:space="preserve">Start an upload bill with supplier and not paid. Scan or type one IMEI. Form clears. Bill value grows. Finance shows still owed.</w:t>
+            </w:r>
+          </w:p>
+        </w:tc>
+      </w:tr>
+      <w:tr>
+        <w:trPr>
+          <w:trHeight w:val="320" w:hRule="atLeast"/>
+        </w:trPr>
+        <w:tc>
+          <w:tcPr>
+            <w:tcW w:type="dxa" w:w="600"/>
+            <w:tcBorders>
+              <w:top w:val="single" w:color="000000" w:sz="8"/>
+              <w:left w:val="single" w:color="000000" w:sz="8"/>
+              <w:bottom w:val="single" w:color="000000" w:sz="8"/>
+              <w:right w:val="single" w:color="000000" w:sz="8"/>
+            </w:tcBorders>
+            <w:shd w:fill="FFFFFF" w:color="FFFFFF" w:val="clear"/>
+            <w:tcMar>
+              <w:top w:type="dxa" w:w="60"/>
+              <w:left w:type="dxa" w:w="80"/>
+              <w:bottom w:type="dxa" w:w="60"/>
+              <w:right w:type="dxa" w:w="80"/>
+            </w:tcMar>
+            <w:vAlign w:val="center"/>
+          </w:tcPr>
+          <w:p>
+            <w:pPr>
+              <w:jc w:val="left"/>
+            </w:pPr>
+            <w:r>
+              <w:rPr>
+                <w:rFonts w:ascii="Calibri" w:cs="Calibri" w:eastAsia="Calibri" w:hAnsi="Calibri"/>
+                <w:b w:val="false"/>
+                <w:bCs w:val="false"/>
+                <w:i w:val="false"/>
+                <w:iCs w:val="false"/>
+                <w:color w:val="000000"/>
+                <w:sz w:val="20"/>
+                <w:szCs w:val="20"/>
+              </w:rPr>
+              <w:t xml:space="preserve">41</w:t>
+            </w:r>
+          </w:p>
+        </w:tc>
+        <w:tc>
+          <w:tcPr>
+            <w:tcW w:type="dxa" w:w="2800"/>
+            <w:tcBorders>
+              <w:top w:val="single" w:color="000000" w:sz="8"/>
+              <w:left w:val="single" w:color="000000" w:sz="8"/>
+              <w:bottom w:val="single" w:color="000000" w:sz="8"/>
+              <w:right w:val="single" w:color="000000" w:sz="8"/>
+            </w:tcBorders>
+            <w:shd w:fill="FFFFFF" w:color="FFFFFF" w:val="clear"/>
+            <w:tcMar>
+              <w:top w:type="dxa" w:w="60"/>
+              <w:left w:type="dxa" w:w="80"/>
+              <w:bottom w:type="dxa" w:w="60"/>
+              <w:right w:type="dxa" w:w="80"/>
+            </w:tcMar>
+            <w:vAlign w:val="center"/>
+          </w:tcPr>
+          <w:p>
+            <w:pPr>
+              <w:jc w:val="left"/>
+            </w:pPr>
+            <w:r>
+              <w:rPr>
+                <w:rFonts w:ascii="Calibri" w:cs="Calibri" w:eastAsia="Calibri" w:hAnsi="Calibri"/>
+                <w:b w:val="false"/>
+                <w:bCs w:val="false"/>
+                <w:i w:val="false"/>
+                <w:iCs w:val="false"/>
+                <w:color w:val="000000"/>
+                <w:sz w:val="20"/>
+                <w:szCs w:val="20"/>
+              </w:rPr>
+              <w:t xml:space="preserve">Trace an upload bill as accountant</w:t>
+            </w:r>
+          </w:p>
+        </w:tc>
+        <w:tc>
+          <w:tcPr>
+            <w:tcW w:type="dxa" w:w="2600"/>
+            <w:tcBorders>
+              <w:top w:val="single" w:color="000000" w:sz="8"/>
+              <w:left w:val="single" w:color="000000" w:sz="8"/>
+              <w:bottom w:val="single" w:color="000000" w:sz="8"/>
+              <w:right w:val="single" w:color="000000" w:sz="8"/>
+            </w:tcBorders>
+            <w:shd w:fill="FFFFFF" w:color="FFFFFF" w:val="clear"/>
+            <w:tcMar>
+              <w:top w:type="dxa" w:w="60"/>
+              <w:left w:type="dxa" w:w="80"/>
+              <w:bottom w:type="dxa" w:w="60"/>
+              <w:right w:type="dxa" w:w="80"/>
+            </w:tcMar>
+            <w:vAlign w:val="center"/>
+          </w:tcPr>
+          <w:p>
+            <w:pPr>
+              <w:jc w:val="left"/>
+            </w:pPr>
+            <w:r>
+              <w:rPr>
+                <w:rFonts w:ascii="Calibri" w:cs="Calibri" w:eastAsia="Calibri" w:hAnsi="Calibri"/>
+                <w:b w:val="false"/>
+                <w:bCs w:val="false"/>
+                <w:i w:val="false"/>
+                <w:iCs w:val="false"/>
+                <w:color w:val="000000"/>
+                <w:sz w:val="20"/>
+                <w:szCs w:val="20"/>
+              </w:rPr>
+              <w:t xml:space="preserve">accountant@abutwins.com or auditor</w:t>
+            </w:r>
+          </w:p>
+        </w:tc>
+        <w:tc>
+          <w:tcPr>
+            <w:tcW w:type="dxa" w:w="3360"/>
+            <w:tcBorders>
+              <w:top w:val="single" w:color="000000" w:sz="8"/>
+              <w:left w:val="single" w:color="000000" w:sz="8"/>
+              <w:bottom w:val="single" w:color="000000" w:sz="8"/>
+              <w:right w:val="single" w:color="000000" w:sz="8"/>
+            </w:tcBorders>
+            <w:shd w:fill="FFFFFF" w:color="FFFFFF" w:val="clear"/>
+            <w:tcMar>
+              <w:top w:type="dxa" w:w="60"/>
+              <w:left w:type="dxa" w:w="80"/>
+              <w:bottom w:type="dxa" w:w="60"/>
+              <w:right w:type="dxa" w:w="80"/>
+            </w:tcMar>
+            <w:vAlign w:val="center"/>
+          </w:tcPr>
+          <w:p>
+            <w:pPr>
+              <w:jc w:val="left"/>
+            </w:pPr>
+            <w:r>
+              <w:rPr>
+                <w:rFonts w:ascii="Calibri" w:cs="Calibri" w:eastAsia="Calibri" w:hAnsi="Calibri"/>
+                <w:b w:val="false"/>
+                <w:bCs w:val="false"/>
+                <w:i w:val="false"/>
+                <w:iCs w:val="false"/>
+                <w:color w:val="000000"/>
+                <w:sz w:val="20"/>
+                <w:szCs w:val="20"/>
+              </w:rPr>
+              <w:t xml:space="preserve">Open Goods from supplier. Find Loaded on Upload stock. Confirm PO, submission value, and owed. Pay supplier settles the unpaid bill.</w:t>
             </w:r>
           </w:p>
         </w:tc>
@@ -41773,6 +42115,25 @@
           <w:szCs w:val="22"/>
         </w:rPr>
         <w:t xml:space="preserve">Version 1.18 adds Add one item to the shelf on Upload stock. Staff pick the shop, pick or add the item name, and scan or type each IMEI, serial, or piece count without opening a spreadsheet. The form clears after each save so the next unit is quick. The opening stock Excel stays for full shop loads. Older step-by-step sheet uploads move under Advanced so the page reads clearly for everyday work.</w:t>
+      </w:r>
+    </w:p>
+    <w:p>
+      <w:pPr>
+        <w:spacing w:after="160" w:before="0" w:line="276"/>
+        <w:jc w:val="left"/>
+      </w:pPr>
+      <w:r>
+        <w:rPr>
+          <w:rFonts w:ascii="Calibri" w:cs="Calibri" w:eastAsia="Calibri" w:hAnsi="Calibri"/>
+          <w:b w:val="false"/>
+          <w:bCs w:val="false"/>
+          <w:i w:val="false"/>
+          <w:iCs w:val="false"/>
+          <w:color w:val="000000"/>
+          <w:sz w:val="22"/>
+          <w:szCs w:val="22"/>
+        </w:rPr>
+        <w:t xml:space="preserve">Version 1.19 ties every Upload stock load to a real Goods from supplier bill. Staff start a session with the supplier and paid or not paid, or pick those on the Excel upload. Each load gets a unique PO number and a submission value from cost. Unpaid bills feed Finance still owed. Phone IMEIs link back to the PO. The stock uploader can open Goods from supplier to read the bill, but still cannot post cash payments.</w:t>
       </w:r>
     </w:p>
     <w:p>

</xml_diff>